<commit_message>
Zev-7 Operator Manual Revision 2.6 - Metronome-S
Adds the Metronome-S, the ESP32-S3 fifteen-tube clock (firmware 1.1), and
separates it from the original Metronome, which the manual had been treating
as a single model.

- Section 2 gains a "Metronome Variants" subsection, alongside the existing
  Numitron one: the Metronome-S carries every feature in this manual (Tube
  Healing, dark and sunrise/sunset rules, a six-lamp under-light, static IP,
  the SW1 health readout); the original Metronome has none of those.
- Corrects the LED section, which claimed every model except the Zev-7ND has
  under-light lamps. The original Metronome has none.
- Corrects the Display section and flags Section 11 as Zev-7 only: neither
  Metronome has colon neons, only the single decimal point on NX8.
- Adds Metronome-S to the cover blurb, the overview, the AP network-name
  lists and the mDNS hostnames.

PDF regenerated from the DOCX (LibreOffice; 38 pages, unchanged).
</commit_message>
<xml_diff>
--- a/Zev-7 Operator Manual.docx
+++ b/Zev-7 Operator Manual.docx
@@ -134,7 +134,7 @@
           <w:color w:val="000000"/>
           <w:sz w:val="22"/>
         </w:rPr>
-        <w:t>This manual describes the installation, configuration, and day-to-day operation of the Zev-7 and Metronome clocks. It covers the Nixie-tube models (Zev-7, Zev-7 Mini, Zev-7-18, Zev-7RZ, Metronome) and the numitron-tube models (Zev-7NS, Zev-7ND). Throughout this manual all models are referred to as Zev-7, and "Nixie" refers to the time display in general; see Section 2 for how the numitron models differ.</w:t>
+        <w:t>This manual describes the installation, configuration, and day-to-day operation of the Zev-7 and Metronome clocks. It covers the fifteen-tube Metronome and Metronome-S, and the Nixie-tube models (Zev-7, Zev-7 Mini, Zev-7-18, Zev-7RZ, Metronome) and the numitron-tube models (Zev-7NS, Zev-7ND). Throughout this manual all models are referred to as Zev-7, and "Nixie" refers to the time display in general; see Section 2 for how the numitron models differ.</w:t>
       </w:r>
     </w:p>
     <w:p>
@@ -1193,7 +1193,7 @@
           <w:rFonts w:ascii="Arial" w:hAnsi="Arial"/>
           <w:sz w:val="22"/>
         </w:rPr>
-        <w:t>With the AP-mode bouncing tube visible, from a phone or computer, open the WiFi settings and connect to the network named for your model — Zev-7S, Zev-7M (Mini), Zev-7-18, Zev-7RZ, Zev-7NS or Zev-7ND (numitron), or Metronome. No password is required.</w:t>
+        <w:t>With the AP-mode bouncing tube visible, from a phone or computer, open the WiFi settings and connect to the network named for your model — Zev-7S, Zev-7M (Mini), Zev-7-18, Zev-7RZ, Zev-7NS or Zev-7ND (numitron), Metronome or Metronome-S. No password is required.</w:t>
       </w:r>
     </w:p>
     <w:p>
@@ -1963,7 +1963,7 @@
           <w:rFonts w:ascii="Arial" w:hAnsi="Arial"/>
           <w:sz w:val="22"/>
         </w:rPr>
-        <w:t>Zev-7 is a seven-tube Nixie clock and the Metronome is its fifteen-tube companion. Both are driven by an ESP32 microcontroller and present the same web interface and rule-based scheduling, each running its own firmware. They display hours, minutes, seconds, and tenths of a second using Nixie tubes with HV5530 shift-register drivers. The Zev-7S can be built with any of several tube types; the other models each use one. The clocks feature RGB backlighting behind the tubes, neon colon indicators, WiFi connectivity with NTP time sync, an optional motion sensor, an optional light sensor, an optional weather sensor, and an under-light strip.</w:t>
+        <w:t>Zev-7 is a seven-tube Nixie clock and the Metronome is its fifteen-tube companion. The Metronome comes in two forms: the original and the Metronome-S, which uses a newer processor and carries the full feature set described in this manual. Both are driven by an ESP32 microcontroller and present the same web interface.</w:t>
       </w:r>
     </w:p>
     <w:p>
@@ -2083,7 +2083,7 @@
           <w:rFonts w:ascii="Arial" w:hAnsi="Arial"/>
           <w:sz w:val="22"/>
         </w:rPr>
-        <w:t>Several models are covered by this manual. The model is set at the factory and cannot be changed by the user. The Zev-7S, Zev-7 Mini, Zev-7-18 and Zev-7RZ are Nixie-tube clocks and share one firmware; the Zev-7NS and Zev-7ND are the equivalent numitron-tube clocks and run their own; the Metronome runs a third. All are operationally similar, differing where the display hardware and its capabilities differ.</w:t>
+        <w:t>Several models are covered by this manual. The model is set at the factory and cannot be changed by the user. The Zev-7S, Zev-7 Mini, Zev-7-18 and Zev-7RZ are Nixie-tube clocks and share one firmware; the Zev-7NS and Zev-7ND are the equivalent numitron-tube clocks and run their own; the Metronome and Metronome-S are the fifteen-tube clocks and run a third and a fourth. All are operationally similar, differing where the display hardware and its capabilities differ.</w:t>
       </w:r>
       <w:r>
         <w:rPr>
@@ -2209,6 +2209,44 @@
           <w:rFonts w:ascii="Arial" w:hAnsi="Arial"/>
           <w:sz w:val="22"/>
         </w:rPr>
+      </w:r>
+    </w:p>
+    <w:p>
+      <w:pPr>
+        <w:pStyle w:val="Heading2"/>
+      </w:pPr>
+      <w:r>
+        <w:t>Metronome Variants (Metronome and Metronome-S)</w:t>
+      </w:r>
+    </w:p>
+    <w:p>
+      <w:pPr/>
+      <w:r>
+        <w:t>Both Metronomes have fifteen Nixie tubes and the same display layout (Section 3). They run separate firmware, and the Metronome-S is the more capable of the two:</w:t>
+      </w:r>
+    </w:p>
+    <w:p>
+      <w:pPr>
+        <w:pStyle w:val="ListBullet"/>
+      </w:pPr>
+      <w:r>
+        <w:t>Metronome-S — firmware 1.1 and later. Carries every feature in this manual: Tube Healing (Section 15), dark and sunrise/sunset rules (Section 8), a six-lamp under-light, a fixed (static) IP address, and the health readout on SW1.</w:t>
+      </w:r>
+    </w:p>
+    <w:p>
+      <w:pPr>
+        <w:pStyle w:val="ListBullet"/>
+      </w:pPr>
+      <w:r>
+        <w:t>Metronome — firmware 2.2 and later. The original fifteen-tube clock. It has no under-light and no Tube Healing, its rules do not offer the dark condition or sunrise and sunset anchors, and it has no fixed-IP setting. Everything else in this manual applies.</w:t>
+      </w:r>
+    </w:p>
+    <w:p>
+      <w:pPr>
+        <w:pStyle w:val="ListBullet"/>
+      </w:pPr>
+      <w:r>
+        <w:t>No colon lamps. Neither Metronome has the neon colon separators fitted to the Zev-7, so Section 11 does not apply to them. A single decimal point on NX8 is used by the clock itself to mark the temperature sign and the pressure and humidity readings.</w:t>
       </w:r>
     </w:p>
     <w:p>
@@ -2358,6 +2396,7 @@
           <w:rFonts w:ascii="Arial" w:hAnsi="Arial"/>
           <w:sz w:val="22"/>
         </w:rPr>
+        <w:t>The Zev-7 has seven Nixie tubes; the Metronome and Metronome-S have fifteen. The Zev-7 models also have a set of neon indicator lamps, which the Metronome models do not:</w:t>
       </w:r>
       <w:r>
         <w:rPr>
@@ -2370,7 +2409,6 @@
           <w:rFonts w:ascii="Arial" w:hAnsi="Arial"/>
           <w:sz w:val="22"/>
         </w:rPr>
-        <w:t>The Zev-7 has seven Nixie tubes; the Metronome has fifteen. Both have a set of neon indicator lamps:</w:t>
       </w:r>
     </w:p>
     <w:tbl>
@@ -5567,7 +5605,7 @@
           <w:rFonts w:ascii="Arial" w:hAnsi="Arial"/>
           <w:sz w:val="22"/>
         </w:rPr>
-        <w:t>1.  Connect a phone or computer to the WiFi network named for your model — Zev-7S, Zev-7M, Zev-7-18, Zev-7RZ, Zev-7NS, Zev-7ND or Metronome — or the custom AP name.</w:t>
+        <w:t>1.  Connect a phone or computer to the WiFi network named for your model — Zev-7S, Zev-7M, Zev-7-18, Zev-7RZ, Zev-7NS, Zev-7ND, Metronome or Metronome-S — or the custom AP name.</w:t>
       </w:r>
     </w:p>
     <w:p>
@@ -11920,7 +11958,7 @@
           <w:rFonts w:ascii="Arial" w:hAnsi="Arial"/>
           <w:sz w:val="22"/>
         </w:rPr>
-        <w:t>On many networks the clock can be reached by name instead of by IP address. Browse to http://zev-7.local/ (or http://zev-7m.local/ for the Mini, http://zev-7-18.local/ for the Zev-7-18, http://zev-7rz.local/ for the Zev-7RZ, http://zev-7ns.local/ or http://zev-7nd.local/ for the numitron models, or http://metronome.local/ for the Metronome) and the page should load. The hostname is derived from the Access Point Name set during configuration, lowercased, with any spaces or special characters converted to hyphens. For example, an AP Name of "Zev-7" becomes zev-7.local; "My Office" becomes my-office.local.</w:t>
+        <w:t>On many networks the clock can be reached by name instead of by IP address. Browse to http://zev-7.local/ (or http://zev-7m.local/ for the Mini, http://zev-7-18.local/ for the Zev-7-18, http://zev-7rz.local/ for the Zev-7RZ, http://zev-7ns.local/ or http://zev-7nd.local/ for the numitron models, http://metronome.local/ for the Metronome, or http://metronome-s.local/ for the Metronome-S) and the page should load. The hostname is derived from the Access Point Name set during configuration, lowercased, with any spaces or special characters converted to hyphens. For example, an AP Name of "Zev-7" becomes zev-7.local; "My Office" becomes my-office.local.</w:t>
       </w:r>
     </w:p>
     <w:p>
@@ -15496,7 +15534,7 @@
           <w:rFonts w:ascii="Arial" w:hAnsi="Arial"/>
           <w:sz w:val="22"/>
         </w:rPr>
-        <w:t>The Nixie tubes are backlit by RGB LEDs, on the Metronome as well as the Zev-7. Every model except the Zev-7ND also has separate under-light LEDs along the front edge of the base. The under-light LEDs have independent brightness and color control and are not affected by LED effects.</w:t>
+        <w:t>The Nixie tubes are backlit by RGB LEDs, on the Metronome models as well as the Zev-7. The Zev-7 models except the Zev-7ND, and the Metronome-S, also have separate under-light LEDs along the base, set to a fixed colour and brightness rather than an effect. The original Metronome has no under-light.</w:t>
       </w:r>
     </w:p>
     <w:p>
@@ -17406,6 +17444,12 @@
           <w:sz w:val="40"/>
         </w:rPr>
         <w:t>11. Neon (Colon) Display Modes</w:t>
+      </w:r>
+    </w:p>
+    <w:p>
+      <w:pPr/>
+      <w:r>
+        <w:t>This section applies to the Zev-7 models only. Neither Metronome has colon lamps fitted.</w:t>
       </w:r>
     </w:p>
     <w:p>
@@ -22590,7 +22634,7 @@
         <w:color w:val="555555"/>
         <w:sz w:val="20"/>
       </w:rPr>
-      <w:t>Revision 2.5 — September 2026</w:t>
+      <w:t>Revision 2.6 — September 2026</w:t>
     </w:r>
     <w:r>
       <w:rPr>
@@ -22722,7 +22766,7 @@
         <w:color w:val="555555"/>
         <w:sz w:val="20"/>
       </w:rPr>
-      <w:t>Revision 2.5 — September 2026</w:t>
+      <w:t>Revision 2.6 — September 2026</w:t>
     </w:r>
     <w:r>
       <w:rPr>
@@ -22854,7 +22898,7 @@
         <w:color w:val="555555"/>
         <w:sz w:val="20"/>
       </w:rPr>
-      <w:t>Revision 2.5 — September 2026</w:t>
+      <w:t>Revision 2.6 — September 2026</w:t>
     </w:r>
     <w:r>
       <w:rPr>
@@ -23005,7 +23049,7 @@
         <w:color w:val="555555"/>
         <w:sz w:val="20"/>
       </w:rPr>
-      <w:t>Revision 2.5 — September 2026</w:t>
+      <w:t>Revision 2.6 — September 2026</w:t>
     </w:r>
     <w:r>
       <w:rPr>
@@ -23137,7 +23181,7 @@
         <w:color w:val="555555"/>
         <w:sz w:val="20"/>
       </w:rPr>
-      <w:t>Revision 2.5 — September 2026</w:t>
+      <w:t>Revision 2.6 — September 2026</w:t>
     </w:r>
     <w:r>
       <w:rPr>
@@ -23269,7 +23313,7 @@
         <w:color w:val="555555"/>
         <w:sz w:val="20"/>
       </w:rPr>
-      <w:t>Revision 2.5 — September 2026</w:t>
+      <w:t>Revision 2.6 — September 2026</w:t>
     </w:r>
     <w:r>
       <w:rPr>
@@ -23401,7 +23445,7 @@
         <w:color w:val="555555"/>
         <w:sz w:val="20"/>
       </w:rPr>
-      <w:t>Revision 2.5 — September 2026</w:t>
+      <w:t>Revision 2.6 — September 2026</w:t>
     </w:r>
     <w:r>
       <w:rPr>
@@ -23684,7 +23728,7 @@
         <w:color w:val="555555"/>
         <w:sz w:val="20"/>
       </w:rPr>
-      <w:t>Revision 2.5 — September 2026</w:t>
+      <w:t>Revision 2.6 — September 2026</w:t>
     </w:r>
     <w:r>
       <w:rPr>
@@ -23816,7 +23860,7 @@
         <w:color w:val="555555"/>
         <w:sz w:val="20"/>
       </w:rPr>
-      <w:t>Revision 2.5 — September 2026</w:t>
+      <w:t>Revision 2.6 — September 2026</w:t>
     </w:r>
     <w:r>
       <w:rPr>
@@ -23962,7 +24006,7 @@
         <w:color w:val="555555"/>
         <w:sz w:val="20"/>
       </w:rPr>
-      <w:t>Revision 2.5 — September 2026</w:t>
+      <w:t>Revision 2.6 — September 2026</w:t>
     </w:r>
     <w:r>
       <w:rPr>
@@ -24094,7 +24138,7 @@
         <w:color w:val="555555"/>
         <w:sz w:val="20"/>
       </w:rPr>
-      <w:t>Revision 2.5 — September 2026</w:t>
+      <w:t>Revision 2.6 — September 2026</w:t>
     </w:r>
     <w:r>
       <w:rPr>
@@ -24226,7 +24270,7 @@
         <w:color w:val="555555"/>
         <w:sz w:val="20"/>
       </w:rPr>
-      <w:t>Revision 2.5 — September 2026</w:t>
+      <w:t>Revision 2.6 — September 2026</w:t>
     </w:r>
     <w:r>
       <w:rPr>
@@ -24358,7 +24402,7 @@
         <w:color w:val="555555"/>
         <w:sz w:val="20"/>
       </w:rPr>
-      <w:t>Revision 2.5 — September 2026</w:t>
+      <w:t>Revision 2.6 — September 2026</w:t>
     </w:r>
     <w:r>
       <w:rPr>
@@ -24409,7 +24453,7 @@
         <w:color w:val="555555"/>
         <w:sz w:val="20"/>
       </w:rPr>
-      <w:t>Revision 2.5 — September 2026</w:t>
+      <w:t>Revision 2.6 — September 2026</w:t>
     </w:r>
     <w:r>
       <w:rPr>
@@ -24541,7 +24585,7 @@
         <w:color w:val="555555"/>
         <w:sz w:val="20"/>
       </w:rPr>
-      <w:t>Revision 2.5 — September 2026</w:t>
+      <w:t>Revision 2.6 — September 2026</w:t>
     </w:r>
     <w:r>
       <w:rPr>
@@ -24673,7 +24717,7 @@
         <w:color w:val="555555"/>
         <w:sz w:val="20"/>
       </w:rPr>
-      <w:t>Revision 2.5 — September 2026</w:t>
+      <w:t>Revision 2.6 — September 2026</w:t>
     </w:r>
     <w:r>
       <w:rPr>
@@ -24805,7 +24849,7 @@
         <w:color w:val="555555"/>
         <w:sz w:val="20"/>
       </w:rPr>
-      <w:t>Revision 2.5 — September 2026</w:t>
+      <w:t>Revision 2.6 — September 2026</w:t>
     </w:r>
     <w:r>
       <w:rPr>
@@ -24988,7 +25032,7 @@
         <w:color w:val="555555"/>
         <w:sz w:val="20"/>
       </w:rPr>
-      <w:t>Revision 2.5 — September 2026</w:t>
+      <w:t>Revision 2.6 — September 2026</w:t>
     </w:r>
   </w:p>
 </w:ftr>
@@ -25036,7 +25080,7 @@
         <w:color w:val="555555"/>
         <w:sz w:val="20"/>
       </w:rPr>
-      <w:t>Revision 2.5 — September 2026</w:t>
+      <w:t>Revision 2.6 — September 2026</w:t>
     </w:r>
     <w:r>
       <w:rPr>
@@ -25095,7 +25139,7 @@
         <w:color w:val="555555"/>
         <w:sz w:val="20"/>
       </w:rPr>
-      <w:t>Revision 2.5 — September 2026</w:t>
+      <w:t>Revision 2.6 — September 2026</w:t>
     </w:r>
     <w:r>
       <w:rPr>
@@ -25154,7 +25198,7 @@
         <w:color w:val="555555"/>
         <w:sz w:val="20"/>
       </w:rPr>
-      <w:t>Revision 2.5 — September 2026</w:t>
+      <w:t>Revision 2.6 — September 2026</w:t>
     </w:r>
     <w:r>
       <w:rPr>
@@ -25227,7 +25271,7 @@
         <w:color w:val="555555"/>
         <w:sz w:val="20"/>
       </w:rPr>
-      <w:t>Revision 2.5 — September 2026</w:t>
+      <w:t>Revision 2.6 — September 2026</w:t>
     </w:r>
     <w:r>
       <w:rPr>

</xml_diff>

<commit_message>
Zev-7 Operator Manual: document Display LED Grouping (Zev-7ND)
The Zev-7ND carries two LEDs under each tube, and v3.1.0 added a setting to
control how they animate. Three places now cover it:

- AP-form Display Settings table: new "Display LED Grouping" row after LED
  Follows Digit, options Separate / Matched, default Separate.
- Live Settings "Available Controls" list: matching bullet.
- Section 2, Numitron Variants: the models bullet now says the Zev-7ND has
  two LEDs per tube and explains what the two options do.

Wording matches the on-screen tooltip. No firmware-version line exists in
this manual, so there was nothing to bump.

Backup of the pre-edit file kept as "BACKUP pre-ledgrouping", per convention.
PDF regenerated (38 pages).

Claude-Session: https://claude.ai/code/session_01BnGLsxNmTT3yMBo27abyQr
</commit_message>
<xml_diff>
--- a/Zev-7 Operator Manual.docx
+++ b/Zev-7 Operator Manual.docx
@@ -2337,7 +2337,7 @@
         <w:rPr>
           <w:rFonts w:ascii="Arial" w:hAnsi="Arial"/>
         </w:rPr>
-        <w:t>Models and addressing: Zev-7NS (DR2010 tubes, with a separate under-board light string) and Zev-7ND (DTF-104B tubes, with no under-board string — the Under Lighting settings are hidden on that model). In AP mode they appear as the WiFi networks Zev-7NS and Zev-7ND, and are reachable by name at zev-7ns.local and zev-7nd.local respectively.</w:t>
+        <w:t>Models and addressing: Zev-7NS (DR2010 tubes, with a separate under-board light string) and Zev-7ND (DTF-104B tubes, with no under-board string — the Under Lighting settings are hidden on that model). In AP mode they appear as the WiFi networks Zev-7NS and Zev-7ND, and are reachable by name at zev-7ns.local and zev-7nd.local respectively. The Zev-7ND also carries two LEDs under each tube rather than one, so it has an extra Display LED Grouping setting: Matched shows one color on all LEDs under each tube, while Separate runs every LED independently and lets the moving effects sweep at twice the resolution.</w:t>
       </w:r>
     </w:p>
     <w:p>
@@ -7182,6 +7182,102 @@
           </w:p>
         </w:tc>
       </w:tr>
+      <w:tr>
+        <w:trPr/>
+        <w:tc>
+          <w:tcPr>
+            <w:tcW w:w="3135" w:type="dxa"/>
+            <w:tcBorders/>
+          </w:tcPr>
+          <w:p>
+            <w:pPr>
+              <w:pStyle w:val="Normal"/>
+              <w:widowControl/>
+              <w:suppressAutoHyphens w:val="true"/>
+              <w:spacing w:before="0" w:after="80"/>
+              <w:jc w:val="start"/>
+              <w:rPr>
+                <w:rFonts w:eastAsia="ＭＳ 明朝" w:cs=""/>
+                <w:kern w:val="0"/>
+                <w:szCs w:val="22"/>
+                <w:lang w:val="en-US" w:eastAsia="en-US" w:bidi="ar-SA"/>
+              </w:rPr>
+            </w:pPr>
+            <w:r>
+              <w:rPr>
+                <w:rFonts w:eastAsia="ＭＳ 明朝" w:cs="" w:ascii="Arial" w:hAnsi="Arial"/>
+                <w:kern w:val="0"/>
+                <w:sz w:val="20"/>
+                <w:szCs w:val="22"/>
+                <w:lang w:val="en-US" w:eastAsia="en-US" w:bidi="ar-SA"/>
+              </w:rPr>
+              <w:t>Display LED Grouping</w:t>
+            </w:r>
+          </w:p>
+        </w:tc>
+        <w:tc>
+          <w:tcPr>
+            <w:tcW w:w="3135" w:type="dxa"/>
+            <w:tcBorders/>
+          </w:tcPr>
+          <w:p>
+            <w:pPr>
+              <w:pStyle w:val="Normal"/>
+              <w:widowControl/>
+              <w:suppressAutoHyphens w:val="true"/>
+              <w:spacing w:before="0" w:after="80"/>
+              <w:jc w:val="start"/>
+              <w:rPr>
+                <w:rFonts w:eastAsia="ＭＳ 明朝" w:cs=""/>
+                <w:kern w:val="0"/>
+                <w:szCs w:val="22"/>
+                <w:lang w:val="en-US" w:eastAsia="en-US" w:bidi="ar-SA"/>
+              </w:rPr>
+            </w:pPr>
+            <w:r>
+              <w:rPr>
+                <w:rFonts w:eastAsia="ＭＳ 明朝" w:cs="" w:ascii="Arial" w:hAnsi="Arial"/>
+                <w:kern w:val="0"/>
+                <w:sz w:val="20"/>
+                <w:szCs w:val="22"/>
+                <w:lang w:val="en-US" w:eastAsia="en-US" w:bidi="ar-SA"/>
+              </w:rPr>
+              <w:t>Separate, Matched  (Zev-7ND only — that model has two LEDs under each tube. Matched shows one color on all LEDs under each tube; Separate runs every LED independently)</w:t>
+            </w:r>
+          </w:p>
+        </w:tc>
+        <w:tc>
+          <w:tcPr>
+            <w:tcW w:w="3135" w:type="dxa"/>
+            <w:tcBorders/>
+          </w:tcPr>
+          <w:p>
+            <w:pPr>
+              <w:pStyle w:val="Normal"/>
+              <w:widowControl/>
+              <w:suppressAutoHyphens w:val="true"/>
+              <w:spacing w:before="0" w:after="80"/>
+              <w:jc w:val="start"/>
+              <w:rPr>
+                <w:rFonts w:eastAsia="ＭＳ 明朝" w:cs=""/>
+                <w:kern w:val="0"/>
+                <w:szCs w:val="22"/>
+                <w:lang w:val="en-US" w:eastAsia="en-US" w:bidi="ar-SA"/>
+              </w:rPr>
+            </w:pPr>
+            <w:r>
+              <w:rPr>
+                <w:rFonts w:eastAsia="ＭＳ 明朝" w:cs="" w:ascii="Arial" w:hAnsi="Arial"/>
+                <w:kern w:val="0"/>
+                <w:sz w:val="20"/>
+                <w:szCs w:val="22"/>
+                <w:lang w:val="en-US" w:eastAsia="en-US" w:bidi="ar-SA"/>
+              </w:rPr>
+              <w:t>Separate</w:t>
+            </w:r>
+          </w:p>
+        </w:tc>
+      </w:tr>
     </w:tbl>
     <w:p>
       <w:pPr>
@@ -12309,6 +12405,23 @@
           <w:sz w:val="22"/>
         </w:rPr>
         <w:t>LED Follows Digit</w:t>
+      </w:r>
+    </w:p>
+    <w:p>
+      <w:pPr>
+        <w:pStyle w:val="ListBullet"/>
+        <w:numPr>
+          <w:ilvl w:val="0"/>
+          <w:numId w:val="1"/>
+        </w:numPr>
+        <w:rPr/>
+      </w:pPr>
+      <w:r>
+        <w:rPr>
+          <w:rFonts w:ascii="Arial" w:hAnsi="Arial"/>
+          <w:sz w:val="22"/>
+        </w:rPr>
+        <w:t>Display LED Grouping (Separate or Matched, Zev-7ND only)</w:t>
       </w:r>
     </w:p>
     <w:p>

</xml_diff>

<commit_message>
Zev-7 Operator Manual: drop the Covers Software line
Firmware versions move too often to sit on a printed cover. The line is gone
and the cover is back exactly as it was - the credits gap returns to its
original 190pt, since the 30pt trim only existed to make room for the line.

The Display LED Grouping documentation added alongside it stays.

The "BACKUP pre-coversline" snapshot is deleted too: it named a change that
no longer exists and was byte-identical to the restored file.

Claude-Session: https://claude.ai/code/session_01BnGLsxNmTT3yMBo27abyQr
</commit_message>
<xml_diff>
--- a/Zev-7 Operator Manual.docx
+++ b/Zev-7 Operator Manual.docx
@@ -122,24 +122,6 @@
     <w:p>
       <w:pPr>
         <w:pStyle w:val="Normal"/>
-        <w:spacing w:before="120" w:after="0"/>
-        <w:jc w:val="start"/>
-        <w:rPr/>
-      </w:pPr>
-      <w:r>
-        <w:rPr>
-          <w:rFonts w:ascii="Arial" w:hAnsi="Arial"/>
-          <w:b w:val="0"/>
-          <w:i w:val="false"/>
-          <w:color w:val="000000"/>
-          <w:sz w:val="21"/>
-        </w:rPr>
-        <w:t>Covers Software: Zev-7S 3.0 | Zev-7NS / Zev-7ND 3.1 | Metronome 2.2 | Metronome-S 1.1</w:t>
-      </w:r>
-    </w:p>
-    <w:p>
-      <w:pPr>
-        <w:pStyle w:val="Normal"/>
         <w:spacing w:before="0" w:after="720"/>
         <w:jc w:val="start"/>
         <w:rPr/>
@@ -158,7 +140,7 @@
     <w:p>
       <w:pPr>
         <w:pStyle w:val="Normal"/>
-        <w:spacing w:before="3200" w:after="40"/>
+        <w:spacing w:before="3800" w:after="40"/>
         <w:jc w:val="start"/>
         <w:rPr/>
       </w:pPr>

</xml_diff>

<commit_message>
Zev-7 Operator Manual: drop the firmware versions from the Metronome bullets
Same reason as the cover line - version numbers move too often to sit in a
printed manual.

  "Metronome-S - firmware 1.1 and later. Carries every feature..."
    -> "Metronome-S - carries every feature..."
  "Metronome - firmware 2.2 and later. The original fifteen-tube clock..."
    -> "Metronome - the original fifteen-tube clock..."

What each model can and cannot do is still spelled out in full; only the
version gate is gone. These were the last two firmware version numbers in the
manual - the remaining digits are IP addresses, sensor examples and the OTA
section's illustration of the version flash, none of which name a release.

Claude-Session: https://claude.ai/code/session_01BnGLsxNmTT3yMBo27abyQr
</commit_message>
<xml_diff>
--- a/Zev-7 Operator Manual.docx
+++ b/Zev-7 Operator Manual.docx
@@ -2230,7 +2230,7 @@
         <w:pStyle w:val="ListBullet"/>
       </w:pPr>
       <w:r>
-        <w:t>Metronome-S — firmware 1.1 and later. Carries every feature in this manual: Tube Healing (Section 15), dark and sunrise/sunset rules (Section 8), a six-lamp under-light, a fixed (static) IP address, and the health readout on SW1.</w:t>
+        <w:t>Metronome-S — carries every feature in this manual: Tube Healing (Section 15), dark and sunrise/sunset rules (Section 8), a six-lamp under-light, a fixed (static) IP address, and the health readout on SW1.</w:t>
       </w:r>
     </w:p>
     <w:p>
@@ -2238,7 +2238,7 @@
         <w:pStyle w:val="ListBullet"/>
       </w:pPr>
       <w:r>
-        <w:t>Metronome — firmware 2.2 and later. The original fifteen-tube clock. It has no under-light and no Tube Healing, its rules do not offer the dark condition or sunrise and sunset anchors, and it has no fixed-IP setting. Everything else in this manual applies.</w:t>
+        <w:t>Metronome — the original fifteen-tube clock. It has no under-light and no Tube Healing, its rules do not offer the dark condition or sunrise and sunset anchors, and it has no fixed-IP setting. Everything else in this manual applies.</w:t>
       </w:r>
     </w:p>
     <w:p>

</xml_diff>

<commit_message>
Document BME68x weather and Bosch IAQ on Zev-7 clocks
</commit_message>
<xml_diff>
--- a/Zev-7 Operator Manual.docx
+++ b/Zev-7 Operator Manual.docx
@@ -1871,11 +1871,7 @@
         </w:sectPr>
       </w:pPr>
       <w:r>
-        <w:rPr>
-          <w:rFonts w:ascii="Arial" w:hAnsi="Arial"/>
-          <w:sz w:val="22"/>
-        </w:rPr>
-        <w:t>If the optional weather sensor is installed, enable Temperature, Pressure, and Humidity on the Sensors page.</w:t>
+        <w:t>If an optional BME280, BME680, or BME688 sensor is installed, enable Temperature, Pressure, and Humidity on the Sensors page. Indoor Air Quality is also available with a BME680 or BME688.</w:t>
       </w:r>
     </w:p>
     <w:p>
@@ -9788,6 +9784,7 @@
       <w:pPr>
         <w:pStyle w:val="Heading2"/>
         <w:keepNext w:val="true"/>
+        <w:pageBreakBefore w:val="0"/>
         <w:pBdr>
           <w:top w:val="single" w:sz="8" w:space="4" w:color="000000"/>
         </w:pBdr>
@@ -9795,13 +9792,7 @@
         <w:rPr/>
       </w:pPr>
       <w:r>
-        <w:rPr>
-          <w:rFonts w:ascii="Arial" w:hAnsi="Arial"/>
-          <w:b/>
-          <w:color w:val="000000"/>
-          <w:sz w:val="26"/>
-        </w:rPr>
-        <w:t>Weather Sensor (BME280)</w:t>
+        <w:t>Weather Sensor (BME280, BME680, or BME688)</w:t>
       </w:r>
     </w:p>
     <w:tbl>
@@ -18764,6 +18755,12 @@
       </w:r>
     </w:p>
     <w:p>
+      <w:pPr/>
+      <w:r>
+        <w:t>Indoor Air Quality: Bosch IAQ index from 0 to 500, shown as a whole number without a colon; available with BME680 or BME688.</w:t>
+      </w:r>
+    </w:p>
+    <w:p>
       <w:pPr>
         <w:pStyle w:val="Normal"/>
         <w:spacing w:before="0" w:after="80"/>
@@ -18865,13 +18862,7 @@
         <w:rPr/>
       </w:pPr>
       <w:r>
-        <w:rPr>
-          <w:rFonts w:ascii="Arial" w:hAnsi="Arial"/>
-          <w:b/>
-          <w:color w:val="000000"/>
-          <w:sz w:val="26"/>
-        </w:rPr>
-        <w:t>Temperature / Pressure / Humidity (BME280)</w:t>
+        <w:t>Temperature, Pressure, Humidity, and Indoor Air Quality</w:t>
       </w:r>
     </w:p>
     <w:p>
@@ -18880,11 +18871,7 @@
         <w:rPr/>
       </w:pPr>
       <w:r>
-        <w:rPr>
-          <w:rFonts w:ascii="Arial" w:hAnsi="Arial"/>
-          <w:sz w:val="22"/>
-        </w:rPr>
-        <w:t>If a BME280 sensor is installed, the clock can display temperature, barometric pressure, and humidity as part of the info display cycle. A calibration offset is available for temperature.</w:t>
+        <w:t>An optional BME280, BME680, or BME688 sensor supplies temperature, barometric pressure, and humidity for the weather display cycle. A temperature offset is available. With a BME680 or BME688, turn on Indoor Air Quality to add Bosch's IAQ index as a whole-number step after humidity; no colon or decimal point is lit for this reading.</w:t>
       </w:r>
     </w:p>
     <w:p>
@@ -18893,17 +18880,238 @@
         <w:rPr/>
       </w:pPr>
       <w:r>
-        <w:rPr>
-          <w:rFonts w:ascii="Arial" w:hAnsi="Arial"/>
-          <w:sz w:val="22"/>
-        </w:rPr>
-        <w:t>The sensor is auto-detected at startup on the I2C bus (addresses 0x76 and 0x77).</w:t>
+        <w:t>The clock detects the sensor at startup at I2C address 0x76 or 0x77 and labels it in the settings page. If multiple supported sensors are present, it uses the BME688 first. Weather settings are hidden when no supported sensor is found. The Indoor Air Quality toggle appears only with a BME680 or BME688.</w:t>
       </w:r>
     </w:p>
     <w:p>
+      <w:pPr/>
+      <w:r>
+        <w:rPr>
+          <w:b/>
+        </w:rPr>
+        <w:t xml:space="preserve">Bosch IAQ index. </w:t>
+      </w:r>
+      <w:r>
+        <w:t>The 0–500 scale runs from clean to polluted air; lower is better. BSEC estimates it from the sensor's gas response and recent air history. It is not a direct CO₂ or particle reading, and it is not the outdoor EPA AQI. Early readings may change while the sensor calibrates.</w:t>
+      </w:r>
+    </w:p>
+    <w:tbl>
+      <w:tblPr>
+        <w:tblStyle w:val="TableGrid"/>
+        <w:tblW w:type="auto" w:w="0"/>
+        <w:tblLayout w:type="fixed"/>
+        <w:tblLook w:firstColumn="1" w:firstRow="1" w:lastColumn="0" w:lastRow="0" w:noHBand="0" w:noVBand="1" w:val="04A0"/>
+      </w:tblPr>
+      <w:tblGrid>
+        <w:gridCol w:w="1800"/>
+        <w:gridCol w:w="6840"/>
+      </w:tblGrid>
+      <w:tr>
+        <w:tc>
+          <w:tcPr>
+            <w:tcW w:type="dxa" w:w="4703"/>
+            <w:vAlign w:val="center"/>
+            <w:shd w:fill="E7EBEF"/>
+          </w:tcPr>
+          <w:p>
+            <w:r>
+              <w:rPr>
+                <w:b/>
+              </w:rPr>
+              <w:t>IAQ index</w:t>
+            </w:r>
+          </w:p>
+        </w:tc>
+        <w:tc>
+          <w:tcPr>
+            <w:tcW w:type="dxa" w:w="4703"/>
+            <w:vAlign w:val="center"/>
+            <w:shd w:fill="E7EBEF"/>
+          </w:tcPr>
+          <w:p>
+            <w:r>
+              <w:rPr>
+                <w:b/>
+              </w:rPr>
+              <w:t>Bosch description</w:t>
+            </w:r>
+          </w:p>
+        </w:tc>
+      </w:tr>
+      <w:tr>
+        <w:tc>
+          <w:tcPr>
+            <w:tcW w:type="dxa" w:w="1800"/>
+            <w:vAlign w:val="center"/>
+          </w:tcPr>
+          <w:p>
+            <w:r>
+              <w:t>0–50</w:t>
+            </w:r>
+          </w:p>
+        </w:tc>
+        <w:tc>
+          <w:tcPr>
+            <w:tcW w:type="dxa" w:w="6840"/>
+            <w:vAlign w:val="center"/>
+          </w:tcPr>
+          <w:p>
+            <w:r>
+              <w:t>Excellent</w:t>
+            </w:r>
+          </w:p>
+        </w:tc>
+      </w:tr>
+      <w:tr>
+        <w:tc>
+          <w:tcPr>
+            <w:tcW w:type="dxa" w:w="1800"/>
+            <w:vAlign w:val="center"/>
+          </w:tcPr>
+          <w:p>
+            <w:r>
+              <w:t>51–100</w:t>
+            </w:r>
+          </w:p>
+        </w:tc>
+        <w:tc>
+          <w:tcPr>
+            <w:tcW w:type="dxa" w:w="6840"/>
+            <w:vAlign w:val="center"/>
+          </w:tcPr>
+          <w:p>
+            <w:r>
+              <w:t>Good</w:t>
+            </w:r>
+          </w:p>
+        </w:tc>
+      </w:tr>
+      <w:tr>
+        <w:tc>
+          <w:tcPr>
+            <w:tcW w:type="dxa" w:w="1800"/>
+            <w:vAlign w:val="center"/>
+          </w:tcPr>
+          <w:p>
+            <w:r>
+              <w:t>101–150</w:t>
+            </w:r>
+          </w:p>
+        </w:tc>
+        <w:tc>
+          <w:tcPr>
+            <w:tcW w:type="dxa" w:w="6840"/>
+            <w:vAlign w:val="center"/>
+          </w:tcPr>
+          <w:p>
+            <w:r>
+              <w:t>Lightly polluted</w:t>
+            </w:r>
+          </w:p>
+        </w:tc>
+      </w:tr>
+      <w:tr>
+        <w:tc>
+          <w:tcPr>
+            <w:tcW w:type="dxa" w:w="1800"/>
+            <w:vAlign w:val="center"/>
+          </w:tcPr>
+          <w:p>
+            <w:r>
+              <w:t>151–200</w:t>
+            </w:r>
+          </w:p>
+        </w:tc>
+        <w:tc>
+          <w:tcPr>
+            <w:tcW w:type="dxa" w:w="6840"/>
+            <w:vAlign w:val="center"/>
+          </w:tcPr>
+          <w:p>
+            <w:r>
+              <w:t>Moderately polluted</w:t>
+            </w:r>
+          </w:p>
+        </w:tc>
+      </w:tr>
+      <w:tr>
+        <w:tc>
+          <w:tcPr>
+            <w:tcW w:type="dxa" w:w="1800"/>
+            <w:vAlign w:val="center"/>
+          </w:tcPr>
+          <w:p>
+            <w:r>
+              <w:t>201–250</w:t>
+            </w:r>
+          </w:p>
+        </w:tc>
+        <w:tc>
+          <w:tcPr>
+            <w:tcW w:type="dxa" w:w="6840"/>
+            <w:vAlign w:val="center"/>
+          </w:tcPr>
+          <w:p>
+            <w:r>
+              <w:t>Heavily polluted</w:t>
+            </w:r>
+          </w:p>
+        </w:tc>
+      </w:tr>
+      <w:tr>
+        <w:tc>
+          <w:tcPr>
+            <w:tcW w:type="dxa" w:w="1800"/>
+            <w:vAlign w:val="center"/>
+          </w:tcPr>
+          <w:p>
+            <w:r>
+              <w:t>251–350</w:t>
+            </w:r>
+          </w:p>
+        </w:tc>
+        <w:tc>
+          <w:tcPr>
+            <w:tcW w:type="dxa" w:w="6840"/>
+            <w:vAlign w:val="center"/>
+          </w:tcPr>
+          <w:p>
+            <w:r>
+              <w:t>Severely polluted</w:t>
+            </w:r>
+          </w:p>
+        </w:tc>
+      </w:tr>
+      <w:tr>
+        <w:tc>
+          <w:tcPr>
+            <w:tcW w:type="dxa" w:w="1800"/>
+            <w:vAlign w:val="center"/>
+          </w:tcPr>
+          <w:p>
+            <w:r>
+              <w:t>351–500</w:t>
+            </w:r>
+          </w:p>
+        </w:tc>
+        <w:tc>
+          <w:tcPr>
+            <w:tcW w:type="dxa" w:w="6840"/>
+            <w:vAlign w:val="center"/>
+          </w:tcPr>
+          <w:p>
+            <w:r>
+              <w:t>Extremely polluted</w:t>
+            </w:r>
+          </w:p>
+        </w:tc>
+      </w:tr>
+    </w:tbl>
+    <w:p>
       <w:pPr>
         <w:pStyle w:val="Heading2"/>
         <w:keepNext w:val="true"/>
+        <w:pageBreakBefore/>
         <w:pBdr>
           <w:top w:val="single" w:sz="8" w:space="4" w:color="000000"/>
         </w:pBdr>
@@ -22747,7 +22955,7 @@
         <w:color w:val="555555"/>
         <w:sz w:val="20"/>
       </w:rPr>
-      <w:t>Revision 2.6 — September 2026</w:t>
+      <w:t>Revision 2.7 — September 2026</w:t>
     </w:r>
     <w:r>
       <w:rPr>
@@ -22879,7 +23087,7 @@
         <w:color w:val="555555"/>
         <w:sz w:val="20"/>
       </w:rPr>
-      <w:t>Revision 2.6 — September 2026</w:t>
+      <w:t>Revision 2.7 — September 2026</w:t>
     </w:r>
     <w:r>
       <w:rPr>
@@ -23011,7 +23219,7 @@
         <w:color w:val="555555"/>
         <w:sz w:val="20"/>
       </w:rPr>
-      <w:t>Revision 2.6 — September 2026</w:t>
+      <w:t>Revision 2.7 — September 2026</w:t>
     </w:r>
     <w:r>
       <w:rPr>
@@ -23162,7 +23370,7 @@
         <w:color w:val="555555"/>
         <w:sz w:val="20"/>
       </w:rPr>
-      <w:t>Revision 2.6 — September 2026</w:t>
+      <w:t>Revision 2.7 — September 2026</w:t>
     </w:r>
     <w:r>
       <w:rPr>
@@ -23294,7 +23502,7 @@
         <w:color w:val="555555"/>
         <w:sz w:val="20"/>
       </w:rPr>
-      <w:t>Revision 2.6 — September 2026</w:t>
+      <w:t>Revision 2.7 — September 2026</w:t>
     </w:r>
     <w:r>
       <w:rPr>
@@ -23426,7 +23634,7 @@
         <w:color w:val="555555"/>
         <w:sz w:val="20"/>
       </w:rPr>
-      <w:t>Revision 2.6 — September 2026</w:t>
+      <w:t>Revision 2.7 — September 2026</w:t>
     </w:r>
     <w:r>
       <w:rPr>
@@ -23558,7 +23766,7 @@
         <w:color w:val="555555"/>
         <w:sz w:val="20"/>
       </w:rPr>
-      <w:t>Revision 2.6 — September 2026</w:t>
+      <w:t>Revision 2.7 — September 2026</w:t>
     </w:r>
     <w:r>
       <w:rPr>
@@ -23841,7 +24049,7 @@
         <w:color w:val="555555"/>
         <w:sz w:val="20"/>
       </w:rPr>
-      <w:t>Revision 2.6 — September 2026</w:t>
+      <w:t>Revision 2.7 — September 2026</w:t>
     </w:r>
     <w:r>
       <w:rPr>
@@ -23973,7 +24181,7 @@
         <w:color w:val="555555"/>
         <w:sz w:val="20"/>
       </w:rPr>
-      <w:t>Revision 2.6 — September 2026</w:t>
+      <w:t>Revision 2.7 — September 2026</w:t>
     </w:r>
     <w:r>
       <w:rPr>
@@ -24119,7 +24327,7 @@
         <w:color w:val="555555"/>
         <w:sz w:val="20"/>
       </w:rPr>
-      <w:t>Revision 2.6 — September 2026</w:t>
+      <w:t>Revision 2.7 — September 2026</w:t>
     </w:r>
     <w:r>
       <w:rPr>
@@ -24251,7 +24459,7 @@
         <w:color w:val="555555"/>
         <w:sz w:val="20"/>
       </w:rPr>
-      <w:t>Revision 2.6 — September 2026</w:t>
+      <w:t>Revision 2.7 — September 2026</w:t>
     </w:r>
     <w:r>
       <w:rPr>
@@ -24383,7 +24591,7 @@
         <w:color w:val="555555"/>
         <w:sz w:val="20"/>
       </w:rPr>
-      <w:t>Revision 2.6 — September 2026</w:t>
+      <w:t>Revision 2.7 — September 2026</w:t>
     </w:r>
     <w:r>
       <w:rPr>
@@ -24515,7 +24723,7 @@
         <w:color w:val="555555"/>
         <w:sz w:val="20"/>
       </w:rPr>
-      <w:t>Revision 2.6 — September 2026</w:t>
+      <w:t>Revision 2.7 — September 2026</w:t>
     </w:r>
     <w:r>
       <w:rPr>
@@ -24566,7 +24774,7 @@
         <w:color w:val="555555"/>
         <w:sz w:val="20"/>
       </w:rPr>
-      <w:t>Revision 2.6 — September 2026</w:t>
+      <w:t>Revision 2.7 — September 2026</w:t>
     </w:r>
     <w:r>
       <w:rPr>
@@ -24698,7 +24906,7 @@
         <w:color w:val="555555"/>
         <w:sz w:val="20"/>
       </w:rPr>
-      <w:t>Revision 2.6 — September 2026</w:t>
+      <w:t>Revision 2.7 — September 2026</w:t>
     </w:r>
     <w:r>
       <w:rPr>
@@ -24830,7 +25038,7 @@
         <w:color w:val="555555"/>
         <w:sz w:val="20"/>
       </w:rPr>
-      <w:t>Revision 2.6 — September 2026</w:t>
+      <w:t>Revision 2.7 — September 2026</w:t>
     </w:r>
     <w:r>
       <w:rPr>
@@ -24962,7 +25170,7 @@
         <w:color w:val="555555"/>
         <w:sz w:val="20"/>
       </w:rPr>
-      <w:t>Revision 2.6 — September 2026</w:t>
+      <w:t>Revision 2.7 — September 2026</w:t>
     </w:r>
     <w:r>
       <w:rPr>
@@ -25145,7 +25353,7 @@
         <w:color w:val="555555"/>
         <w:sz w:val="20"/>
       </w:rPr>
-      <w:t>Revision 2.6 — September 2026</w:t>
+      <w:t>Revision 2.7 — September 2026</w:t>
     </w:r>
   </w:p>
 </w:ftr>
@@ -25193,7 +25401,7 @@
         <w:color w:val="555555"/>
         <w:sz w:val="20"/>
       </w:rPr>
-      <w:t>Revision 2.6 — September 2026</w:t>
+      <w:t>Revision 2.7 — September 2026</w:t>
     </w:r>
     <w:r>
       <w:rPr>
@@ -25252,7 +25460,7 @@
         <w:color w:val="555555"/>
         <w:sz w:val="20"/>
       </w:rPr>
-      <w:t>Revision 2.6 — September 2026</w:t>
+      <w:t>Revision 2.7 — September 2026</w:t>
     </w:r>
     <w:r>
       <w:rPr>
@@ -25311,7 +25519,7 @@
         <w:color w:val="555555"/>
         <w:sz w:val="20"/>
       </w:rPr>
-      <w:t>Revision 2.6 — September 2026</w:t>
+      <w:t>Revision 2.7 — September 2026</w:t>
     </w:r>
     <w:r>
       <w:rPr>
@@ -25384,7 +25592,7 @@
         <w:color w:val="555555"/>
         <w:sz w:val="20"/>
       </w:rPr>
-      <w:t>Revision 2.6 — September 2026</w:t>
+      <w:t>Revision 2.7 — September 2026</w:t>
     </w:r>
     <w:r>
       <w:rPr>

</xml_diff>

<commit_message>
Document weather reading identifiers in Zev-7 manual
</commit_message>
<xml_diff>
--- a/Zev-7 Operator Manual.docx
+++ b/Zev-7 Operator Manual.docx
@@ -18782,11 +18782,7 @@
         </w:sectPr>
       </w:pPr>
       <w:r>
-        <w:rPr>
-          <w:rFonts w:ascii="Arial" w:hAnsi="Arial"/>
-          <w:sz w:val="22"/>
-        </w:rPr>
-        <w:t>Each item is held on the display briefly, then transitions to the next using the configured Info Transition (Fade, Scroll, Wave, or Spin Wave). The first info trigger after boot is suppressed so the clock has a chance to settle.</w:t>
+        <w:t>The leftmost digit identifies each weather reading: 1 = temperature, 2 = pressure, 3 = humidity, and 4 = indoor air quality. The number is fixed for the reading, even when other readings are disabled. Each item is held on the display briefly, then transitions to the next using the configured Info Transition (Fade, Scroll, Wave, or Spin Wave). The first info trigger after boot is suppressed so the clock has a chance to settle.</w:t>
       </w:r>
     </w:p>
     <w:p>
@@ -22955,7 +22951,7 @@
         <w:color w:val="555555"/>
         <w:sz w:val="20"/>
       </w:rPr>
-      <w:t>Revision 2.7 — September 2026</w:t>
+      <w:t>Revision 2.8 — September 2026</w:t>
     </w:r>
     <w:r>
       <w:rPr>
@@ -22974,15 +22970,12 @@
     </w:r>
     <w:r>
       <w:rPr/>
-      <w:fldChar w:fldCharType="begin"/>
-    </w:r>
-    <w:r>
-      <w:rPr/>
-      <w:instrText xml:space="preserve"> PAGE </w:instrText>
-    </w:r>
-    <w:r>
-      <w:rPr/>
-      <w:fldChar w:fldCharType="separate"/>
+    </w:r>
+    <w:r>
+      <w:rPr/>
+    </w:r>
+    <w:r>
+      <w:rPr/>
     </w:r>
     <w:r>
       <w:rPr/>
@@ -22990,7 +22983,6 @@
     </w:r>
     <w:r>
       <w:rPr/>
-      <w:fldChar w:fldCharType="end"/>
     </w:r>
   </w:p>
 </w:ftr>
@@ -23087,7 +23079,7 @@
         <w:color w:val="555555"/>
         <w:sz w:val="20"/>
       </w:rPr>
-      <w:t>Revision 2.7 — September 2026</w:t>
+      <w:t>Revision 2.8 — September 2026</w:t>
     </w:r>
     <w:r>
       <w:rPr>
@@ -23106,15 +23098,12 @@
     </w:r>
     <w:r>
       <w:rPr/>
-      <w:fldChar w:fldCharType="begin"/>
-    </w:r>
-    <w:r>
-      <w:rPr/>
-      <w:instrText xml:space="preserve"> PAGE </w:instrText>
-    </w:r>
-    <w:r>
-      <w:rPr/>
-      <w:fldChar w:fldCharType="separate"/>
+    </w:r>
+    <w:r>
+      <w:rPr/>
+    </w:r>
+    <w:r>
+      <w:rPr/>
     </w:r>
     <w:r>
       <w:rPr/>
@@ -23122,7 +23111,6 @@
     </w:r>
     <w:r>
       <w:rPr/>
-      <w:fldChar w:fldCharType="end"/>
     </w:r>
   </w:p>
 </w:ftr>
@@ -23219,7 +23207,7 @@
         <w:color w:val="555555"/>
         <w:sz w:val="20"/>
       </w:rPr>
-      <w:t>Revision 2.7 — September 2026</w:t>
+      <w:t>Revision 2.8 — September 2026</w:t>
     </w:r>
     <w:r>
       <w:rPr>
@@ -23238,15 +23226,12 @@
     </w:r>
     <w:r>
       <w:rPr/>
-      <w:fldChar w:fldCharType="begin"/>
-    </w:r>
-    <w:r>
-      <w:rPr/>
-      <w:instrText xml:space="preserve"> PAGE </w:instrText>
-    </w:r>
-    <w:r>
-      <w:rPr/>
-      <w:fldChar w:fldCharType="separate"/>
+    </w:r>
+    <w:r>
+      <w:rPr/>
+    </w:r>
+    <w:r>
+      <w:rPr/>
     </w:r>
     <w:r>
       <w:rPr/>
@@ -23254,7 +23239,6 @@
     </w:r>
     <w:r>
       <w:rPr/>
-      <w:fldChar w:fldCharType="end"/>
     </w:r>
   </w:p>
 </w:ftr>
@@ -23370,7 +23354,7 @@
         <w:color w:val="555555"/>
         <w:sz w:val="20"/>
       </w:rPr>
-      <w:t>Revision 2.7 — September 2026</w:t>
+      <w:t>Revision 2.8 — September 2026</w:t>
     </w:r>
     <w:r>
       <w:rPr>
@@ -23389,15 +23373,12 @@
     </w:r>
     <w:r>
       <w:rPr/>
-      <w:fldChar w:fldCharType="begin"/>
-    </w:r>
-    <w:r>
-      <w:rPr/>
-      <w:instrText xml:space="preserve"> PAGE </w:instrText>
-    </w:r>
-    <w:r>
-      <w:rPr/>
-      <w:fldChar w:fldCharType="separate"/>
+    </w:r>
+    <w:r>
+      <w:rPr/>
+    </w:r>
+    <w:r>
+      <w:rPr/>
     </w:r>
     <w:r>
       <w:rPr/>
@@ -23405,7 +23386,6 @@
     </w:r>
     <w:r>
       <w:rPr/>
-      <w:fldChar w:fldCharType="end"/>
     </w:r>
   </w:p>
 </w:ftr>
@@ -23502,7 +23482,7 @@
         <w:color w:val="555555"/>
         <w:sz w:val="20"/>
       </w:rPr>
-      <w:t>Revision 2.7 — September 2026</w:t>
+      <w:t>Revision 2.8 — September 2026</w:t>
     </w:r>
     <w:r>
       <w:rPr>
@@ -23521,15 +23501,12 @@
     </w:r>
     <w:r>
       <w:rPr/>
-      <w:fldChar w:fldCharType="begin"/>
-    </w:r>
-    <w:r>
-      <w:rPr/>
-      <w:instrText xml:space="preserve"> PAGE </w:instrText>
-    </w:r>
-    <w:r>
-      <w:rPr/>
-      <w:fldChar w:fldCharType="separate"/>
+    </w:r>
+    <w:r>
+      <w:rPr/>
+    </w:r>
+    <w:r>
+      <w:rPr/>
     </w:r>
     <w:r>
       <w:rPr/>
@@ -23537,7 +23514,6 @@
     </w:r>
     <w:r>
       <w:rPr/>
-      <w:fldChar w:fldCharType="end"/>
     </w:r>
   </w:p>
 </w:ftr>
@@ -23634,7 +23610,7 @@
         <w:color w:val="555555"/>
         <w:sz w:val="20"/>
       </w:rPr>
-      <w:t>Revision 2.7 — September 2026</w:t>
+      <w:t>Revision 2.8 — September 2026</w:t>
     </w:r>
     <w:r>
       <w:rPr>
@@ -23653,15 +23629,12 @@
     </w:r>
     <w:r>
       <w:rPr/>
-      <w:fldChar w:fldCharType="begin"/>
-    </w:r>
-    <w:r>
-      <w:rPr/>
-      <w:instrText xml:space="preserve"> PAGE </w:instrText>
-    </w:r>
-    <w:r>
-      <w:rPr/>
-      <w:fldChar w:fldCharType="separate"/>
+    </w:r>
+    <w:r>
+      <w:rPr/>
+    </w:r>
+    <w:r>
+      <w:rPr/>
     </w:r>
     <w:r>
       <w:rPr/>
@@ -23669,7 +23642,6 @@
     </w:r>
     <w:r>
       <w:rPr/>
-      <w:fldChar w:fldCharType="end"/>
     </w:r>
   </w:p>
 </w:ftr>
@@ -23766,7 +23738,7 @@
         <w:color w:val="555555"/>
         <w:sz w:val="20"/>
       </w:rPr>
-      <w:t>Revision 2.7 — September 2026</w:t>
+      <w:t>Revision 2.8 — September 2026</w:t>
     </w:r>
     <w:r>
       <w:rPr>
@@ -23785,15 +23757,12 @@
     </w:r>
     <w:r>
       <w:rPr/>
-      <w:fldChar w:fldCharType="begin"/>
-    </w:r>
-    <w:r>
-      <w:rPr/>
-      <w:instrText xml:space="preserve"> PAGE </w:instrText>
-    </w:r>
-    <w:r>
-      <w:rPr/>
-      <w:fldChar w:fldCharType="separate"/>
+    </w:r>
+    <w:r>
+      <w:rPr/>
+    </w:r>
+    <w:r>
+      <w:rPr/>
     </w:r>
     <w:r>
       <w:rPr/>
@@ -23801,7 +23770,6 @@
     </w:r>
     <w:r>
       <w:rPr/>
-      <w:fldChar w:fldCharType="end"/>
     </w:r>
   </w:p>
 </w:ftr>
@@ -24049,7 +24017,7 @@
         <w:color w:val="555555"/>
         <w:sz w:val="20"/>
       </w:rPr>
-      <w:t>Revision 2.7 — September 2026</w:t>
+      <w:t>Revision 2.8 — September 2026</w:t>
     </w:r>
     <w:r>
       <w:rPr>
@@ -24068,15 +24036,12 @@
     </w:r>
     <w:r>
       <w:rPr/>
-      <w:fldChar w:fldCharType="begin"/>
-    </w:r>
-    <w:r>
-      <w:rPr/>
-      <w:instrText xml:space="preserve"> PAGE </w:instrText>
-    </w:r>
-    <w:r>
-      <w:rPr/>
-      <w:fldChar w:fldCharType="separate"/>
+    </w:r>
+    <w:r>
+      <w:rPr/>
+    </w:r>
+    <w:r>
+      <w:rPr/>
     </w:r>
     <w:r>
       <w:rPr/>
@@ -24084,7 +24049,6 @@
     </w:r>
     <w:r>
       <w:rPr/>
-      <w:fldChar w:fldCharType="end"/>
     </w:r>
   </w:p>
 </w:ftr>
@@ -24181,7 +24145,7 @@
         <w:color w:val="555555"/>
         <w:sz w:val="20"/>
       </w:rPr>
-      <w:t>Revision 2.7 — September 2026</w:t>
+      <w:t>Revision 2.8 — September 2026</w:t>
     </w:r>
     <w:r>
       <w:rPr>
@@ -24200,15 +24164,12 @@
     </w:r>
     <w:r>
       <w:rPr/>
-      <w:fldChar w:fldCharType="begin"/>
-    </w:r>
-    <w:r>
-      <w:rPr/>
-      <w:instrText xml:space="preserve"> PAGE </w:instrText>
-    </w:r>
-    <w:r>
-      <w:rPr/>
-      <w:fldChar w:fldCharType="separate"/>
+    </w:r>
+    <w:r>
+      <w:rPr/>
+    </w:r>
+    <w:r>
+      <w:rPr/>
     </w:r>
     <w:r>
       <w:rPr/>
@@ -24216,7 +24177,6 @@
     </w:r>
     <w:r>
       <w:rPr/>
-      <w:fldChar w:fldCharType="end"/>
     </w:r>
   </w:p>
 </w:ftr>
@@ -24327,7 +24287,7 @@
         <w:color w:val="555555"/>
         <w:sz w:val="20"/>
       </w:rPr>
-      <w:t>Revision 2.7 — September 2026</w:t>
+      <w:t>Revision 2.8 — September 2026</w:t>
     </w:r>
     <w:r>
       <w:rPr>
@@ -24346,15 +24306,12 @@
     </w:r>
     <w:r>
       <w:rPr/>
-      <w:fldChar w:fldCharType="begin"/>
-    </w:r>
-    <w:r>
-      <w:rPr/>
-      <w:instrText xml:space="preserve"> PAGE </w:instrText>
-    </w:r>
-    <w:r>
-      <w:rPr/>
-      <w:fldChar w:fldCharType="separate"/>
+    </w:r>
+    <w:r>
+      <w:rPr/>
+    </w:r>
+    <w:r>
+      <w:rPr/>
     </w:r>
     <w:r>
       <w:rPr/>
@@ -24362,7 +24319,6 @@
     </w:r>
     <w:r>
       <w:rPr/>
-      <w:fldChar w:fldCharType="end"/>
     </w:r>
   </w:p>
 </w:ftr>
@@ -24459,7 +24415,7 @@
         <w:color w:val="555555"/>
         <w:sz w:val="20"/>
       </w:rPr>
-      <w:t>Revision 2.7 — September 2026</w:t>
+      <w:t>Revision 2.8 — September 2026</w:t>
     </w:r>
     <w:r>
       <w:rPr>
@@ -24478,15 +24434,12 @@
     </w:r>
     <w:r>
       <w:rPr/>
-      <w:fldChar w:fldCharType="begin"/>
-    </w:r>
-    <w:r>
-      <w:rPr/>
-      <w:instrText xml:space="preserve"> PAGE </w:instrText>
-    </w:r>
-    <w:r>
-      <w:rPr/>
-      <w:fldChar w:fldCharType="separate"/>
+    </w:r>
+    <w:r>
+      <w:rPr/>
+    </w:r>
+    <w:r>
+      <w:rPr/>
     </w:r>
     <w:r>
       <w:rPr/>
@@ -24494,7 +24447,6 @@
     </w:r>
     <w:r>
       <w:rPr/>
-      <w:fldChar w:fldCharType="end"/>
     </w:r>
   </w:p>
 </w:ftr>
@@ -24591,7 +24543,7 @@
         <w:color w:val="555555"/>
         <w:sz w:val="20"/>
       </w:rPr>
-      <w:t>Revision 2.7 — September 2026</w:t>
+      <w:t>Revision 2.8 — September 2026</w:t>
     </w:r>
     <w:r>
       <w:rPr>
@@ -24610,15 +24562,12 @@
     </w:r>
     <w:r>
       <w:rPr/>
-      <w:fldChar w:fldCharType="begin"/>
-    </w:r>
-    <w:r>
-      <w:rPr/>
-      <w:instrText xml:space="preserve"> PAGE </w:instrText>
-    </w:r>
-    <w:r>
-      <w:rPr/>
-      <w:fldChar w:fldCharType="separate"/>
+    </w:r>
+    <w:r>
+      <w:rPr/>
+    </w:r>
+    <w:r>
+      <w:rPr/>
     </w:r>
     <w:r>
       <w:rPr/>
@@ -24626,7 +24575,6 @@
     </w:r>
     <w:r>
       <w:rPr/>
-      <w:fldChar w:fldCharType="end"/>
     </w:r>
   </w:p>
 </w:ftr>
@@ -24723,7 +24671,7 @@
         <w:color w:val="555555"/>
         <w:sz w:val="20"/>
       </w:rPr>
-      <w:t>Revision 2.7 — September 2026</w:t>
+      <w:t>Revision 2.8 — September 2026</w:t>
     </w:r>
     <w:r>
       <w:rPr>
@@ -24734,15 +24682,12 @@
     </w:r>
     <w:r>
       <w:rPr/>
-      <w:fldChar w:fldCharType="begin"/>
-    </w:r>
-    <w:r>
-      <w:rPr/>
-      <w:instrText xml:space="preserve"> PAGE </w:instrText>
-    </w:r>
-    <w:r>
-      <w:rPr/>
-      <w:fldChar w:fldCharType="separate"/>
+    </w:r>
+    <w:r>
+      <w:rPr/>
+    </w:r>
+    <w:r>
+      <w:rPr/>
     </w:r>
     <w:r>
       <w:rPr/>
@@ -24750,7 +24695,6 @@
     </w:r>
     <w:r>
       <w:rPr/>
-      <w:fldChar w:fldCharType="end"/>
     </w:r>
   </w:p>
 </w:ftr>
@@ -24774,7 +24718,7 @@
         <w:color w:val="555555"/>
         <w:sz w:val="20"/>
       </w:rPr>
-      <w:t>Revision 2.7 — September 2026</w:t>
+      <w:t>Revision 2.8 — September 2026</w:t>
     </w:r>
     <w:r>
       <w:rPr>
@@ -24793,15 +24737,12 @@
     </w:r>
     <w:r>
       <w:rPr/>
-      <w:fldChar w:fldCharType="begin"/>
-    </w:r>
-    <w:r>
-      <w:rPr/>
-      <w:instrText xml:space="preserve"> PAGE </w:instrText>
-    </w:r>
-    <w:r>
-      <w:rPr/>
-      <w:fldChar w:fldCharType="separate"/>
+    </w:r>
+    <w:r>
+      <w:rPr/>
+    </w:r>
+    <w:r>
+      <w:rPr/>
     </w:r>
     <w:r>
       <w:rPr/>
@@ -24809,7 +24750,6 @@
     </w:r>
     <w:r>
       <w:rPr/>
-      <w:fldChar w:fldCharType="end"/>
     </w:r>
   </w:p>
 </w:ftr>
@@ -24906,7 +24846,7 @@
         <w:color w:val="555555"/>
         <w:sz w:val="20"/>
       </w:rPr>
-      <w:t>Revision 2.7 — September 2026</w:t>
+      <w:t>Revision 2.8 — September 2026</w:t>
     </w:r>
     <w:r>
       <w:rPr>
@@ -24925,15 +24865,12 @@
     </w:r>
     <w:r>
       <w:rPr/>
-      <w:fldChar w:fldCharType="begin"/>
-    </w:r>
-    <w:r>
-      <w:rPr/>
-      <w:instrText xml:space="preserve"> PAGE </w:instrText>
-    </w:r>
-    <w:r>
-      <w:rPr/>
-      <w:fldChar w:fldCharType="separate"/>
+    </w:r>
+    <w:r>
+      <w:rPr/>
+    </w:r>
+    <w:r>
+      <w:rPr/>
     </w:r>
     <w:r>
       <w:rPr/>
@@ -24941,7 +24878,6 @@
     </w:r>
     <w:r>
       <w:rPr/>
-      <w:fldChar w:fldCharType="end"/>
     </w:r>
   </w:p>
 </w:ftr>
@@ -25038,7 +24974,7 @@
         <w:color w:val="555555"/>
         <w:sz w:val="20"/>
       </w:rPr>
-      <w:t>Revision 2.7 — September 2026</w:t>
+      <w:t>Revision 2.8 — September 2026</w:t>
     </w:r>
     <w:r>
       <w:rPr>
@@ -25057,15 +24993,12 @@
     </w:r>
     <w:r>
       <w:rPr/>
-      <w:fldChar w:fldCharType="begin"/>
-    </w:r>
-    <w:r>
-      <w:rPr/>
-      <w:instrText xml:space="preserve"> PAGE </w:instrText>
-    </w:r>
-    <w:r>
-      <w:rPr/>
-      <w:fldChar w:fldCharType="separate"/>
+    </w:r>
+    <w:r>
+      <w:rPr/>
+    </w:r>
+    <w:r>
+      <w:rPr/>
     </w:r>
     <w:r>
       <w:rPr/>
@@ -25073,7 +25006,6 @@
     </w:r>
     <w:r>
       <w:rPr/>
-      <w:fldChar w:fldCharType="end"/>
     </w:r>
   </w:p>
 </w:ftr>
@@ -25170,7 +25102,7 @@
         <w:color w:val="555555"/>
         <w:sz w:val="20"/>
       </w:rPr>
-      <w:t>Revision 2.7 — September 2026</w:t>
+      <w:t>Revision 2.8 — September 2026</w:t>
     </w:r>
     <w:r>
       <w:rPr>
@@ -25189,15 +25121,12 @@
     </w:r>
     <w:r>
       <w:rPr/>
-      <w:fldChar w:fldCharType="begin"/>
-    </w:r>
-    <w:r>
-      <w:rPr/>
-      <w:instrText xml:space="preserve"> PAGE </w:instrText>
-    </w:r>
-    <w:r>
-      <w:rPr/>
-      <w:fldChar w:fldCharType="separate"/>
+    </w:r>
+    <w:r>
+      <w:rPr/>
+    </w:r>
+    <w:r>
+      <w:rPr/>
     </w:r>
     <w:r>
       <w:rPr/>
@@ -25205,7 +25134,6 @@
     </w:r>
     <w:r>
       <w:rPr/>
-      <w:fldChar w:fldCharType="end"/>
     </w:r>
   </w:p>
 </w:ftr>
@@ -25353,7 +25281,7 @@
         <w:color w:val="555555"/>
         <w:sz w:val="20"/>
       </w:rPr>
-      <w:t>Revision 2.7 — September 2026</w:t>
+      <w:t>Revision 2.8 — September 2026</w:t>
     </w:r>
   </w:p>
 </w:ftr>
@@ -25401,7 +25329,7 @@
         <w:color w:val="555555"/>
         <w:sz w:val="20"/>
       </w:rPr>
-      <w:t>Revision 2.7 — September 2026</w:t>
+      <w:t>Revision 2.8 — September 2026</w:t>
     </w:r>
     <w:r>
       <w:rPr>
@@ -25420,15 +25348,12 @@
     </w:r>
     <w:r>
       <w:rPr/>
-      <w:fldChar w:fldCharType="begin"/>
-    </w:r>
-    <w:r>
-      <w:rPr/>
-      <w:instrText xml:space="preserve"> PAGE </w:instrText>
-    </w:r>
-    <w:r>
-      <w:rPr/>
-      <w:fldChar w:fldCharType="separate"/>
+    </w:r>
+    <w:r>
+      <w:rPr/>
+    </w:r>
+    <w:r>
+      <w:rPr/>
     </w:r>
     <w:r>
       <w:rPr/>
@@ -25436,7 +25361,6 @@
     </w:r>
     <w:r>
       <w:rPr/>
-      <w:fldChar w:fldCharType="end"/>
     </w:r>
   </w:p>
 </w:ftr>
@@ -25460,7 +25384,7 @@
         <w:color w:val="555555"/>
         <w:sz w:val="20"/>
       </w:rPr>
-      <w:t>Revision 2.7 — September 2026</w:t>
+      <w:t>Revision 2.8 — September 2026</w:t>
     </w:r>
     <w:r>
       <w:rPr>
@@ -25479,15 +25403,12 @@
     </w:r>
     <w:r>
       <w:rPr/>
-      <w:fldChar w:fldCharType="begin"/>
-    </w:r>
-    <w:r>
-      <w:rPr/>
-      <w:instrText xml:space="preserve"> PAGE </w:instrText>
-    </w:r>
-    <w:r>
-      <w:rPr/>
-      <w:fldChar w:fldCharType="separate"/>
+    </w:r>
+    <w:r>
+      <w:rPr/>
+    </w:r>
+    <w:r>
+      <w:rPr/>
     </w:r>
     <w:r>
       <w:rPr/>
@@ -25495,7 +25416,6 @@
     </w:r>
     <w:r>
       <w:rPr/>
-      <w:fldChar w:fldCharType="end"/>
     </w:r>
   </w:p>
 </w:ftr>
@@ -25519,7 +25439,7 @@
         <w:color w:val="555555"/>
         <w:sz w:val="20"/>
       </w:rPr>
-      <w:t>Revision 2.7 — September 2026</w:t>
+      <w:t>Revision 2.8 — September 2026</w:t>
     </w:r>
     <w:r>
       <w:rPr>
@@ -25538,15 +25458,12 @@
     </w:r>
     <w:r>
       <w:rPr/>
-      <w:fldChar w:fldCharType="begin"/>
-    </w:r>
-    <w:r>
-      <w:rPr/>
-      <w:instrText xml:space="preserve"> PAGE </w:instrText>
-    </w:r>
-    <w:r>
-      <w:rPr/>
-      <w:fldChar w:fldCharType="separate"/>
+    </w:r>
+    <w:r>
+      <w:rPr/>
+    </w:r>
+    <w:r>
+      <w:rPr/>
     </w:r>
     <w:r>
       <w:rPr/>
@@ -25554,7 +25471,6 @@
     </w:r>
     <w:r>
       <w:rPr/>
-      <w:fldChar w:fldCharType="end"/>
     </w:r>
   </w:p>
 </w:ftr>
@@ -25592,7 +25508,7 @@
         <w:color w:val="555555"/>
         <w:sz w:val="20"/>
       </w:rPr>
-      <w:t>Revision 2.7 — September 2026</w:t>
+      <w:t>Revision 2.8 — September 2026</w:t>
     </w:r>
     <w:r>
       <w:rPr>
@@ -25611,15 +25527,12 @@
     </w:r>
     <w:r>
       <w:rPr/>
-      <w:fldChar w:fldCharType="begin"/>
-    </w:r>
-    <w:r>
-      <w:rPr/>
-      <w:instrText xml:space="preserve"> PAGE </w:instrText>
-    </w:r>
-    <w:r>
-      <w:rPr/>
-      <w:fldChar w:fldCharType="separate"/>
+    </w:r>
+    <w:r>
+      <w:rPr/>
+    </w:r>
+    <w:r>
+      <w:rPr/>
     </w:r>
     <w:r>
       <w:rPr/>
@@ -25627,7 +25540,6 @@
     </w:r>
     <w:r>
       <w:rPr/>
-      <w:fldChar w:fldCharType="end"/>
     </w:r>
   </w:p>
 </w:ftr>

</xml_diff>

<commit_message>
Clarify weather identifier separator in Zev-7 manual
</commit_message>
<xml_diff>
--- a/Zev-7 Operator Manual.docx
+++ b/Zev-7 Operator Manual.docx
@@ -18782,7 +18782,7 @@
         </w:sectPr>
       </w:pPr>
       <w:r>
-        <w:t>The leftmost digit identifies each weather reading: 1 = temperature, 2 = pressure, 3 = humidity, and 4 = indoor air quality. The number is fixed for the reading, even when other readings are disabled. Each item is held on the display briefly, then transitions to the next using the configured Info Transition (Fade, Scroll, Wave, or Spin Wave). The first info trigger after boot is suppressed so the clock has a chance to settle.</w:t>
+        <w:t>The leftmost digit identifies each weather reading: 1 = temperature, 2 = pressure, 3 = humidity, and 4 = indoor air quality. The number is fixed for the reading, even when other readings are disabled. The second digit stays blank to separate the identifier from the value. Each item is held on the display briefly, then transitions to the next using the configured Info Transition (Fade, Scroll, Wave, or Spin Wave). The first info trigger after boot is suppressed so the clock has a chance to settle.</w:t>
       </w:r>
     </w:p>
     <w:p>
@@ -22951,7 +22951,7 @@
         <w:color w:val="555555"/>
         <w:sz w:val="20"/>
       </w:rPr>
-      <w:t>Revision 2.8 — September 2026</w:t>
+      <w:t>Revision 2.9 — September 2026</w:t>
     </w:r>
     <w:r>
       <w:rPr>
@@ -23079,7 +23079,7 @@
         <w:color w:val="555555"/>
         <w:sz w:val="20"/>
       </w:rPr>
-      <w:t>Revision 2.8 — September 2026</w:t>
+      <w:t>Revision 2.9 — September 2026</w:t>
     </w:r>
     <w:r>
       <w:rPr>
@@ -23207,7 +23207,7 @@
         <w:color w:val="555555"/>
         <w:sz w:val="20"/>
       </w:rPr>
-      <w:t>Revision 2.8 — September 2026</w:t>
+      <w:t>Revision 2.9 — September 2026</w:t>
     </w:r>
     <w:r>
       <w:rPr>
@@ -23354,7 +23354,7 @@
         <w:color w:val="555555"/>
         <w:sz w:val="20"/>
       </w:rPr>
-      <w:t>Revision 2.8 — September 2026</w:t>
+      <w:t>Revision 2.9 — September 2026</w:t>
     </w:r>
     <w:r>
       <w:rPr>
@@ -23482,7 +23482,7 @@
         <w:color w:val="555555"/>
         <w:sz w:val="20"/>
       </w:rPr>
-      <w:t>Revision 2.8 — September 2026</w:t>
+      <w:t>Revision 2.9 — September 2026</w:t>
     </w:r>
     <w:r>
       <w:rPr>
@@ -23610,7 +23610,7 @@
         <w:color w:val="555555"/>
         <w:sz w:val="20"/>
       </w:rPr>
-      <w:t>Revision 2.8 — September 2026</w:t>
+      <w:t>Revision 2.9 — September 2026</w:t>
     </w:r>
     <w:r>
       <w:rPr>
@@ -23738,7 +23738,7 @@
         <w:color w:val="555555"/>
         <w:sz w:val="20"/>
       </w:rPr>
-      <w:t>Revision 2.8 — September 2026</w:t>
+      <w:t>Revision 2.9 — September 2026</w:t>
     </w:r>
     <w:r>
       <w:rPr>
@@ -24017,7 +24017,7 @@
         <w:color w:val="555555"/>
         <w:sz w:val="20"/>
       </w:rPr>
-      <w:t>Revision 2.8 — September 2026</w:t>
+      <w:t>Revision 2.9 — September 2026</w:t>
     </w:r>
     <w:r>
       <w:rPr>
@@ -24145,7 +24145,7 @@
         <w:color w:val="555555"/>
         <w:sz w:val="20"/>
       </w:rPr>
-      <w:t>Revision 2.8 — September 2026</w:t>
+      <w:t>Revision 2.9 — September 2026</w:t>
     </w:r>
     <w:r>
       <w:rPr>
@@ -24287,7 +24287,7 @@
         <w:color w:val="555555"/>
         <w:sz w:val="20"/>
       </w:rPr>
-      <w:t>Revision 2.8 — September 2026</w:t>
+      <w:t>Revision 2.9 — September 2026</w:t>
     </w:r>
     <w:r>
       <w:rPr>
@@ -24415,7 +24415,7 @@
         <w:color w:val="555555"/>
         <w:sz w:val="20"/>
       </w:rPr>
-      <w:t>Revision 2.8 — September 2026</w:t>
+      <w:t>Revision 2.9 — September 2026</w:t>
     </w:r>
     <w:r>
       <w:rPr>
@@ -24543,7 +24543,7 @@
         <w:color w:val="555555"/>
         <w:sz w:val="20"/>
       </w:rPr>
-      <w:t>Revision 2.8 — September 2026</w:t>
+      <w:t>Revision 2.9 — September 2026</w:t>
     </w:r>
     <w:r>
       <w:rPr>
@@ -24671,7 +24671,7 @@
         <w:color w:val="555555"/>
         <w:sz w:val="20"/>
       </w:rPr>
-      <w:t>Revision 2.8 — September 2026</w:t>
+      <w:t>Revision 2.9 — September 2026</w:t>
     </w:r>
     <w:r>
       <w:rPr>
@@ -24718,7 +24718,7 @@
         <w:color w:val="555555"/>
         <w:sz w:val="20"/>
       </w:rPr>
-      <w:t>Revision 2.8 — September 2026</w:t>
+      <w:t>Revision 2.9 — September 2026</w:t>
     </w:r>
     <w:r>
       <w:rPr>
@@ -24846,7 +24846,7 @@
         <w:color w:val="555555"/>
         <w:sz w:val="20"/>
       </w:rPr>
-      <w:t>Revision 2.8 — September 2026</w:t>
+      <w:t>Revision 2.9 — September 2026</w:t>
     </w:r>
     <w:r>
       <w:rPr>
@@ -24974,7 +24974,7 @@
         <w:color w:val="555555"/>
         <w:sz w:val="20"/>
       </w:rPr>
-      <w:t>Revision 2.8 — September 2026</w:t>
+      <w:t>Revision 2.9 — September 2026</w:t>
     </w:r>
     <w:r>
       <w:rPr>
@@ -25102,7 +25102,7 @@
         <w:color w:val="555555"/>
         <w:sz w:val="20"/>
       </w:rPr>
-      <w:t>Revision 2.8 — September 2026</w:t>
+      <w:t>Revision 2.9 — September 2026</w:t>
     </w:r>
     <w:r>
       <w:rPr>
@@ -25281,7 +25281,7 @@
         <w:color w:val="555555"/>
         <w:sz w:val="20"/>
       </w:rPr>
-      <w:t>Revision 2.8 — September 2026</w:t>
+      <w:t>Revision 2.9 — September 2026</w:t>
     </w:r>
   </w:p>
 </w:ftr>
@@ -25329,7 +25329,7 @@
         <w:color w:val="555555"/>
         <w:sz w:val="20"/>
       </w:rPr>
-      <w:t>Revision 2.8 — September 2026</w:t>
+      <w:t>Revision 2.9 — September 2026</w:t>
     </w:r>
     <w:r>
       <w:rPr>
@@ -25384,7 +25384,7 @@
         <w:color w:val="555555"/>
         <w:sz w:val="20"/>
       </w:rPr>
-      <w:t>Revision 2.8 — September 2026</w:t>
+      <w:t>Revision 2.9 — September 2026</w:t>
     </w:r>
     <w:r>
       <w:rPr>
@@ -25439,7 +25439,7 @@
         <w:color w:val="555555"/>
         <w:sz w:val="20"/>
       </w:rPr>
-      <w:t>Revision 2.8 — September 2026</w:t>
+      <w:t>Revision 2.9 — September 2026</w:t>
     </w:r>
     <w:r>
       <w:rPr>
@@ -25508,7 +25508,7 @@
         <w:color w:val="555555"/>
         <w:sz w:val="20"/>
       </w:rPr>
-      <w:t>Revision 2.8 — September 2026</w:t>
+      <w:t>Revision 2.9 — September 2026</w:t>
     </w:r>
     <w:r>
       <w:rPr>

</xml_diff>

<commit_message>
Document whole-number weather readings in Zev-7 manual
</commit_message>
<xml_diff>
--- a/Zev-7 Operator Manual.docx
+++ b/Zev-7 Operator Manual.docx
@@ -18721,11 +18721,20 @@
         <w:rPr/>
       </w:pPr>
       <w:r>
+        <w:t>Temperature: Shown as a rounded whole degree. Temperature units are selectable as Fahrenheit, Celsius, or Kelvin. Negative temperatures are indicated by a special neon pattern.</w:t>
+      </w:r>
+    </w:p>
+    <w:p>
+      <w:pPr>
+        <w:pStyle w:val="Normal"/>
+        <w:rPr/>
+      </w:pPr>
+      <w:r>
         <w:rPr>
           <w:rFonts w:ascii="Arial" w:hAnsi="Arial"/>
           <w:sz w:val="22"/>
         </w:rPr>
-        <w:t>Temperature: Shown in tenths of a degree (e.g., 78.2). Temperature units selectable as Fahrenheit, Celsius, or Kelvin. Negative temperatures are indicated by a special neon pattern.</w:t>
+        <w:t>Barometric Pressure: Displayed in inches of mercury or millibars.</w:t>
       </w:r>
     </w:p>
     <w:p>
@@ -18734,24 +18743,7 @@
         <w:rPr/>
       </w:pPr>
       <w:r>
-        <w:rPr>
-          <w:rFonts w:ascii="Arial" w:hAnsi="Arial"/>
-          <w:sz w:val="22"/>
-        </w:rPr>
-        <w:t>Barometric Pressure: Displayed in inches of mercury or millibars.</w:t>
-      </w:r>
-    </w:p>
-    <w:p>
-      <w:pPr>
-        <w:pStyle w:val="Normal"/>
-        <w:rPr/>
-      </w:pPr>
-      <w:r>
-        <w:rPr>
-          <w:rFonts w:ascii="Arial" w:hAnsi="Arial"/>
-          <w:sz w:val="22"/>
-        </w:rPr>
-        <w:t>Humidity: Displayed as a percentage with tenths (e.g., 55.2%).</w:t>
+        <w:t>Humidity: Displayed as a rounded whole percentage.</w:t>
       </w:r>
     </w:p>
     <w:p>
@@ -22951,7 +22943,7 @@
         <w:color w:val="555555"/>
         <w:sz w:val="20"/>
       </w:rPr>
-      <w:t>Revision 2.9 — September 2026</w:t>
+      <w:t>Revision 3.0 — September 2026</w:t>
     </w:r>
     <w:r>
       <w:rPr>
@@ -23079,7 +23071,7 @@
         <w:color w:val="555555"/>
         <w:sz w:val="20"/>
       </w:rPr>
-      <w:t>Revision 2.9 — September 2026</w:t>
+      <w:t>Revision 3.0 — September 2026</w:t>
     </w:r>
     <w:r>
       <w:rPr>
@@ -23207,7 +23199,7 @@
         <w:color w:val="555555"/>
         <w:sz w:val="20"/>
       </w:rPr>
-      <w:t>Revision 2.9 — September 2026</w:t>
+      <w:t>Revision 3.0 — September 2026</w:t>
     </w:r>
     <w:r>
       <w:rPr>
@@ -23354,7 +23346,7 @@
         <w:color w:val="555555"/>
         <w:sz w:val="20"/>
       </w:rPr>
-      <w:t>Revision 2.9 — September 2026</w:t>
+      <w:t>Revision 3.0 — September 2026</w:t>
     </w:r>
     <w:r>
       <w:rPr>
@@ -23482,7 +23474,7 @@
         <w:color w:val="555555"/>
         <w:sz w:val="20"/>
       </w:rPr>
-      <w:t>Revision 2.9 — September 2026</w:t>
+      <w:t>Revision 3.0 — September 2026</w:t>
     </w:r>
     <w:r>
       <w:rPr>
@@ -23610,7 +23602,7 @@
         <w:color w:val="555555"/>
         <w:sz w:val="20"/>
       </w:rPr>
-      <w:t>Revision 2.9 — September 2026</w:t>
+      <w:t>Revision 3.0 — September 2026</w:t>
     </w:r>
     <w:r>
       <w:rPr>
@@ -23738,7 +23730,7 @@
         <w:color w:val="555555"/>
         <w:sz w:val="20"/>
       </w:rPr>
-      <w:t>Revision 2.9 — September 2026</w:t>
+      <w:t>Revision 3.0 — September 2026</w:t>
     </w:r>
     <w:r>
       <w:rPr>
@@ -24017,7 +24009,7 @@
         <w:color w:val="555555"/>
         <w:sz w:val="20"/>
       </w:rPr>
-      <w:t>Revision 2.9 — September 2026</w:t>
+      <w:t>Revision 3.0 — September 2026</w:t>
     </w:r>
     <w:r>
       <w:rPr>
@@ -24145,7 +24137,7 @@
         <w:color w:val="555555"/>
         <w:sz w:val="20"/>
       </w:rPr>
-      <w:t>Revision 2.9 — September 2026</w:t>
+      <w:t>Revision 3.0 — September 2026</w:t>
     </w:r>
     <w:r>
       <w:rPr>
@@ -24287,7 +24279,7 @@
         <w:color w:val="555555"/>
         <w:sz w:val="20"/>
       </w:rPr>
-      <w:t>Revision 2.9 — September 2026</w:t>
+      <w:t>Revision 3.0 — September 2026</w:t>
     </w:r>
     <w:r>
       <w:rPr>
@@ -24415,7 +24407,7 @@
         <w:color w:val="555555"/>
         <w:sz w:val="20"/>
       </w:rPr>
-      <w:t>Revision 2.9 — September 2026</w:t>
+      <w:t>Revision 3.0 — September 2026</w:t>
     </w:r>
     <w:r>
       <w:rPr>
@@ -24543,7 +24535,7 @@
         <w:color w:val="555555"/>
         <w:sz w:val="20"/>
       </w:rPr>
-      <w:t>Revision 2.9 — September 2026</w:t>
+      <w:t>Revision 3.0 — September 2026</w:t>
     </w:r>
     <w:r>
       <w:rPr>
@@ -24671,7 +24663,7 @@
         <w:color w:val="555555"/>
         <w:sz w:val="20"/>
       </w:rPr>
-      <w:t>Revision 2.9 — September 2026</w:t>
+      <w:t>Revision 3.0 — September 2026</w:t>
     </w:r>
     <w:r>
       <w:rPr>
@@ -24718,7 +24710,7 @@
         <w:color w:val="555555"/>
         <w:sz w:val="20"/>
       </w:rPr>
-      <w:t>Revision 2.9 — September 2026</w:t>
+      <w:t>Revision 3.0 — September 2026</w:t>
     </w:r>
     <w:r>
       <w:rPr>
@@ -24846,7 +24838,7 @@
         <w:color w:val="555555"/>
         <w:sz w:val="20"/>
       </w:rPr>
-      <w:t>Revision 2.9 — September 2026</w:t>
+      <w:t>Revision 3.0 — September 2026</w:t>
     </w:r>
     <w:r>
       <w:rPr>
@@ -24974,7 +24966,7 @@
         <w:color w:val="555555"/>
         <w:sz w:val="20"/>
       </w:rPr>
-      <w:t>Revision 2.9 — September 2026</w:t>
+      <w:t>Revision 3.0 — September 2026</w:t>
     </w:r>
     <w:r>
       <w:rPr>
@@ -25102,7 +25094,7 @@
         <w:color w:val="555555"/>
         <w:sz w:val="20"/>
       </w:rPr>
-      <w:t>Revision 2.9 — September 2026</w:t>
+      <w:t>Revision 3.0 — September 2026</w:t>
     </w:r>
     <w:r>
       <w:rPr>
@@ -25281,7 +25273,7 @@
         <w:color w:val="555555"/>
         <w:sz w:val="20"/>
       </w:rPr>
-      <w:t>Revision 2.9 — September 2026</w:t>
+      <w:t>Revision 3.0 — September 2026</w:t>
     </w:r>
   </w:p>
 </w:ftr>
@@ -25329,7 +25321,7 @@
         <w:color w:val="555555"/>
         <w:sz w:val="20"/>
       </w:rPr>
-      <w:t>Revision 2.9 — September 2026</w:t>
+      <w:t>Revision 3.0 — September 2026</w:t>
     </w:r>
     <w:r>
       <w:rPr>
@@ -25384,7 +25376,7 @@
         <w:color w:val="555555"/>
         <w:sz w:val="20"/>
       </w:rPr>
-      <w:t>Revision 2.9 — September 2026</w:t>
+      <w:t>Revision 3.0 — September 2026</w:t>
     </w:r>
     <w:r>
       <w:rPr>
@@ -25439,7 +25431,7 @@
         <w:color w:val="555555"/>
         <w:sz w:val="20"/>
       </w:rPr>
-      <w:t>Revision 2.9 — September 2026</w:t>
+      <w:t>Revision 3.0 — September 2026</w:t>
     </w:r>
     <w:r>
       <w:rPr>
@@ -25508,7 +25500,7 @@
         <w:color w:val="555555"/>
         <w:sz w:val="20"/>
       </w:rPr>
-      <w:t>Revision 2.9 — September 2026</w:t>
+      <w:t>Revision 3.0 — September 2026</w:t>
     </w:r>
     <w:r>
       <w:rPr>

</xml_diff>

<commit_message>
Zev-7 Operator Manual: rules uniformity (Zev-7S/Zev-7N 3.3.3, Metronome-S 1.2.3) - per-model rule capacities, SW1 rule wake, factory reset erases rules, Rules Enabled; RingClock & BitClock manual revision 10
</commit_message>
<xml_diff>
--- a/Zev-7 Operator Manual.docx
+++ b/Zev-7 Operator Manual.docx
@@ -4550,7 +4550,7 @@
                 <w:szCs w:val="22"/>
                 <w:lang w:val="en-US" w:eastAsia="en-US" w:bidi="ar-SA"/>
               </w:rPr>
-              <w:t>Wake the display when an active rule has dimmed or turned it off (Rules Timeout)</w:t>
+              <w:t>Wake the display when an active rule has dimmed or turned it off, or when the motion sensor has blanked it (Rules Timeout)</w:t>
             </w:r>
           </w:p>
         </w:tc>
@@ -5062,7 +5062,7 @@
           <w:rFonts w:ascii="Arial" w:hAnsi="Arial"/>
           <w:sz w:val="22"/>
         </w:rPr>
-        <w:t>Pressing SW1 temporarily cancels any active rule (for example, a rule that has dimmed or turned off the display overnight) and restores the standard display brightness, LED, and under-light settings. The wake lasts for the configured Rules Timeout (15 Seconds, 1 Minute, or 5 Minutes). When the timeout expires, the active rule re-applies.</w:t>
+        <w:t>On the Zev-7S, Zev-7 Mini, Zev-7-18, Zev-7RZ, Zev-7NS, Zev-7ND and Metronome-S, pressing SW1 while a rule is in effect (for example, a rule that has dimmed or turned off the display overnight) suspends the rules and restores the standard settings: display brightness, LEDs, under-light, colon neons and the 7th digit on the Zev-7 models; display brightness, LEDs, under-light, motion-sensor timeout, anti-poison, weather display and effect order on the Metronome-S. The wake lasts for the configured Rules Timeout (15 Seconds, 1 Minute, or 5 Minutes). When the timeout expires, the active rule re-applies. With no rule in effect, SW1 only wakes a display that the motion sensor has blanked for the same period (on the Nixie Zev-7 models it also stops a running anti-poison cycle); otherwise the click does nothing. On the original Zev-7 and the original Metronome, pressing SW1 always starts the wake: it cancels any active rule and restores the standard display brightness, LED, and under-light settings for the Rules Timeout.</w:t>
       </w:r>
     </w:p>
     <w:p>
@@ -8072,7 +8072,7 @@
           <w:rFonts w:ascii="Arial" w:hAnsi="Arial"/>
           <w:sz w:val="22"/>
         </w:rPr>
-        <w:t>How long the SW1 button-wake lasts when a rule has dimmed or turned the display off: 15 Seconds, 1 Minute, or 5 Minutes (default: 15 Seconds). When the timeout expires, the active rule re-applies.</w:t>
+        <w:t>How long the SW1 button-wake lasts when a rule has dimmed or turned the display off: 15 Seconds, 1 Minute, or 5 Minutes (default: 15 Seconds). When the timeout expires, the active rule re-applies. On the Zev-7S, Zev-7 Mini, Zev-7-18, Zev-7RZ, Zev-7NS, Zev-7ND and Metronome-S, the same period applies when SW1 wakes a display that the motion sensor has blanked (see Section 4).</w:t>
       </w:r>
     </w:p>
     <w:p>
@@ -12493,7 +12493,7 @@
           <w:rFonts w:ascii="Arial" w:hAnsi="Arial"/>
           <w:sz w:val="22"/>
         </w:rPr>
-        <w:t>Disable Rules toggle (temporarily ignores all rules without deleting them)</w:t>
+        <w:t>Rules Enabled switch (turn off to ignore all rules temporarily without deleting them)</w:t>
       </w:r>
     </w:p>
     <w:p>
@@ -12586,7 +12586,7 @@
           <w:rFonts w:ascii="Arial" w:hAnsi="Arial"/>
           <w:sz w:val="22"/>
         </w:rPr>
-        <w:t>Rules schedule different display, LED, under-light, and motion-sensor settings for specific times of day or days of the week. Up to 32 rules can be defined. Each rule specifies a time range and one or more overrides — for example, "turn the display off from 11:00 PM to 7:00 AM" or "set the LEDs to red at brightness 9 from 6:00 PM to 10:00 PM on weekdays."</w:t>
+        <w:t>Rules schedule different display, LED, under-light, and motion-sensor settings for specific times of day or days of the week. The number of rules depends on the model: up to 46 on the Zev-7S, Zev-7 Mini, Zev-7-18 and Zev-7RZ, 48 on the Zev-7NS and Zev-7ND, 56 on the Metronome-S, 25 on the original Zev-7, and 32 on the original Metronome. If a clock holds more rules than its limit (for example after a firmware update), only the rules at the top of the schedule are kept. Each rule specifies a time range and one or more overrides — for example, "turn the display off from 11:00 PM to 7:00 AM" or "set the LEDs to red at brightness 9 from 6:00 PM to 10:00 PM on weekdays."</w:t>
       </w:r>
     </w:p>
     <w:p>
@@ -12625,7 +12625,7 @@
           <w:rFonts w:ascii="Arial" w:hAnsi="Arial"/>
           <w:sz w:val="22"/>
         </w:rPr>
-        <w:t>The Disable Rules toggle on the Rule Editor page temporarily ignores all rules without deleting them. This is useful for making live adjustments without rules re-applying. The toggle does not persist across reboots and always defaults to Off (rules active) when the live page is opened.</w:t>
+        <w:t>The Rules Enabled switch on the Rule Editor page temporarily ignores all rules without deleting them. This is useful for making live adjustments without rules re-applying. The switch is not saved: it always returns to On (rules active) after a reboot. Changing a setting on the live form while a rule is in effect switches Rules Enabled off automatically, so the change is not undone at the next minute; adding, editing or deleting rules never does. On the Zev-7S, Zev-7 Mini, Zev-7-18, Zev-7RZ, Zev-7NS, Zev-7ND and Metronome-S, changing Rules Timeout, Firmware URL, Latitude or Longitude leaves the rules on. On the original Zev-7 and the original Metronome, changing Rules Timeout or Firmware URL switches them off like any other setting.</w:t>
       </w:r>
     </w:p>
     <w:p>
@@ -12638,7 +12638,7 @@
           <w:rFonts w:ascii="Arial" w:hAnsi="Arial"/>
           <w:sz w:val="22"/>
         </w:rPr>
-        <w:t>Rule Editor page. Tap Rule Editor on the live form home page to manage the rule list. Each rule is written as a short text expression and appears in the schedule table below the input field. Tap a row in the schedule to load that rule into the editor; tap Apply to save it. Tap Delete to remove the loaded rule.</w:t>
+        <w:t>Rule Editor page. Tap Rule Editor on the live form home page to manage the rule list. Each rule is written as a short text expression and appears in the schedule table below the input field. Tap a row in the schedule to load that rule into the editor; tap Apply to save it. Tap Delete to remove the loaded rule. Each change is confirmed with a message: Rule added, Rule updated or Rule deleted.</w:t>
       </w:r>
     </w:p>
     <w:p>
@@ -20866,7 +20866,7 @@
           <w:rFonts w:ascii="Arial" w:hAnsi="Arial"/>
           <w:sz w:val="22"/>
         </w:rPr>
-        <w:t>All WiFi credentials, display preferences, rules, and sensor settings are erased. The model code (which identifies the model) is preserved.</w:t>
+        <w:t>All WiFi credentials, display preferences, and sensor settings are erased. On the Zev-7S, Zev-7 Mini, Zev-7-18, Zev-7RZ, Zev-7NS, Zev-7ND and Metronome-S the rules are erased as well; the original Zev-7 and the original Metronome keep their rules. The model code (which identifies the model) and any Tube Healing selections are preserved.</w:t>
       </w:r>
     </w:p>
     <w:p>

</xml_diff>

<commit_message>
Zev-7 Operator Manual: static IAQ with calibration status in the second tube and lower-left neon, new CO2 Equivalent reading (Zev-7S/Zev-7N 3.4.1); InfoServer operator manual revision 13 (static IAQ, firmware 1.9.1)
</commit_message>
<xml_diff>
--- a/Zev-7 Operator Manual.docx
+++ b/Zev-7 Operator Manual.docx
@@ -1884,7 +1884,7 @@
         </w:sectPr>
       </w:pPr>
       <w:r>
-        <w:t>If an optional BME280, BME680, or BME688 sensor is installed, enable Temperature, Pressure, and Humidity on the Information page. Indoor Air Quality is also available with a BME680 or BME688.</w:t>
+        <w:t>If an optional BME280, BME680, or BME688 sensor is installed, enable Temperature, Pressure, and Humidity on the Information page. Indoor Air Quality and CO2 Equivalent are also available with a BME680 or BME688.</w:t>
       </w:r>
     </w:p>
     <w:p>
@@ -11159,7 +11159,7 @@
           <w:rFonts w:ascii="Arial" w:hAnsi="Arial"/>
           <w:sz w:val="22"/>
         </w:rPr>
-        <w:t>The original Zev-7 has no Frequency or Indoor Air Quality setting (its weather cycle runs every minute). The original Metronome has neither, and combines each reading’s on/off and units in one dropdown: Temperature (Off, Fahrenheit, Celsius, Kelvin), Pressure (Off, Inches of Mercury, Millibars) and Humidity (Off, On).</w:t>
+        <w:t>The original Zev-7 has no Frequency, Indoor Air Quality or CO2 Equivalent setting (its weather cycle runs every minute), and the Metronome-S has no CO2 Equivalent setting. The original Metronome has none of them, and combines each reading’s on/off and units in one dropdown: Temperature (Off, Fahrenheit, Celsius, Kelvin), Pressure (Off, Inches of Mercury, Millibars) and Humidity (Off, On).</w:t>
       </w:r>
     </w:p>
     <w:p>
@@ -13050,7 +13050,7 @@
           <w:rFonts w:ascii="Arial" w:hAnsi="Arial"/>
           <w:sz w:val="22"/>
         </w:rPr>
-        <w:t>Weather Display: Temperature, Temperature Units, Temperature Offset Degrees, Pressure, Pressure Units, Humidity, Indoor Air Quality (see Section 6 for the original models)</w:t>
+        <w:t>Weather Display: Temperature, Temperature Units, Temperature Offset Degrees, Pressure, Pressure Units, Humidity, Indoor Air Quality, CO2 Equivalent (see Section 6 for the original models and the Metronome-S)</w:t>
       </w:r>
     </w:p>
     <w:p>
@@ -19862,7 +19862,13 @@
     <w:p>
       <w:pPr/>
       <w:r>
-        <w:t>Indoor Air Quality: Bosch IAQ index from 0 to 500, shown as a whole number without a colon; available with BME680 or BME688.</w:t>
+        <w:t>Indoor Air Quality: Bosch static IAQ index from 0 to 500, shown as a whole number in the fourth to sixth tubes; available with BME680 or BME688. The second tube shows the calibration status (0–3, see Section 13), the third tube stays blank, and the lower-left neon is lit.</w:t>
+      </w:r>
+    </w:p>
+    <w:p>
+      <w:pPr/>
+      <w:r>
+        <w:t>CO2 Equivalent: estimated carbon dioxide in parts per million, shown as a whole number up to 9999 in the third to sixth tubes; available with BME680 or BME688. As with Indoor Air Quality, the second tube shows the calibration status and the lower-left neon is lit.</w:t>
       </w:r>
     </w:p>
     <w:p>
@@ -19887,7 +19893,7 @@
         </w:sectPr>
       </w:pPr>
       <w:r>
-        <w:t>The leftmost digit identifies each weather reading: 1 = temperature, 2 = pressure, 3 = humidity, and 4 = indoor air quality. The number is fixed for the reading, even when other readings are disabled. The second digit stays blank to separate the identifier from the value. Each item is held on the display briefly, then transitions to the next using the configured Display Transition (Fade, Scroll, Wave, or Spin Wave). The first info trigger after boot is suppressed so the clock has a chance to settle.</w:t>
+        <w:t>The leftmost digit identifies each weather reading: 1 = temperature, 2 = pressure, 3 = humidity, 4 = indoor air quality, and 5 = CO2 equivalent. The number is fixed for the reading, even when other readings are disabled. The second digit stays blank to separate the identifier from the value, except on the two air-quality readings, where it shows the calibration status. On the Metronome-S, Indoor Air Quality shows Bosch’s standard index with no calibration status, and there is no CO2 equivalent reading. Each item is held on the display briefly, then transitions to the next using the configured Display Transition (Fade, Scroll, Wave, or Spin Wave). The first info trigger after boot is suppressed so the clock has a chance to settle.</w:t>
       </w:r>
     </w:p>
     <w:p>
@@ -19963,7 +19969,7 @@
         <w:rPr/>
       </w:pPr>
       <w:r>
-        <w:t>Temperature, Pressure, Humidity, and Indoor Air Quality</w:t>
+        <w:t>Temperature, Pressure, Humidity, Indoor Air Quality, and CO2 Equivalent</w:t>
       </w:r>
     </w:p>
     <w:p>
@@ -19972,7 +19978,7 @@
         <w:rPr/>
       </w:pPr>
       <w:r>
-        <w:t>An optional BME280, BME680, or BME688 sensor supplies temperature, barometric pressure, and humidity for the weather display cycle. A temperature offset is available. With a BME680 or BME688, turn on Indoor Air Quality to add Bosch's IAQ index as a whole-number step after humidity; no colon or decimal point is lit for this reading.</w:t>
+        <w:t>An optional BME280, BME680, or BME688 sensor supplies temperature, barometric pressure, and humidity for the weather display cycle. A temperature offset is available. With a BME680 or BME688, turn on Indoor Air Quality to add Bosch’s IAQ index after humidity, and CO2 Equivalent to add an estimated CO₂ reading after that. Both show their calibration status in the second tube and light the lower-left neon (see Section 12).</w:t>
       </w:r>
     </w:p>
     <w:p>
@@ -19981,7 +19987,7 @@
         <w:rPr/>
       </w:pPr>
       <w:r>
-        <w:t>The clock detects the sensor at startup at I2C address 0x76 or 0x77 and labels it in the settings page. If multiple supported sensors are present, it uses the BME688 first. Weather settings are hidden when no supported sensor is found. The Indoor Air Quality toggle appears only with a BME680 or BME688.</w:t>
+        <w:t>The clock detects the sensor at startup at I2C address 0x76 or 0x77 and labels it in the settings page. If multiple supported sensors are present, it uses the BME688 first. Weather settings are hidden when no supported sensor is found. The Indoor Air Quality and CO2 Equivalent toggles appear only with a BME680 or BME688. The BME680 and BME688 give the same readings here.</w:t>
       </w:r>
     </w:p>
     <w:p>
@@ -19993,7 +19999,31 @@
         <w:t xml:space="preserve">Bosch IAQ index. </w:t>
       </w:r>
       <w:r>
-        <w:t>The 0–500 scale runs from clean to polluted air; lower is better. BSEC estimates it from the sensor's gas response and recent air history. It is not a direct CO₂ or particle reading, and it is not the outdoor EPA AQI. Early readings may change while the sensor calibrates.</w:t>
+        <w:t>The 0–500 scale runs from clean to polluted air; lower is better: 0–50 Excellent, 51–100 Good, 101–150 Lightly polluted, 151–200 Moderately polluted, 201–250 Heavily polluted, 251–350 Severely polluted, above 350 Extremely polluted. BSEC estimates it from the sensor’s gas response. The clock shows Bosch’s static index, the version intended for a device that stays in one place; Bosch’s standard index also rescales itself to recent readings, so a room that stays stuffy drifts back toward Good. It is not a direct CO₂ or particle reading, and it is not the outdoor EPA AQI.</w:t>
+      </w:r>
+    </w:p>
+    <w:p>
+      <w:pPr/>
+      <w:r>
+        <w:rPr>
+          <w:b/>
+        </w:rPr>
+        <w:t xml:space="preserve">CO2 equivalent. </w:t>
+      </w:r>
+      <w:r>
+        <w:t>BSEC infers it from the same gas reading; it is not measured. It follows real CO₂ reasonably well where people are the main source of airborne chemicals, and reads high around cleaning products, cooking, or solvents. As a guide, below about 1000 ppm is good, 1000–2000 is stuffy, and above 2000 is poor. A true CO₂ measurement needs a dedicated CO₂ sensor.</w:t>
+      </w:r>
+    </w:p>
+    <w:p>
+      <w:pPr/>
+      <w:r>
+        <w:rPr>
+          <w:b/>
+        </w:rPr>
+        <w:t xml:space="preserve">Calibration status. </w:t>
+      </w:r>
+      <w:r>
+        <w:t>The digit in the second tube shows how far the sensor has calibrated: 0 = stabilizing, 1 = low, 2 = medium, 3 = calibrated. At 0 the reading is a placeholder and should be ignored. The status rises within minutes of power-on and reaches 3 after hours to days in normal room air. Calibration is saved every few hours and survives restarts.</w:t>
       </w:r>
     </w:p>
     <w:tbl>

</xml_diff>

<commit_message>
Zev-7 Operator Manual: Metronome-S 1.3.1 air quality - CO2 Equivalent, weather identifier in the leftmost tube, calibration status in the third tube
</commit_message>
<xml_diff>
--- a/Zev-7 Operator Manual.docx
+++ b/Zev-7 Operator Manual.docx
@@ -11159,7 +11159,7 @@
           <w:rFonts w:ascii="Arial" w:hAnsi="Arial"/>
           <w:sz w:val="22"/>
         </w:rPr>
-        <w:t>The original Zev-7 has no Frequency, Indoor Air Quality or CO2 Equivalent setting (its weather cycle runs every minute), and the Metronome-S has no CO2 Equivalent setting. The original Metronome has none of them, and combines each reading’s on/off and units in one dropdown: Temperature (Off, Fahrenheit, Celsius, Kelvin), Pressure (Off, Inches of Mercury, Millibars) and Humidity (Off, On).</w:t>
+        <w:t>The original Zev-7 has no Frequency, Indoor Air Quality or CO2 Equivalent setting (its weather cycle runs every minute). The original Metronome has none of them, and combines each reading’s on/off and units in one dropdown: Temperature (Off, Fahrenheit, Celsius, Kelvin), Pressure (Off, Inches of Mercury, Millibars) and Humidity (Off, On).</w:t>
       </w:r>
     </w:p>
     <w:p>
@@ -13050,7 +13050,7 @@
           <w:rFonts w:ascii="Arial" w:hAnsi="Arial"/>
           <w:sz w:val="22"/>
         </w:rPr>
-        <w:t>Weather Display: Temperature, Temperature Units, Temperature Offset Degrees, Pressure, Pressure Units, Humidity, Indoor Air Quality, CO2 Equivalent (see Section 6 for the original models and the Metronome-S)</w:t>
+        <w:t>Weather Display: Temperature, Temperature Units, Temperature Offset Degrees, Pressure, Pressure Units, Humidity, Indoor Air Quality, CO2 Equivalent (see Section 6 for the original models)</w:t>
       </w:r>
     </w:p>
     <w:p>
@@ -19893,7 +19893,7 @@
         </w:sectPr>
       </w:pPr>
       <w:r>
-        <w:t>The leftmost digit identifies each weather reading: 1 = temperature, 2 = pressure, 3 = humidity, 4 = indoor air quality, and 5 = CO2 equivalent. The number is fixed for the reading, even when other readings are disabled. The second digit stays blank to separate the identifier from the value, except on the two air-quality readings, where it shows the calibration status. On the Metronome-S, Indoor Air Quality shows Bosch’s standard index with no calibration status, and there is no CO2 equivalent reading. Each item is held on the display briefly, then transitions to the next using the configured Display Transition (Fade, Scroll, Wave, or Spin Wave). The first info trigger after boot is suppressed so the clock has a chance to settle.</w:t>
+        <w:t>The leftmost digit identifies each weather reading: 1 = temperature, 2 = pressure, 3 = humidity, 4 = indoor air quality, and 5 = CO2 equivalent. The number is fixed for the reading, even when other readings are disabled. The second digit stays blank to separate the identifier from the value, except on the two air-quality readings, where it shows the calibration status. On the Metronome-S the identifier is also in the leftmost tube, the calibration status is in the third tube, and the value is in the sixth to ninth tubes; it has no neons, so no indicator is lit. Each item is held on the display briefly, then transitions to the next using the configured Display Transition (Fade, Scroll, Wave, or Spin Wave). The first info trigger after boot is suppressed so the clock has a chance to settle.</w:t>
       </w:r>
     </w:p>
     <w:p>

</xml_diff>

<commit_message>
Zev-7 Operator Manual: br/brightness on every model (original Zev-7 2.4.5, original Metronome 2.2.11); nb notes removed
</commit_message>
<xml_diff>
--- a/Zev-7 Operator Manual.docx
+++ b/Zev-7 Operator Manual.docx
@@ -13474,7 +13474,7 @@
           <w:rFonts w:ascii="Arial" w:hAnsi="Arial"/>
           <w:sz w:val="22"/>
         </w:rPr>
-        <w:t>Keyword names by model. The Zev-7S, Zev-7 Mini, Zev-7-18, Zev-7RZ, Zev-7NS, Zev-7ND and Metronome-S write display brightness as br / brightness and the indoor sensor readings as it, ip and ih. The original Zev-7 and the original Metronome keep nb / nixiebrightness for brightness, and the original Zev-7 keeps tp, pr and hu for the sensor readings (the original Metronome has no sensor keywords). Each clock accepts only its own names. The examples below use br; on the original Zev-7 and original Metronome, write nb in its place. These names arrived with Zev-7S, Zev-7 Mini, Zev-7-18 and Zev-7RZ firmware 3.4, Zev-7NS and Zev-7ND firmware 3.4 and Metronome-S firmware 1.3; rules saved under the old names are not carried over, so after updating to that firmware perform a factory reset (Section 17) and re-enter the settings and rules.</w:t>
+        <w:t>Keyword names by model. Every model writes display brightness as br / brightness. The Zev-7S, Zev-7 Mini, Zev-7-18, Zev-7RZ, Zev-7NS, Zev-7ND and Metronome-S write the indoor sensor readings as it, ip and ih; the original Zev-7 keeps tp, pr and hu (the original Metronome has no sensor keywords). Each clock accepts only its own names. These names arrived with Zev-7S, Zev-7 Mini, Zev-7-18 and Zev-7RZ firmware 3.4, Zev-7NS and Zev-7ND firmware 3.4 and Metronome-S firmware 1.3; rules saved under the old names are not carried over, so after updating to that firmware perform a factory reset (Section 17) and re-enter the settings and rules.</w:t>
       </w:r>
     </w:p>
     <w:tbl>
@@ -13692,7 +13692,7 @@
                 <w:szCs w:val="22"/>
                 <w:lang w:val="en-US" w:eastAsia="en-US" w:bidi="ar-SA"/>
               </w:rPr>
-              <w:t>Display brightness (0-9, 0 = display off): the Nixie tubes, or the numitron filaments on the Zev-7NS and Zev-7ND. The alternate form bri is also accepted. On the original Zev-7 and the original Metronome this keyword is nb / nixiebrightness.</w:t>
+              <w:t>Display brightness (0-9, 0 = display off): the Nixie tubes, or the numitron filaments on the Zev-7NS and Zev-7ND. The alternate form bri is also accepted.</w:t>
             </w:r>
           </w:p>
         </w:tc>
@@ -14619,7 +14619,7 @@
                 <w:szCs w:val="22"/>
                 <w:lang w:val="en-US" w:eastAsia="en-US" w:bidi="ar-SA"/>
               </w:rPr>
-              <w:t>Bare keyword (no = value). Shortcut that expands to br=0, lb=0, ub=0 (nb=0 on the original Zev-7 and Metronome) (everything off: Nixie tubes, digit LEDs, and under-light). On the Zev-7ND, ub is accepted but has no effect.</w:t>
+              <w:t>Bare keyword (no = value). Shortcut that expands to br=0, lb=0, ub=0 (everything off: Nixie tubes, digit LEDs, and under-light). On the Zev-7ND, ub is accepted but has no effect.</w:t>
             </w:r>
           </w:p>
         </w:tc>
@@ -14709,7 +14709,7 @@
                 <w:rFonts w:ascii="Arial" w:hAnsi="Arial"/>
                 <w:sz w:val="20"/>
               </w:rPr>
-              <w:t>On any numeric field, off may be typed in place of 0 — for example br=off, lb=off, ub=off, or heal=off. This is separate from the bare off shortcut above, which sets br (nb), lb, and ub together.</w:t>
+              <w:t>On any numeric field, off may be typed in place of 0 — for example br=off, lb=off, ub=off, or heal=off. This is separate from the bare off shortcut above, which sets br, lb, and ub together.</w:t>
             </w:r>
           </w:p>
         </w:tc>

</xml_diff>

<commit_message>
Zev-7 Operator Manual version 3.1 (Oct 2026): InfoServer weather readings and source lines, lower-left neon on every weather reading, CO2 Equivalent row in the setup table; Version/Page N of M footers with continuous numbering (RingClock 2.0 scheme); original Zev-7 and original Metronome removed; model lists dropped where every model has the feature; Quick Start factory-reset step; boot network budget three minutes on every model
</commit_message>
<xml_diff>
--- a/Zev-7 Operator Manual.docx
+++ b/Zev-7 Operator Manual.docx
@@ -116,7 +116,7 @@
           <w:color w:val="000000"/>
           <w:sz w:val="24"/>
         </w:rPr>
-        <w:t>September 2026</w:t>
+        <w:t>October 2026</w:t>
       </w:r>
     </w:p>
     <w:p>
@@ -134,7 +134,7 @@
           <w:color w:val="000000"/>
           <w:sz w:val="22"/>
         </w:rPr>
-        <w:t>This manual describes the installation, configuration, and day-to-day operation of the Zev-7 and Metronome clocks. It covers the fifteen-tube Metronome and Metronome-S, and the Nixie-tube models (Zev-7, Zev-7 Mini, Zev-7-18, Zev-7RZ, Metronome) and the numitron-tube models (Zev-7NS, Zev-7ND). Throughout this manual all models are referred to as Zev-7, and "Nixie" refers to the time display in general; see Section 2 for how the numitron models differ.</w:t>
+        <w:t>This manual describes the installation, configuration, and day-to-day operation of the Zev-7 and Metronome clocks. It covers the Nixie-tube models (Zev-7S, Zev-7 Mini, Zev-7-18, Zev-7RZ), the fifteen-tube Metronome-S, and the numitron-tube models (Zev-7NS, Zev-7ND). Throughout this manual all models are referred to as Zev-7, and "Nixie" refers to the time display in general; see Section 2 for how the numitron models differ.</w:t>
       </w:r>
     </w:p>
     <w:p>
@@ -267,13 +267,14 @@
           <w:sz w:val="22"/>
         </w:rPr>
         <w:t>Quick Start</w:t>
+        <w:tab/>
+        <w:t>3</w:t>
       </w:r>
       <w:r>
         <w:rPr>
           <w:rFonts w:ascii="Arial" w:hAnsi="Arial"/>
           <w:sz w:val="22"/>
         </w:rPr>
-        <w:tab/>
       </w:r>
       <w:r>
         <w:rPr>
@@ -281,7 +282,6 @@
           <w:color w:val="000000"/>
           <w:sz w:val="22"/>
         </w:rPr>
-        <w:t>QS-1</w:t>
       </w:r>
     </w:p>
     <w:p>
@@ -301,13 +301,14 @@
           <w:sz w:val="22"/>
         </w:rPr>
         <w:t>1. Overview</w:t>
+        <w:tab/>
+        <w:t>6</w:t>
       </w:r>
       <w:r>
         <w:rPr>
           <w:rFonts w:ascii="Arial" w:hAnsi="Arial"/>
           <w:sz w:val="22"/>
         </w:rPr>
-        <w:tab/>
       </w:r>
       <w:r>
         <w:rPr>
@@ -315,7 +316,6 @@
           <w:color w:val="000000"/>
           <w:sz w:val="22"/>
         </w:rPr>
-        <w:t>1-1</w:t>
       </w:r>
     </w:p>
     <w:p>
@@ -335,13 +335,14 @@
           <w:sz w:val="22"/>
         </w:rPr>
         <w:t>2. Models</w:t>
+        <w:tab/>
+        <w:t>7</w:t>
       </w:r>
       <w:r>
         <w:rPr>
           <w:rFonts w:ascii="Arial" w:hAnsi="Arial"/>
           <w:sz w:val="22"/>
         </w:rPr>
-        <w:tab/>
       </w:r>
       <w:r>
         <w:rPr>
@@ -349,7 +350,6 @@
           <w:color w:val="000000"/>
           <w:sz w:val="22"/>
         </w:rPr>
-        <w:t>2-1</w:t>
       </w:r>
     </w:p>
     <w:p>
@@ -369,13 +369,14 @@
           <w:sz w:val="22"/>
         </w:rPr>
         <w:t>3. Display</w:t>
+        <w:tab/>
+        <w:t>9</w:t>
       </w:r>
       <w:r>
         <w:rPr>
           <w:rFonts w:ascii="Arial" w:hAnsi="Arial"/>
           <w:sz w:val="22"/>
         </w:rPr>
-        <w:tab/>
       </w:r>
       <w:r>
         <w:rPr>
@@ -383,7 +384,6 @@
           <w:color w:val="000000"/>
           <w:sz w:val="22"/>
         </w:rPr>
-        <w:t>3-1</w:t>
       </w:r>
     </w:p>
     <w:p>
@@ -403,13 +403,14 @@
           <w:sz w:val="22"/>
         </w:rPr>
         <w:t>4. Buttons</w:t>
+        <w:tab/>
+        <w:t>10</w:t>
       </w:r>
       <w:r>
         <w:rPr>
           <w:rFonts w:ascii="Arial" w:hAnsi="Arial"/>
           <w:sz w:val="22"/>
         </w:rPr>
-        <w:tab/>
       </w:r>
       <w:r>
         <w:rPr>
@@ -417,7 +418,6 @@
           <w:color w:val="000000"/>
           <w:sz w:val="22"/>
         </w:rPr>
-        <w:t>4-1</w:t>
       </w:r>
     </w:p>
     <w:p>
@@ -437,13 +437,14 @@
           <w:sz w:val="22"/>
         </w:rPr>
         <w:t>5. Power-On Functions</w:t>
+        <w:tab/>
+        <w:t>11</w:t>
       </w:r>
       <w:r>
         <w:rPr>
           <w:rFonts w:ascii="Arial" w:hAnsi="Arial"/>
           <w:sz w:val="22"/>
         </w:rPr>
-        <w:tab/>
       </w:r>
       <w:r>
         <w:rPr>
@@ -451,7 +452,6 @@
           <w:color w:val="000000"/>
           <w:sz w:val="22"/>
         </w:rPr>
-        <w:t>5-1</w:t>
       </w:r>
     </w:p>
     <w:p>
@@ -471,13 +471,14 @@
           <w:sz w:val="22"/>
         </w:rPr>
         <w:t>6. AP Configuration Mode</w:t>
+        <w:tab/>
+        <w:t>12</w:t>
       </w:r>
       <w:r>
         <w:rPr>
           <w:rFonts w:ascii="Arial" w:hAnsi="Arial"/>
           <w:sz w:val="22"/>
         </w:rPr>
-        <w:tab/>
       </w:r>
       <w:r>
         <w:rPr>
@@ -485,7 +486,6 @@
           <w:color w:val="000000"/>
           <w:sz w:val="22"/>
         </w:rPr>
-        <w:t>6-1</w:t>
       </w:r>
     </w:p>
     <w:p>
@@ -505,13 +505,14 @@
           <w:sz w:val="22"/>
         </w:rPr>
         <w:t>7. Live Settings Web Interface</w:t>
+        <w:tab/>
+        <w:t>17</w:t>
       </w:r>
       <w:r>
         <w:rPr>
           <w:rFonts w:ascii="Arial" w:hAnsi="Arial"/>
           <w:sz w:val="22"/>
         </w:rPr>
-        <w:tab/>
       </w:r>
       <w:r>
         <w:rPr>
@@ -519,7 +520,6 @@
           <w:color w:val="000000"/>
           <w:sz w:val="22"/>
         </w:rPr>
-        <w:t>7-1</w:t>
       </w:r>
     </w:p>
     <w:p>
@@ -540,7 +540,7 @@
         </w:rPr>
         <w:t>8. Rules</w:t>
         <w:tab/>
-        <w:t>8-1</w:t>
+        <w:t>19</w:t>
       </w:r>
       <w:r>
         <w:rPr>
@@ -573,13 +573,14 @@
           <w:sz w:val="22"/>
         </w:rPr>
         <w:t>9. LED Effects</w:t>
+        <w:tab/>
+        <w:t>26</w:t>
       </w:r>
       <w:r>
         <w:rPr>
           <w:rFonts w:ascii="Arial" w:hAnsi="Arial"/>
           <w:sz w:val="22"/>
         </w:rPr>
-        <w:tab/>
       </w:r>
       <w:r>
         <w:rPr>
@@ -587,7 +588,6 @@
           <w:color w:val="000000"/>
           <w:sz w:val="22"/>
         </w:rPr>
-        <w:t>9-1</w:t>
       </w:r>
     </w:p>
     <w:p>
@@ -607,13 +607,14 @@
           <w:sz w:val="22"/>
         </w:rPr>
         <w:t>10. Digit Change Effects</w:t>
+        <w:tab/>
+        <w:t>27</w:t>
       </w:r>
       <w:r>
         <w:rPr>
           <w:rFonts w:ascii="Arial" w:hAnsi="Arial"/>
           <w:sz w:val="22"/>
         </w:rPr>
-        <w:tab/>
       </w:r>
       <w:r>
         <w:rPr>
@@ -621,7 +622,6 @@
           <w:color w:val="000000"/>
           <w:sz w:val="22"/>
         </w:rPr>
-        <w:t>10-1</w:t>
       </w:r>
     </w:p>
     <w:p>
@@ -641,13 +641,14 @@
           <w:sz w:val="22"/>
         </w:rPr>
         <w:t>11. Neon (Colon) Display Modes</w:t>
+        <w:tab/>
+        <w:t>29</w:t>
       </w:r>
       <w:r>
         <w:rPr>
           <w:rFonts w:ascii="Arial" w:hAnsi="Arial"/>
           <w:sz w:val="22"/>
         </w:rPr>
-        <w:tab/>
       </w:r>
       <w:r>
         <w:rPr>
@@ -655,7 +656,6 @@
           <w:color w:val="000000"/>
           <w:sz w:val="22"/>
         </w:rPr>
-        <w:t>11-1</w:t>
       </w:r>
     </w:p>
     <w:p>
@@ -675,13 +675,14 @@
           <w:sz w:val="22"/>
         </w:rPr>
         <w:t>12. Info Display Cycle</w:t>
+        <w:tab/>
+        <w:t>30</w:t>
       </w:r>
       <w:r>
         <w:rPr>
           <w:rFonts w:ascii="Arial" w:hAnsi="Arial"/>
           <w:sz w:val="22"/>
         </w:rPr>
-        <w:tab/>
       </w:r>
       <w:r>
         <w:rPr>
@@ -689,7 +690,6 @@
           <w:color w:val="000000"/>
           <w:sz w:val="22"/>
         </w:rPr>
-        <w:t>12-1</w:t>
       </w:r>
     </w:p>
     <w:p>
@@ -709,13 +709,14 @@
           <w:sz w:val="22"/>
         </w:rPr>
         <w:t>13. Sensors</w:t>
+        <w:tab/>
+        <w:t>31</w:t>
       </w:r>
       <w:r>
         <w:rPr>
           <w:rFonts w:ascii="Arial" w:hAnsi="Arial"/>
           <w:sz w:val="22"/>
         </w:rPr>
-        <w:tab/>
       </w:r>
       <w:r>
         <w:rPr>
@@ -723,7 +724,6 @@
           <w:color w:val="000000"/>
           <w:sz w:val="22"/>
         </w:rPr>
-        <w:t>13-1</w:t>
       </w:r>
     </w:p>
     <w:p>
@@ -743,13 +743,14 @@
           <w:sz w:val="22"/>
         </w:rPr>
         <w:t>14. Cathode Anti-Poisoning</w:t>
+        <w:tab/>
+        <w:t>34</w:t>
       </w:r>
       <w:r>
         <w:rPr>
           <w:rFonts w:ascii="Arial" w:hAnsi="Arial"/>
           <w:sz w:val="22"/>
         </w:rPr>
-        <w:tab/>
       </w:r>
       <w:r>
         <w:rPr>
@@ -757,7 +758,6 @@
           <w:color w:val="000000"/>
           <w:sz w:val="22"/>
         </w:rPr>
-        <w:t>14-1</w:t>
       </w:r>
     </w:p>
     <w:p>
@@ -778,7 +778,7 @@
         </w:rPr>
         <w:t>15. Tube Healing</w:t>
         <w:tab/>
-        <w:t>15-1</w:t>
+        <w:t>36</w:t>
       </w:r>
       <w:r>
         <w:rPr>
@@ -812,7 +812,7 @@
         </w:rPr>
         <w:t>16. OTA Firmware Update</w:t>
         <w:tab/>
-        <w:t>16-1</w:t>
+        <w:t>37</w:t>
       </w:r>
       <w:r>
         <w:rPr>
@@ -846,7 +846,7 @@
         </w:rPr>
         <w:t>17. Factory Reset</w:t>
         <w:tab/>
-        <w:t>17-1</w:t>
+        <w:t>39</w:t>
       </w:r>
       <w:r>
         <w:rPr>
@@ -880,7 +880,7 @@
         </w:rPr>
         <w:t>18. REST Programming</w:t>
         <w:tab/>
-        <w:t>18-1</w:t>
+        <w:t>40</w:t>
       </w:r>
       <w:r>
         <w:rPr>
@@ -915,7 +915,6 @@
           <w:type w:val="nextPage"/>
           <w:pgSz w:w="12240" w:h="15840"/>
           <w:pgMar w:left="1417" w:right="1417" w:gutter="0" w:header="720" w:top="1134" w:footer="720" w:bottom="1134"/>
-          <w:pgNumType w:start="1" w:fmt="lowerRoman"/>
           <w:formProt w:val="false"/>
           <w:textDirection w:val="lrTb"/>
           <w:docGrid w:type="default" w:linePitch="360" w:charSpace="0"/>
@@ -929,7 +928,7 @@
         </w:rPr>
         <w:t>19. Troubleshooting</w:t>
         <w:tab/>
-        <w:t>19-1</w:t>
+        <w:t>42</w:t>
       </w:r>
       <w:r>
         <w:rPr>
@@ -1193,7 +1192,20 @@
           <w:rFonts w:ascii="Arial" w:hAnsi="Arial"/>
           <w:sz w:val="22"/>
         </w:rPr>
-        <w:t>With the AP-mode bouncing tube visible, from a phone or computer, open the WiFi settings and connect to the network named for the model — Zev-7S, Zev-7M (Mini), Zev-7-18, Zev-7RZ, Zev-7NS or Zev-7ND (numitron), Metronome or Metronome-S. No password is required.</w:t>
+        <w:t>With the AP-mode bouncing tube visible, from a phone or computer, open the WiFi settings and connect to the network named for the model — Zev-7S, Zev-7M (Mini), Zev-7-18, Zev-7RZ, Zev-7NS, Zev-7ND (numitron) or Metronome-S. No password is required.</w:t>
+      </w:r>
+    </w:p>
+    <w:p>
+      <w:pPr>
+        <w:pStyle w:val="Normal"/>
+        <w:rPr/>
+      </w:pPr>
+      <w:r>
+        <w:rPr>
+          <w:rFonts w:ascii="Arial" w:hAnsi="Arial"/>
+          <w:sz w:val="22"/>
+        </w:rPr>
+        <w:t>If the bouncing tube does not appear, return the clock to its factory settings: remove power, press and hold both SW1 and SW2, and apply power while holding them. Keep holding until the display clears (about 5 seconds), then release. The clock restarts with the bouncing tube in AP configuration mode. This erases all saved settings (see Section 17).</w:t>
       </w:r>
     </w:p>
     <w:p>
@@ -1319,7 +1331,7 @@
           <w:rFonts w:ascii="Arial" w:hAnsi="Arial"/>
           <w:sz w:val="22"/>
         </w:rPr>
-        <w:t>If the WiFi connection and NTP sync have not both completed within about two minutes (about three minutes on the Zev-7S, Zev-7 Mini, Zev-7-18 and Zev-7RZ), the clock reboots and tries again. After three failed boots in a row (for example a wrong WiFi password or a renamed network), the next boot starts AP mode instead, so the WiFi settings can be corrected at 192.168.4.1. Because of the time allowed for each attempt, this takes several minutes. This forced AP mode lasts for that one boot only: correct the settings and tap Start to save them and reboot into normal operation. Tapping Save without Start stores the settings but does not keep the clock in AP mode; the next power-cycle tries the saved network again. If the network was only temporarily down (router rebooting, internet outage), power-cycling the clock returns it to normal operation.</w:t>
+        <w:t>If the WiFi connection and NTP sync have not both completed within about three minutes, the clock reboots and tries again. After three failed boots in a row (for example a wrong WiFi password or a renamed network), the next boot starts AP mode instead, so the WiFi settings can be corrected at 192.168.4.1. Because of the time allowed for each attempt, this takes several minutes. This forced AP mode lasts for that one boot only: correct the settings and tap Start to save them and reboot into normal operation. Tapping Save without Start stores the settings but does not keep the clock in AP mode; the next power-cycle tries the saved network again. If the network was only temporarily down (router rebooting, internet outage), power-cycling the clock returns it to normal operation.</w:t>
       </w:r>
     </w:p>
     <w:p>
@@ -1877,14 +1889,13 @@
           <w:type w:val="nextPage"/>
           <w:pgSz w:w="12240" w:h="15840"/>
           <w:pgMar w:left="1417" w:right="1417" w:gutter="0" w:header="720" w:top="1134" w:footer="720" w:bottom="1134"/>
-          <w:pgNumType w:start="1" w:fmt="decimal"/>
           <w:formProt w:val="false"/>
           <w:textDirection w:val="lrTb"/>
           <w:docGrid w:type="default" w:linePitch="360" w:charSpace="0"/>
         </w:sectPr>
       </w:pPr>
       <w:r>
-        <w:t>If an optional BME280 or BME68x sensor is installed, enable Temperature, Pressure, and Humidity on the Information page. Indoor Air Quality and CO2 Equivalent are also available with a BME68x.</w:t>
+        <w:t>If an optional BME280 or BME68x sensor is installed, enable Temperature, Pressure, and Humidity on the Information page. Indoor Air Quality and CO2 Equivalent are also available with a BME68x. Any reading the clock's own sensor can't take comes from an InfoServer on the same network (see Section 13).</w:t>
       </w:r>
     </w:p>
     <w:p>
@@ -1972,7 +1983,7 @@
           <w:rFonts w:ascii="Arial" w:hAnsi="Arial"/>
           <w:sz w:val="22"/>
         </w:rPr>
-        <w:t>Zev-7 is a seven-tube Nixie clock and the Metronome is its fifteen-tube companion. The Metronome comes in two forms: the original and the Metronome-S, which uses a newer processor and carries the full feature set described in this manual. Both are driven by an ESP32 microcontroller and present the same web interface.</w:t>
+        <w:t>Zev-7 is a seven-tube Nixie clock and the Metronome-S is its fifteen-tube companion. Both are driven by an ESP32 microcontroller and present the same web interface.</w:t>
       </w:r>
     </w:p>
     <w:p>
@@ -2006,7 +2017,6 @@
           <w:type w:val="nextPage"/>
           <w:pgSz w:w="12240" w:h="15840"/>
           <w:pgMar w:left="1417" w:right="1417" w:gutter="0" w:header="720" w:top="1134" w:footer="720" w:bottom="1134"/>
-          <w:pgNumType w:start="1" w:fmt="decimal"/>
           <w:formProt w:val="false"/>
           <w:textDirection w:val="lrTb"/>
           <w:docGrid w:type="default" w:linePitch="360" w:charSpace="0"/>
@@ -2092,7 +2102,7 @@
           <w:rFonts w:ascii="Arial" w:hAnsi="Arial"/>
           <w:sz w:val="22"/>
         </w:rPr>
-        <w:t>Several models are covered by this manual. The model is set at the factory and cannot be changed by the user. The Zev-7S, Zev-7 Mini, Zev-7-18 and Zev-7RZ are Nixie-tube clocks and share one firmware; the Zev-7NS and Zev-7ND are the equivalent numitron-tube clocks and run their own; the Metronome and Metronome-S are the fifteen-tube clocks and run a third and a fourth. All are operationally similar, differing where the display hardware and its capabilities differ.</w:t>
+        <w:t>Several models are covered by this manual. The model is set at the factory and cannot be changed by the user. The Zev-7S, Zev-7 Mini, Zev-7-18 and Zev-7RZ are Nixie-tube clocks and share one firmware; the Zev-7NS and Zev-7ND are the equivalent numitron-tube clocks and run their own; the Metronome-S is the fifteen-tube clock and runs a third. All are operationally similar, differing where the display hardware and its capabilities differ.</w:t>
       </w:r>
       <w:r>
         <w:rPr>
@@ -2225,13 +2235,13 @@
         <w:pStyle w:val="Heading2"/>
       </w:pPr>
       <w:r>
-        <w:t>Metronome Variants (Metronome and Metronome-S)</w:t>
+        <w:t>Metronome-S</w:t>
       </w:r>
     </w:p>
     <w:p>
       <w:pPr/>
       <w:r>
-        <w:t>Both Metronomes have fifteen Nixie tubes and the same display layout (Section 3). They run separate firmware, and the Metronome-S is the more capable of the two:</w:t>
+        <w:t>The Metronome-S has fifteen Nixie tubes (Section 3) and carries every feature in this manual: Tube Healing (Section 15), dark and sunrise/sunset rules (Section 8), a six-lamp under-light, a fixed (static) IP address, and the health readout on SW1.</w:t>
       </w:r>
     </w:p>
     <w:p>
@@ -2239,23 +2249,7 @@
         <w:pStyle w:val="ListBullet"/>
       </w:pPr>
       <w:r>
-        <w:t>Metronome-S — carries every feature in this manual: Tube Healing (Section 15), dark and sunrise/sunset rules (Section 8), a six-lamp under-light, a fixed (static) IP address, and the health readout on SW1.</w:t>
-      </w:r>
-    </w:p>
-    <w:p>
-      <w:pPr>
-        <w:pStyle w:val="ListBullet"/>
-      </w:pPr>
-      <w:r>
-        <w:t>Metronome — the original fifteen-tube clock. It has no under-light and no Tube Healing, its rules do not offer the dark condition or sunrise and sunset anchors, and it has no fixed-IP setting. Everything else in this manual applies.</w:t>
-      </w:r>
-    </w:p>
-    <w:p>
-      <w:pPr>
-        <w:pStyle w:val="ListBullet"/>
-      </w:pPr>
-      <w:r>
-        <w:t>No colon lamps. Neither Metronome has the neon colon separators fitted to the Zev-7, so Section 11 does not apply to them. A single decimal point on NX8 is used by the clock itself to mark the temperature sign and the pressure and humidity readings.</w:t>
+        <w:t>No colon lamps. The Metronome-S has none of the neon colon separators fitted to the Zev-7, so Section 11 does not apply to it. A single decimal point on NX8 is used by the clock itself to mark the temperature sign and the pressure and humidity readings.</w:t>
       </w:r>
     </w:p>
     <w:p>
@@ -2336,7 +2330,6 @@
           <w:type w:val="nextPage"/>
           <w:pgSz w:w="12240" w:h="15840"/>
           <w:pgMar w:left="1417" w:right="1417" w:gutter="0" w:header="720" w:top="1134" w:footer="720" w:bottom="1134"/>
-          <w:pgNumType w:start="1" w:fmt="decimal"/>
           <w:formProt w:val="false"/>
           <w:textDirection w:val="lrTb"/>
           <w:docGrid w:type="default" w:linePitch="360" w:charSpace="0"/>
@@ -2405,7 +2398,7 @@
           <w:rFonts w:ascii="Arial" w:hAnsi="Arial"/>
           <w:sz w:val="22"/>
         </w:rPr>
-        <w:t>The Zev-7 has seven Nixie tubes; the Metronome and Metronome-S have fifteen. The Zev-7 models also have a set of neon indicator lamps, which the Metronome models do not:</w:t>
+        <w:t>The Zev-7 has seven Nixie tubes; the Metronome-S has fifteen. The Zev-7 models also have a set of neon indicator lamps, which the Metronome-S does not:</w:t>
       </w:r>
       <w:r>
         <w:rPr>
@@ -4292,7 +4285,6 @@
           <w:type w:val="nextPage"/>
           <w:pgSz w:w="12240" w:h="15840"/>
           <w:pgMar w:left="1417" w:right="1417" w:gutter="0" w:header="720" w:top="1134" w:footer="720" w:bottom="1134"/>
-          <w:pgNumType w:start="1" w:fmt="decimal"/>
           <w:formProt w:val="false"/>
           <w:textDirection w:val="lrTb"/>
           <w:docGrid w:type="default" w:linePitch="360" w:charSpace="0"/>
@@ -5051,7 +5043,6 @@
           <w:type w:val="nextPage"/>
           <w:pgSz w:w="12240" w:h="15840"/>
           <w:pgMar w:left="1417" w:right="1417" w:gutter="0" w:header="720" w:top="1134" w:footer="720" w:bottom="1134"/>
-          <w:pgNumType w:start="1" w:fmt="decimal"/>
           <w:formProt w:val="false"/>
           <w:textDirection w:val="lrTb"/>
           <w:docGrid w:type="default" w:linePitch="360" w:charSpace="0"/>
@@ -5062,7 +5053,7 @@
           <w:rFonts w:ascii="Arial" w:hAnsi="Arial"/>
           <w:sz w:val="22"/>
         </w:rPr>
-        <w:t>On the Zev-7S, Zev-7 Mini, Zev-7-18, Zev-7RZ, Zev-7NS, Zev-7ND and Metronome-S, pressing SW1 while a rule is in effect (for example, a rule that has dimmed or turned off the display overnight) suspends the rules and restores the standard settings: display brightness, LEDs, under-light, colon neons and the 7th digit on the Zev-7 models; display brightness, LEDs, under-light, motion-sensor timeout, anti-poison, weather display and effect order on the Metronome-S. The wake lasts for the configured Rules Timeout (15 Seconds, 1 Minute, or 5 Minutes). When the timeout expires, the active rule re-applies. With no rule in effect, SW1 only wakes a display that the motion sensor has blanked for the same period (on the Nixie Zev-7 models it also stops a running anti-poison cycle); otherwise the click does nothing. On the original Zev-7 and the original Metronome, pressing SW1 always starts the wake: it cancels any active rule and restores the standard display brightness, LED, and under-light settings for the Rules Timeout.</w:t>
+        <w:t>Pressing SW1 while a rule is in effect (for example, a rule that has dimmed or turned off the display overnight) suspends the rules and restores the standard settings: display brightness, LEDs, under-light, colon neons and the 7th digit on the Zev-7 models; display brightness, LEDs, under-light, motion-sensor timeout, anti-poison, weather display and effect order on the Metronome-S. The wake lasts for the configured Rules Timeout (15 Seconds, 1 Minute, or 5 Minutes). When the timeout expires, the active rule re-applies. With no rule in effect, SW1 only wakes a display that the motion sensor has blanked for the same period (on the Nixie Zev-7 models it also stops a running anti-poison cycle); otherwise the click does nothing.</w:t>
       </w:r>
     </w:p>
     <w:p>
@@ -5448,7 +5439,6 @@
           <w:type w:val="nextPage"/>
           <w:pgSz w:w="12240" w:h="15840"/>
           <w:pgMar w:left="1417" w:right="1417" w:gutter="0" w:header="720" w:top="1134" w:footer="720" w:bottom="1134"/>
-          <w:pgNumType w:start="1" w:fmt="decimal"/>
           <w:formProt w:val="false"/>
           <w:textDirection w:val="lrTb"/>
           <w:docGrid w:type="default" w:linePitch="360" w:charSpace="0"/>
@@ -5631,7 +5621,7 @@
           <w:rFonts w:ascii="Arial" w:hAnsi="Arial"/>
           <w:sz w:val="22"/>
         </w:rPr>
-        <w:t>1.  Connect a phone or computer to the WiFi network named for the model — Zev-7S, Zev-7M, Zev-7-18, Zev-7RZ, Zev-7NS, Zev-7ND, Metronome or Metronome-S — or the custom AP name.</w:t>
+        <w:t>1.  Connect a phone or computer to the WiFi network named for the model — Zev-7S, Zev-7M, Zev-7-18, Zev-7RZ, Zev-7NS, Zev-7ND or Metronome-S — or the custom AP name.</w:t>
       </w:r>
     </w:p>
     <w:p>
@@ -5657,7 +5647,7 @@
           <w:rFonts w:ascii="Arial" w:hAnsi="Arial"/>
           <w:sz w:val="22"/>
         </w:rPr>
-        <w:t>3.  Configure settings and press Save. Press Back, and press Start; the button shows “✓ Starting...” while the clock restarts. On the Zev-7S, Zev-7 Mini, Zev-7-18, Zev-7RZ, Zev-7NS, Zev-7ND and Metronome-S, Save confirms with “Saved - press Start on the home page to connect”: the settings are stored, but the clock only joins the network once Start is pressed.</w:t>
+        <w:t>3.  Configure settings and press Save. Press Back, and press Start; the button shows “✓ Starting...” while the clock restarts. Save confirms with “Saved - press Start on the home page to connect”: the settings are stored, but the clock only joins the network once Start is pressed.</w:t>
       </w:r>
     </w:p>
     <w:p>
@@ -5670,7 +5660,7 @@
           <w:rFonts w:ascii="Arial" w:hAnsi="Arial"/>
           <w:sz w:val="22"/>
         </w:rPr>
-        <w:t>The setup form is split across four pages: Setup (network, time zone and firmware URL), Display, LED Lighting and Information (date, motion sensor, light sensor and weather; named Info Display on the original Metronome). Use the page buttons on the home page to navigate.</w:t>
+        <w:t>The setup form is split across four pages: Setup (network, time zone and firmware URL), Display, LED Lighting and Information (date, motion sensor, light sensor and weather). Use the page buttons on the home page to navigate.</w:t>
       </w:r>
     </w:p>
     <w:p>
@@ -5843,7 +5833,7 @@
                 <w:szCs w:val="22"/>
                 <w:lang w:val="en-US" w:eastAsia="en-US" w:bidi="ar-SA"/>
               </w:rPr>
-              <w:t>WiFi network name when in AP mode, and the base of the clock’s .local name (Section 7). Up to 31 characters (default: the name of the model). Labelled Access Point Name on the original Zev-7 and the original Metronome.</w:t>
+              <w:t>WiFi network name when in AP mode, and the base of the clock’s .local name (Section 7). Up to 31 characters (default: the name of the model).</w:t>
             </w:r>
           </w:p>
         </w:tc>
@@ -6363,7 +6353,7 @@
                 <w:szCs w:val="22"/>
                 <w:lang w:val="en-US" w:eastAsia="en-US" w:bidi="ar-SA"/>
               </w:rPr>
-              <w:t>Serves the settings web page while the clock is running (default: On). Off = no web interface in run mode; the setup form is still reachable by holding SW2. Not on the original Metronome.</w:t>
+              <w:t>Serves the settings web page while the clock is running (default: On). Off = no web interface in run mode; the setup form is still reachable by holding SW2.</w:t>
             </w:r>
           </w:p>
         </w:tc>
@@ -6428,7 +6418,7 @@
                 <w:szCs w:val="22"/>
                 <w:lang w:val="en-US" w:eastAsia="en-US" w:bidi="ar-SA"/>
               </w:rPr>
-              <w:t>Static IP Address section: a fixed address for the clock in run mode. Leave blank to get an address automatically (DHCP). If the clock cannot reach the network at the fixed address, it falls back to DHCP for that boot. Zev-7S, Zev-7 Mini, Zev-7-18, Zev-7RZ, Zev-7NS, Zev-7ND and Metronome-S only.</w:t>
+              <w:t>Static IP Address section: a fixed address for the clock in run mode. Leave blank to get an address automatically (DHCP). If the clock cannot reach the network at the fixed address, it falls back to DHCP for that boot.</w:t>
             </w:r>
           </w:p>
         </w:tc>
@@ -6781,7 +6771,7 @@
                 <w:szCs w:val="22"/>
                 <w:lang w:val="en-US" w:eastAsia="en-US" w:bidi="ar-SA"/>
               </w:rPr>
-              <w:t>12 Hour, 24 Hour (Zev-7 models; the Metronomes always show 24-hour time)</w:t>
+              <w:t>12 Hour, 24 Hour (Zev-7 models; the Metronome-S always shows 24-hour time)</w:t>
             </w:r>
           </w:p>
         </w:tc>
@@ -7151,7 +7141,7 @@
                 <w:szCs w:val="22"/>
                 <w:lang w:val="en-US" w:eastAsia="en-US" w:bidi="ar-SA"/>
               </w:rPr>
-              <w:t>1–9 (0–9 on the original Metronome)</w:t>
+              <w:t>1–9</w:t>
             </w:r>
           </w:p>
         </w:tc>
@@ -7877,7 +7867,7 @@
                 <w:szCs w:val="22"/>
                 <w:lang w:val="en-US" w:eastAsia="en-US" w:bidi="ar-SA"/>
               </w:rPr>
-              <w:t>Each changed digit rolls backward to its new value (not on the original Metronome)</w:t>
+              <w:t>Each changed digit rolls backward to its new value</w:t>
             </w:r>
           </w:p>
         </w:tc>
@@ -8035,7 +8025,7 @@
           <w:rFonts w:ascii="Arial" w:hAnsi="Arial"/>
           <w:sz w:val="22"/>
         </w:rPr>
-        <w:t>Crossfade Duration is independently configurable from 0 (instant) to 9 (900 ms) in 100 ms steps. Default is 5 (500 ms). Slot Machine/Scrollback Speed (Slot Machine Speed on the original Metronome) is configurable 0–9 (default 5); higher values run the cascade and the scrollback faster.</w:t>
+        <w:t>Crossfade Duration is independently configurable from 0 (instant) to 9 (900 ms) in 100 ms steps. Default is 5 (500 ms). Slot Machine/Scrollback Speed is configurable 0–9 (default 5); higher values run the cascade and the scrollback faster.</w:t>
       </w:r>
     </w:p>
     <w:p>
@@ -8397,7 +8387,7 @@
           <w:rFonts w:ascii="Arial" w:hAnsi="Arial"/>
           <w:sz w:val="22"/>
         </w:rPr>
-        <w:t>How long the SW1 button-wake lasts when a rule has dimmed or turned the display off: 15 Seconds, 1 Minute, or 5 Minutes (default: 15 Seconds). When the timeout expires, the active rule re-applies. On the Zev-7S, Zev-7 Mini, Zev-7-18, Zev-7RZ, Zev-7NS, Zev-7ND and Metronome-S, the same period applies when SW1 wakes a display that the motion sensor has blanked (see Section 4).</w:t>
+        <w:t>How long the SW1 button-wake lasts when a rule has dimmed or turned the display off: 15 Seconds, 1 Minute, or 5 Minutes (default: 15 Seconds). When the timeout expires, the active rule re-applies. The same period applies when SW1 wakes a display that the motion sensor has blanked (see Section 4).</w:t>
       </w:r>
     </w:p>
     <w:p>
@@ -11112,7 +11102,103 @@
                 <w:szCs w:val="22"/>
                 <w:lang w:val="en-US" w:eastAsia="en-US" w:bidi="ar-SA"/>
               </w:rPr>
-              <w:t>On, Off (BME68x only)</w:t>
+              <w:t>On, Off (BME68x or InfoServer)</w:t>
+            </w:r>
+          </w:p>
+        </w:tc>
+        <w:tc>
+          <w:tcPr>
+            <w:tcW w:w="3135" w:type="dxa"/>
+            <w:tcBorders/>
+          </w:tcPr>
+          <w:p>
+            <w:pPr>
+              <w:pStyle w:val="Normal"/>
+              <w:widowControl/>
+              <w:suppressAutoHyphens w:val="true"/>
+              <w:spacing w:before="0" w:after="80"/>
+              <w:jc w:val="start"/>
+              <w:rPr>
+                <w:rFonts w:eastAsia="ＭＳ 明朝" w:cs=""/>
+                <w:kern w:val="0"/>
+                <w:szCs w:val="22"/>
+                <w:lang w:val="en-US" w:eastAsia="en-US" w:bidi="ar-SA"/>
+              </w:rPr>
+            </w:pPr>
+            <w:r>
+              <w:rPr>
+                <w:rFonts w:eastAsia="ＭＳ 明朝" w:cs="" w:ascii="Arial" w:hAnsi="Arial"/>
+                <w:kern w:val="0"/>
+                <w:sz w:val="20"/>
+                <w:szCs w:val="22"/>
+                <w:lang w:val="en-US" w:eastAsia="en-US" w:bidi="ar-SA"/>
+              </w:rPr>
+              <w:t>Off</w:t>
+            </w:r>
+          </w:p>
+        </w:tc>
+      </w:tr>
+      <w:tr>
+        <w:trPr/>
+        <w:tc>
+          <w:tcPr>
+            <w:tcW w:w="3135" w:type="dxa"/>
+            <w:tcBorders/>
+          </w:tcPr>
+          <w:p>
+            <w:pPr>
+              <w:pStyle w:val="Normal"/>
+              <w:widowControl/>
+              <w:suppressAutoHyphens w:val="true"/>
+              <w:spacing w:before="0" w:after="80"/>
+              <w:jc w:val="start"/>
+              <w:rPr>
+                <w:rFonts w:eastAsia="ＭＳ 明朝" w:cs=""/>
+                <w:kern w:val="0"/>
+                <w:szCs w:val="22"/>
+                <w:lang w:val="en-US" w:eastAsia="en-US" w:bidi="ar-SA"/>
+              </w:rPr>
+            </w:pPr>
+            <w:r>
+              <w:rPr>
+                <w:rFonts w:eastAsia="ＭＳ 明朝" w:cs="" w:ascii="Arial" w:hAnsi="Arial"/>
+                <w:kern w:val="0"/>
+                <w:sz w:val="20"/>
+                <w:szCs w:val="22"/>
+                <w:lang w:val="en-US" w:eastAsia="en-US" w:bidi="ar-SA"/>
+              </w:rPr>
+              <w:t>CO2 Equivalent</w:t>
+            </w:r>
+          </w:p>
+        </w:tc>
+        <w:tc>
+          <w:tcPr>
+            <w:tcW w:w="3135" w:type="dxa"/>
+            <w:tcBorders/>
+          </w:tcPr>
+          <w:p>
+            <w:pPr>
+              <w:pStyle w:val="Normal"/>
+              <w:widowControl/>
+              <w:suppressAutoHyphens w:val="true"/>
+              <w:spacing w:before="0" w:after="80"/>
+              <w:jc w:val="start"/>
+              <w:rPr>
+                <w:rFonts w:eastAsia="ＭＳ 明朝" w:cs=""/>
+                <w:kern w:val="0"/>
+                <w:szCs w:val="22"/>
+                <w:lang w:val="en-US" w:eastAsia="en-US" w:bidi="ar-SA"/>
+              </w:rPr>
+            </w:pPr>
+            <w:r>
+              <w:rPr>
+                <w:rFonts w:eastAsia="ＭＳ 明朝" w:cs="" w:ascii="Arial" w:hAnsi="Arial"/>
+                <w:kern w:val="0"/>
+                <w:sz w:val="20"/>
+                <w:szCs w:val="22"/>
+                <w:lang w:val="en-US" w:eastAsia="en-US" w:bidi="ar-SA"/>
+              </w:rPr>
+              <w:t>On, Off (BME68x or InfoServer)</w:t>
             </w:r>
           </w:p>
         </w:tc>
@@ -11159,7 +11245,7 @@
           <w:rFonts w:ascii="Arial" w:hAnsi="Arial"/>
           <w:sz w:val="22"/>
         </w:rPr>
-        <w:t>The original Zev-7 has no Frequency, Indoor Air Quality or CO2 Equivalent setting (its weather cycle runs every minute). The original Metronome has none of them, and combines each reading’s on/off and units in one dropdown: Temperature (Off, Fahrenheit, Celsius, Kelvin), Pressure (Off, Inches of Mercury, Millibars) and Humidity (Off, On).</w:t>
+        <w:t>The weather settings always appear, because readings can come from an InfoServer (Section 13). Lines under the Weather Display heading name where each reading comes from.</w:t>
       </w:r>
     </w:p>
     <w:p>
@@ -12652,7 +12738,6 @@
           <w:type w:val="nextPage"/>
           <w:pgSz w:w="12240" w:h="15840"/>
           <w:pgMar w:left="1417" w:right="1417" w:gutter="0" w:header="720" w:top="1134" w:footer="720" w:bottom="1134"/>
-          <w:pgNumType w:start="1" w:fmt="decimal"/>
           <w:formProt w:val="false"/>
           <w:textDirection w:val="lrTb"/>
           <w:docGrid w:type="default" w:linePitch="360" w:charSpace="0"/>
@@ -12663,7 +12748,7 @@
           <w:rFonts w:ascii="Arial" w:hAnsi="Arial"/>
           <w:sz w:val="22"/>
         </w:rPr>
-        <w:t>The Date Display and Weather Display sections on the Information page each have their own Start Second setting, and the two run independently (the original Metronome has a single Info Scroll Start Second instead). Keep them several seconds apart so a long info cycle on one doesn't collide with the other. The weather Frequency setting controls how often the weather cycle runs — from Every Minute (the default) down to Hourly. Every choice divides evenly into an hour, so the spacing stays even across the top of the hour.</w:t>
+        <w:t>The Date Display and Weather Display sections on the Information page each have their own Start Second setting, and the two run independently. Keep them several seconds apart so a long info cycle on one doesn't collide with the other. The weather Frequency setting controls how often the weather cycle runs — from Every Minute (the default) down to Hourly. Every choice divides evenly into an hour, so the spacing stays even across the top of the hour.</w:t>
       </w:r>
     </w:p>
     <w:p>
@@ -12784,7 +12869,7 @@
           <w:rFonts w:ascii="Arial" w:hAnsi="Arial"/>
           <w:sz w:val="22"/>
         </w:rPr>
-        <w:t>On many networks the clock can be reached by name instead of by IP address. Browse to http://zev-7.local/ (or http://zev-7m.local/ for the Mini, http://zev-7-18.local/ for the Zev-7-18, http://zev-7rz.local/ for the Zev-7RZ, http://zev-7ns.local/ or http://zev-7nd.local/ for the numitron models, http://metronome.local/ for the Metronome, or http://metronome-s.local/ for the Metronome-S) and the page should load. The hostname is derived from the Access Point / mDNS Name set during configuration, lowercased, with any spaces or special characters converted to hyphens. For example, an AP Name of "Zev-7" becomes zev-7.local; "My Office" becomes my-office.local.</w:t>
+        <w:t>On many networks the clock can be reached by name instead of by IP address. Browse to http://zev-7.local/ (or http://zev-7m.local/ for the Mini, http://zev-7-18.local/ for the Zev-7-18, http://zev-7rz.local/ for the Zev-7RZ, http://zev-7ns.local/ or http://zev-7nd.local/ for the numitron models, or http://metronome-s.local/ for the Metronome-S) and the page should load. The hostname is derived from the Access Point / mDNS Name set during configuration, lowercased, with any spaces or special characters converted to hyphens. For example, an AP Name of "Zev-7" becomes zev-7.local; "My Office" becomes my-office.local.</w:t>
       </w:r>
     </w:p>
     <w:p>
@@ -12982,7 +13067,7 @@
           <w:rFonts w:ascii="Arial" w:hAnsi="Arial"/>
           <w:sz w:val="22"/>
         </w:rPr>
-        <w:t>LED Effects (all 14 effects; 13 on the original Metronome); LED Color picker (active when LED Effects is Custom)</w:t>
+        <w:t>LED Effects (all 14 effects); LED Color picker (active when LED Effects is Custom)</w:t>
       </w:r>
     </w:p>
     <w:p>
@@ -13050,7 +13135,7 @@
           <w:rFonts w:ascii="Arial" w:hAnsi="Arial"/>
           <w:sz w:val="22"/>
         </w:rPr>
-        <w:t>Weather Display: Temperature, Temperature Units, Temperature Offset Degrees, Pressure, Pressure Units, Humidity, Indoor Air Quality, CO2 Equivalent (see Section 6 for the original models)</w:t>
+        <w:t>Weather Display: Temperature, Temperature Units, Temperature Offset Degrees, Pressure, Pressure Units, Humidity, Indoor Air Quality, CO2 Equivalent</w:t>
       </w:r>
     </w:p>
     <w:p>
@@ -13225,7 +13310,6 @@
           <w:type w:val="nextPage"/>
           <w:pgSz w:w="12240" w:h="15840"/>
           <w:pgMar w:left="1417" w:right="1417" w:gutter="0" w:header="720" w:top="1134" w:footer="720" w:bottom="1134"/>
-          <w:pgNumType w:start="1" w:fmt="decimal"/>
           <w:formProt w:val="false"/>
           <w:textDirection w:val="lrTb"/>
           <w:docGrid w:type="default" w:linePitch="360" w:charSpace="0"/>
@@ -13334,7 +13418,7 @@
           <w:rFonts w:ascii="Arial" w:hAnsi="Arial"/>
           <w:sz w:val="22"/>
         </w:rPr>
-        <w:t>The Rules Enabled switch on the Rule Editor page temporarily ignores all rules without deleting them. This is useful for making live adjustments without rules re-applying. The switch is not saved: it always returns to On (rules active) after a reboot. Changing a setting on the live form while a rule is in effect switches Rules Enabled off automatically, so the change is not undone at the next minute; adding, editing or deleting rules never does. On the Zev-7S, Zev-7 Mini, Zev-7-18, Zev-7RZ, Zev-7NS, Zev-7ND and Metronome-S, changing Rules Timeout, Firmware URL, Latitude or Longitude leaves the rules on. On the original Zev-7 and the original Metronome, changing Rules Timeout or Firmware URL switches them off like any other setting.</w:t>
+        <w:t>The Rules Enabled switch on the Rule Editor page temporarily ignores all rules without deleting them. This is useful for making live adjustments without rules re-applying. The switch is not saved: it always returns to On (rules active) after a reboot. Changing a setting on the live form while a rule is in effect switches Rules Enabled off automatically, so the change is not undone at the next minute; adding, editing or deleting rules never does. Changing Rules Timeout, Firmware URL, Latitude or Longitude leaves the rules on.</w:t>
       </w:r>
     </w:p>
     <w:p>
@@ -13433,7 +13517,7 @@
           <w:rFonts w:ascii="Arial" w:hAnsi="Arial"/>
           <w:sz w:val="22"/>
         </w:rPr>
-        <w:t>Note: lc is honored only when le=13 (Custom). Using lc by itself auto-promotes the rule to effect 13. Pairing lc with any other le value is rejected by the rule editor. (Effect numbering shifted when Chroma Digit was added: Cycle is 12 and Custom is 13. The original Metronome has no Chroma Digit, so there Cycle is 11, Custom is 12 and lc requires le=12.)</w:t>
+        <w:t>Note: lc is honored only when le=13 (Custom). Using lc by itself auto-promotes the rule to effect 13. Pairing lc with any other le value is rejected by the rule editor. (Effect numbering shifted when Chroma Digit was added: Cycle is 12 and Custom is 13.)</w:t>
       </w:r>
     </w:p>
     <w:p>
@@ -13474,7 +13558,7 @@
           <w:rFonts w:ascii="Arial" w:hAnsi="Arial"/>
           <w:sz w:val="22"/>
         </w:rPr>
-        <w:t>Keyword names by model. Every model writes display brightness as br / brightness. The Zev-7S, Zev-7 Mini, Zev-7-18, Zev-7RZ, Zev-7NS, Zev-7ND and Metronome-S write the indoor sensor readings as it, ip and ih; the original Zev-7 keeps tp, pr and hu (the original Metronome has no sensor keywords). Each clock accepts only its own names. These names arrived with Zev-7S, Zev-7 Mini, Zev-7-18 and Zev-7RZ firmware 3.4, Zev-7NS and Zev-7ND firmware 3.4 and Metronome-S firmware 1.3; rules saved under the old names are not carried over, so after updating to that firmware perform a factory reset (Section 17) and re-enter the settings and rules.</w:t>
+        <w:t>Keyword names by model. Every model writes display brightness as br / brightness. Every model writes the indoor sensor readings as it, ip and ih. These names arrived with Zev-7S, Zev-7 Mini, Zev-7-18 and Zev-7RZ firmware 3.4, Zev-7NS and Zev-7ND firmware 3.4 and Metronome-S firmware 1.3; rules saved under the old names are not carried over, so after updating to that firmware perform a factory reset (Section 17) and re-enter the settings and rules.</w:t>
       </w:r>
     </w:p>
     <w:tbl>
@@ -14212,7 +14296,7 @@
                 <w:szCs w:val="22"/>
                 <w:lang w:val="en-US" w:eastAsia="en-US" w:bidi="ar-SA"/>
               </w:rPr>
-              <w:t>Temperature reading in the weather display cycle: 1 or on = shown, 0 or off = hidden (units from Temperature Units). Needs a weather sensor. On the original Zev-7 this keyword is tp / temp.</w:t>
+              <w:t>Temperature reading in the weather display cycle: 1 or on = shown, 0 or off = hidden (units from Temperature Units). Needs a weather sensor.</w:t>
             </w:r>
           </w:p>
         </w:tc>
@@ -14277,7 +14361,7 @@
                 <w:szCs w:val="22"/>
                 <w:lang w:val="en-US" w:eastAsia="en-US" w:bidi="ar-SA"/>
               </w:rPr>
-              <w:t>Barometric pressure reading in the weather display cycle: 1 or on = shown, 0 or off = hidden (units from Pressure Units). Needs a weather sensor. On the original Zev-7 this keyword is pr / pressure.</w:t>
+              <w:t>Barometric pressure reading in the weather display cycle: 1 or on = shown, 0 or off = hidden (units from Pressure Units). Needs a weather sensor.</w:t>
             </w:r>
           </w:p>
         </w:tc>
@@ -14342,7 +14426,7 @@
                 <w:szCs w:val="22"/>
                 <w:lang w:val="en-US" w:eastAsia="en-US" w:bidi="ar-SA"/>
               </w:rPr>
-              <w:t>Humidity reading in the weather display cycle: 1 or on = shown, 0 or off = hidden. Needs a weather sensor. On the original Zev-7 this keyword is hu / humidity.</w:t>
+              <w:t>Humidity reading in the weather display cycle: 1 or on = shown, 0 or off = hidden. Needs a weather sensor.</w:t>
             </w:r>
           </w:p>
         </w:tc>
@@ -14679,7 +14763,7 @@
                 <w:rFonts w:ascii="Arial" w:hAnsi="Arial"/>
                 <w:sz w:val="20"/>
               </w:rPr>
-              <w:t>Marks the time range as a Tube Healing window and sets the session length in days (1–99; a bare heal means 30 days; heal=0 cancels healing inside a higher-priority window). During a healing window the cathodes selected on the Tube Healing page glow to recover from poisoning while every other tube stays dark, and the motion sensor is held off for the window. See Section 15. The tubes run at full brightness for the window regardless of the brightness setting, a br value in another rule (nb on the original Zev-7), or the light sensor. Nixie models only.</w:t>
+              <w:t>Marks the time range as a Tube Healing window and sets the session length in days (1–99; a bare heal means 30 days; heal=0 cancels healing inside a higher-priority window). During a healing window the cathodes selected on the Tube Healing page glow to recover from poisoning while every other tube stays dark, and the motion sensor is held off for the window. See Section 15. The tubes run at full brightness for the window regardless of the brightness setting, a br value in another rule, or the light sensor. Nixie models only.</w:t>
             </w:r>
           </w:p>
         </w:tc>
@@ -16518,7 +16602,6 @@
           <w:type w:val="nextPage"/>
           <w:pgSz w:w="12240" w:h="15840"/>
           <w:pgMar w:left="1417" w:right="1417" w:gutter="0" w:header="720" w:top="1134" w:footer="720" w:bottom="1134"/>
-          <w:pgNumType w:start="1" w:fmt="decimal"/>
           <w:formProt w:val="false"/>
           <w:textDirection w:val="lrTb"/>
           <w:docGrid w:type="default" w:linePitch="360" w:charSpace="0"/>
@@ -16587,13 +16670,27 @@
           <w:rFonts w:ascii="Arial" w:hAnsi="Arial"/>
           <w:sz w:val="22"/>
         </w:rPr>
-        <w:t>The Nixie tubes are backlit by RGB LEDs, on the Metronome models as well as the Zev-7. The Zev-7 models except the Zev-7ND, and the Metronome-S, also have separate under-light LEDs along the base, set to a fixed colour and brightness rather than an effect. The original Metronome has no under-light.</w:t>
+        <w:t>The Nixie tubes are backlit by RGB LEDs, on the Metronome-S as well as the Zev-7. The Zev-7 models except the Zev-7ND, and the Metronome-S, also have separate under-light LEDs along the base, set to a fixed colour and brightness rather than an effect.</w:t>
       </w:r>
     </w:p>
     <w:p>
       <w:pPr>
         <w:pStyle w:val="Normal"/>
         <w:rPr/>
+        <w:sectPr>
+          <w:headerReference w:type="even" r:id="rId69"/>
+          <w:headerReference w:type="default" r:id="rId69"/>
+          <w:headerReference w:type="first" r:id="rId69"/>
+          <w:footerReference w:type="even" r:id="rId72"/>
+          <w:footerReference w:type="default" r:id="rId72"/>
+          <w:footerReference w:type="first" r:id="rId72"/>
+          <w:type w:val="nextPage"/>
+          <w:pgSz w:w="12240" w:h="15840"/>
+          <w:pgMar w:left="1417" w:right="1417" w:gutter="0" w:header="720" w:top="1134" w:footer="720" w:bottom="1134"/>
+          <w:formProt w:val="false"/>
+          <w:textDirection w:val="lrTb"/>
+          <w:docGrid w:type="default" w:linePitch="360" w:charSpace="0"/>
+        </w:sectPr>
       </w:pPr>
       <w:r>
         <w:rPr>
@@ -18075,28 +18172,6 @@
     </w:tbl>
     <w:p>
       <w:pPr>
-        <w:sectPr>
-          <w:headerReference w:type="even" r:id="rId69"/>
-          <w:headerReference w:type="default" r:id="rId69"/>
-          <w:headerReference w:type="first" r:id="rId69"/>
-          <w:footerReference w:type="even" r:id="rId72"/>
-          <w:footerReference w:type="default" r:id="rId72"/>
-          <w:footerReference w:type="first" r:id="rId72"/>
-          <w:type w:val="nextPage"/>
-          <w:pgSz w:w="12240" w:h="15840"/>
-          <w:pgMar w:left="1417" w:right="1417" w:gutter="0" w:header="720" w:top="1134" w:footer="720" w:bottom="1134"/>
-          <w:pgNumType w:start="1" w:fmt="decimal"/>
-          <w:formProt w:val="false"/>
-          <w:textDirection w:val="lrTb"/>
-          <w:docGrid w:type="default" w:linePitch="360" w:charSpace="0"/>
-        </w:sectPr>
-      </w:pPr>
-      <w:r>
-        <w:t>The original Metronome has no Chroma Digit: on that model Cycle All is effect 11 (rotating through effects 1–10) and Custom is effect 12.</w:t>
-      </w:r>
-    </w:p>
-    <w:p>
-      <w:pPr>
         <w:pStyle w:val="Normal"/>
         <w:pBdr>
           <w:bottom w:val="single" w:sz="18" w:space="1" w:color="000000"/>
@@ -18450,7 +18525,7 @@
                 <w:szCs w:val="22"/>
                 <w:lang w:val="en-US" w:eastAsia="en-US" w:bidi="ar-SA"/>
               </w:rPr>
-              <w:t>Each changed digit rolls backward to its new value (not on the original Metronome)</w:t>
+              <w:t>Each changed digit rolls backward to its new value</w:t>
             </w:r>
           </w:p>
         </w:tc>
@@ -18616,7 +18691,6 @@
           <w:type w:val="nextPage"/>
           <w:pgSz w:w="12240" w:h="15840"/>
           <w:pgMar w:left="1417" w:right="1417" w:gutter="0" w:header="720" w:top="1134" w:footer="720" w:bottom="1134"/>
-          <w:pgNumType w:start="1" w:fmt="decimal"/>
           <w:formProt w:val="false"/>
           <w:textDirection w:val="lrTb"/>
           <w:docGrid w:type="default" w:linePitch="360" w:charSpace="0"/>
@@ -18627,7 +18701,7 @@
           <w:rFonts w:ascii="Arial" w:hAnsi="Arial"/>
           <w:sz w:val="22"/>
         </w:rPr>
-        <w:t>Slot Machine/Scrollback Speed (0–9, default 5; Slot Machine Speed on the original Metronome) tunes how fast the cascade and the scrollback run. 0 makes the change instant; higher values run the cascade faster. Crossfade speed can also be changed in the same way.</w:t>
+        <w:t>Slot Machine/Scrollback Speed (0–9, default 5) tunes how fast the cascade and the scrollback run. 0 makes the change instant; higher values run the cascade faster. Crossfade speed can also be changed in the same way.</w:t>
       </w:r>
     </w:p>
     <w:p>
@@ -18666,7 +18740,7 @@
     <w:p>
       <w:pPr/>
       <w:r>
-        <w:t>This section applies to the Zev-7 models only. Neither Metronome has colon lamps fitted.</w:t>
+        <w:t>This section applies to the Zev-7 models only. The Metronome-S has no colon lamps fitted.</w:t>
       </w:r>
     </w:p>
     <w:p>
@@ -19713,7 +19787,6 @@
           <w:type w:val="nextPage"/>
           <w:pgSz w:w="12240" w:h="15840"/>
           <w:pgMar w:left="1417" w:right="1417" w:gutter="0" w:header="720" w:top="1134" w:footer="720" w:bottom="1134"/>
-          <w:pgNumType w:start="1" w:fmt="decimal"/>
           <w:formProt w:val="false"/>
           <w:textDirection w:val="lrTb"/>
           <w:docGrid w:type="default" w:linePitch="360" w:charSpace="0"/>
@@ -19834,7 +19907,7 @@
         <w:rPr/>
       </w:pPr>
       <w:r>
-        <w:t>Temperature: Shown as a rounded whole degree. Temperature units are selectable as Fahrenheit, Celsius, or Kelvin. Negative temperatures are indicated by a special neon pattern.</w:t>
+        <w:t>Temperature: Shown as a rounded whole degree. Temperature units are selectable as Fahrenheit, Celsius, or Kelvin.</w:t>
       </w:r>
     </w:p>
     <w:p>
@@ -19862,13 +19935,26 @@
     <w:p>
       <w:pPr/>
       <w:r>
-        <w:t>Indoor Air Quality: Bosch static IAQ index from 0 to 500, shown as a whole number in the fourth to sixth tubes; available with a BME68x. The second tube shows the calibration status (0–3, see Section 13), the third tube stays blank, and the lower-left neon is lit.</w:t>
+        <w:t>Indoor Air Quality: Bosch static IAQ index from 0 to 500, shown as a whole number in the fourth to sixth tubes; available with a BME68x, or from an InfoServer. The second tube shows the calibration status (0–3, see Section 13), the third tube stays blank, and the lower-left neon is lit.</w:t>
       </w:r>
     </w:p>
     <w:p>
       <w:pPr/>
       <w:r>
-        <w:t>CO2 Equivalent: estimated carbon dioxide in parts per million, shown as a whole number up to 9999 in the third to sixth tubes; available with a BME68x. As with Indoor Air Quality, the second tube shows the calibration status and the lower-left neon is lit.</w:t>
+        <w:t>CO2 Equivalent: carbon dioxide in parts per million, shown as a whole number up to 9999 in the third to sixth tubes; estimated by a BME68x, or measured by an InfoServer's SEN66. As with Indoor Air Quality, the second tube shows the calibration status and the lower-left neon is lit. A SEN66 reading always shows status 3.</w:t>
+      </w:r>
+    </w:p>
+    <w:p>
+      <w:pPr/>
+      <w:r>
+        <w:rPr>
+          <w:b/>
+        </w:rPr>
+        <w:t xml:space="preserve">Lower-left neon. </w:t>
+      </w:r>
+      <w:r>
+        <w:rPr/>
+        <w:t>The lower-left neon is lit for every weather reading; with pressure in inches of mercury it is lit alongside the decimal point. A negative temperature is not marked separately.</w:t>
       </w:r>
     </w:p>
     <w:p>
@@ -19886,14 +19972,13 @@
           <w:type w:val="nextPage"/>
           <w:pgSz w:w="12240" w:h="15840"/>
           <w:pgMar w:left="1417" w:right="1417" w:gutter="0" w:header="720" w:top="1134" w:footer="720" w:bottom="1134"/>
-          <w:pgNumType w:start="1" w:fmt="decimal"/>
           <w:formProt w:val="false"/>
           <w:textDirection w:val="lrTb"/>
           <w:docGrid w:type="default" w:linePitch="360" w:charSpace="0"/>
         </w:sectPr>
       </w:pPr>
       <w:r>
-        <w:t>The leftmost digit identifies each weather reading: 1 = temperature, 2 = pressure, 3 = humidity, 4 = indoor air quality, and 5 = CO2 equivalent. The number is fixed for the reading, even when other readings are disabled. The second digit stays blank to separate the identifier from the value, except on the two air-quality readings, where it shows the calibration status. On the Metronome-S the identifier is also in the leftmost tube, the calibration status is in the third tube, and the value is in the sixth to ninth tubes; it has no neons, so no indicator is lit. Each item is held on the display briefly, then transitions to the next using the configured Display Transition (Fade, Scroll, Wave, or Spin Wave). The first info trigger after boot is suppressed so the clock has a chance to settle.</w:t>
+        <w:t>The leftmost digit identifies each weather reading: 1 = temperature, 2 = pressure, 3 = humidity, 4 = indoor air quality, and 5 = CO2 equivalent. The number is fixed for the reading, even when other readings are disabled. The second digit stays blank to separate the identifier from the value, except on the two air-quality readings, where it shows the calibration status. On the Metronome-S the identifier is also in the leftmost tube, the calibration status is in the third tube, and the value is in the sixth to ninth tubes; it has no neons, so no indicator is lit. Each item is held on the display briefly, then transitions to the next using the configured Display Transition (Fade, Scroll, Wave, or Spin Wave). The first info trigger after boot is suppressed so the clock has a chance to settle. A weather cycle runs only when at least one enabled reading has data, so a reading with no source never interrupts the time.</w:t>
       </w:r>
     </w:p>
     <w:p>
@@ -19978,7 +20063,7 @@
         <w:rPr/>
       </w:pPr>
       <w:r>
-        <w:t>An optional BME280 or BME68x sensor supplies temperature, barometric pressure, and humidity for the weather display cycle. A temperature offset is available. With a BME68x, turn on Indoor Air Quality to add Bosch’s IAQ index after humidity, and CO2 Equivalent to add an estimated CO₂ reading after that. Both show their calibration status in the second tube and light the lower-left neon (see Section 12).</w:t>
+        <w:t>An optional BME280 or BME68x sensor supplies temperature, barometric pressure, and humidity for the weather display cycle. A temperature offset is available. With a BME68x, turn on Indoor Air Quality to add Bosch’s IAQ index after humidity, and CO2 Equivalent to add an estimated CO₂ reading after that. Both show their calibration status in the second tube and light the lower-left neon (see Section 12). Readings the sensor can't take come from an InfoServer (see InfoServer Readings below).</w:t>
       </w:r>
     </w:p>
     <w:p>
@@ -19987,7 +20072,7 @@
         <w:rPr/>
       </w:pPr>
       <w:r>
-        <w:t>The clock detects the sensor at startup at I2C address 0x76 or 0x77 and labels it in the settings page. If multiple supported sensors are present, it uses the BME68x first. Weather settings are hidden when no supported sensor is found. The Indoor Air Quality and CO2 Equivalent toggles appear only with a BME68x. The BME680 and BME688 give the same readings here.</w:t>
+        <w:t>The clock detects the sensor at startup at I2C address 0x76 or 0x77. If multiple supported sensors are present, it uses the BME68x first. The BME680 and BME688 give the same readings here. The sensor is named in the source lines under the Weather Display heading.</w:t>
       </w:r>
     </w:p>
     <w:p>
@@ -20242,6 +20327,60 @@
       <w:pPr>
         <w:pStyle w:val="Heading2"/>
         <w:keepNext w:val="true"/>
+        <w:pBdr>
+          <w:top w:val="single" w:sz="8" w:space="4" w:color="000000"/>
+        </w:pBdr>
+        <w:spacing w:before="280" w:after="120"/>
+        <w:rPr/>
+      </w:pPr>
+      <w:r>
+        <w:rPr/>
+        <w:t>InfoServer Readings</w:t>
+      </w:r>
+    </w:p>
+    <w:p>
+      <w:pPr/>
+      <w:r>
+        <w:rPr>
+          <w:b/>
+        </w:rPr>
+        <w:t xml:space="preserve">Where readings come from. </w:t>
+      </w:r>
+      <w:r>
+        <w:rPr/>
+        <w:t>The clock's own sensor is always used for the readings it can take. Anything it can't take is read from an InfoServer on the same network, at infoserver.local: all five readings when no sensor is fitted, or Indoor Air Quality and CO2 Equivalent with a BME280. For temperature, humidity and pressure the InfoServer's BME280 or BME68x is used first; a SEN66 supplies temperature and humidity when there is no BME, and pressure needs a BME. For CO2 Equivalent the SEN66's measured CO₂ reading is used whenever the InfoServer has one, ahead of a BME68x estimate, and is shown with calibration status 3. Temperature Offset Degrees applies to the temperature from either source.</w:t>
+      </w:r>
+    </w:p>
+    <w:p>
+      <w:pPr/>
+      <w:r>
+        <w:rPr>
+          <w:b/>
+        </w:rPr>
+        <w:t xml:space="preserve">Finding the InfoServer. </w:t>
+      </w:r>
+      <w:r>
+        <w:rPr/>
+        <w:t>After starting, the clock looks for the InfoServer every 10 seconds for one minute. If it does not answer, or answers but has no sensor the clock can use, the clock stops looking until it is next restarted. Once found, it is read every minute. A reading more than five minutes old is not shown, and returns when the InfoServer does.</w:t>
+      </w:r>
+    </w:p>
+    <w:p>
+      <w:pPr/>
+      <w:r>
+        <w:rPr>
+          <w:b/>
+        </w:rPr>
+        <w:t xml:space="preserve">Source lines. </w:t>
+      </w:r>
+      <w:r>
+        <w:rPr/>
+        <w:t>Under the Weather Display heading on both settings forms, a line names where each reading comes from, for example Temperature, Pressure, Humidity: local BME280 and Air Quality, CO2: InfoServer BME680 (12 s ago). Other entries are checking InfoServer... while the clock is still looking, unavailable when the InfoServer has stopped supplying that reading, and no sensor when neither source has it. On the AP setup form the InfoServer can't be reached yet, so those readings show InfoServer, once the clock is on WiFi. Reload the page to update the lines.</w:t>
+      </w:r>
+    </w:p>
+    <w:p>
+      <w:pPr>
+        <w:pStyle w:val="Heading2"/>
+        <w:keepNext w:val="true"/>
         <w:pageBreakBefore/>
         <w:pBdr>
           <w:top w:val="single" w:sz="8" w:space="4" w:color="000000"/>
@@ -20327,7 +20466,6 @@
           <w:type w:val="nextPage"/>
           <w:pgSz w:w="12240" w:h="15840"/>
           <w:pgMar w:left="1417" w:right="1417" w:gutter="0" w:header="720" w:top="1134" w:footer="720" w:bottom="1134"/>
-          <w:pgNumType w:start="1" w:fmt="decimal"/>
           <w:formProt w:val="false"/>
           <w:textDirection w:val="lrTb"/>
           <w:docGrid w:type="default" w:linePitch="360" w:charSpace="0"/>
@@ -20652,7 +20790,6 @@
           <w:type w:val="nextPage"/>
           <w:pgSz w:w="12240" w:h="15840"/>
           <w:pgMar w:left="1417" w:right="1417" w:gutter="0" w:header="720" w:top="1134" w:footer="720" w:bottom="1134"/>
-          <w:pgNumType w:start="1" w:fmt="decimal"/>
           <w:formProt w:val="false"/>
           <w:textDirection w:val="lrTb"/>
           <w:docGrid w:type="default" w:linePitch="360" w:charSpace="0"/>
@@ -20750,7 +20887,7 @@
           <w:rFonts w:ascii="Arial" w:hAnsi="Arial"/>
           <w:sz w:val="22"/>
         </w:rPr>
-        <w:t>What is seen during a window. The clock stops showing the time entirely: only the selected cathodes glow, on their own tubes, and every other tube is dark. This is deliberate — a healing digit held in place of a time digit would be unreadable and would dilute the treatment. If more than one digit is selected on the same tube, that tube rotates through them, five minutes each. The rotation begins when the window opens, starting with the lowest selected digit, so every digit — including the first — gets its full five minutes; a window that ends and later reopens starts the rotation over from the first selected digit. The motion sensor, the scheduled anti-poison cycles, and the date and weather info displays are all suspended for the duration of the window so the treatment runs uninterrupted. The tubes run at full brightness for the whole window, regardless of the brightness setting, a br value in any rule (nb on the original Zev-7), the light sensor, or the motion sensor — the glow itself is the treatment, so a dimmed cathode heals slowly or not at all. Every tube with a digit selected takes part, including the tenths tube, even if it is normally switched off. Outside the window the clock behaves normally, with the brightness setting and any rules back in charge.</w:t>
+        <w:t>What is seen during a window. The clock stops showing the time entirely: only the selected cathodes glow, on their own tubes, and every other tube is dark. This is deliberate — a healing digit held in place of a time digit would be unreadable and would dilute the treatment. If more than one digit is selected on the same tube, that tube rotates through them, five minutes each. The rotation begins when the window opens, starting with the lowest selected digit, so every digit — including the first — gets its full five minutes; a window that ends and later reopens starts the rotation over from the first selected digit. The motion sensor, the scheduled anti-poison cycles, and the date and weather info displays are all suspended for the duration of the window so the treatment runs uninterrupted. The tubes run at full brightness for the whole window, regardless of the brightness setting, a br value in any rule, the light sensor, or the motion sensor — the glow itself is the treatment, so a dimmed cathode heals slowly or not at all. Every tube with a digit selected takes part, including the tenths tube, even if it is normally switched off. Outside the window the clock behaves normally, with the brightness setting and any rules back in charge.</w:t>
       </w:r>
     </w:p>
     <w:p>
@@ -20765,7 +20902,6 @@
           <w:type w:val="nextPage"/>
           <w:pgSz w:w="12240" w:h="15840"/>
           <w:pgMar w:left="1417" w:right="1417" w:gutter="0" w:header="720" w:top="1134" w:footer="720" w:bottom="1134"/>
-          <w:pgNumType w:start="1" w:fmt="decimal"/>
           <w:formProt w:val="false"/>
           <w:textDirection w:val="lrTb"/>
           <w:docGrid w:type="default" w:linePitch="360" w:charSpace="0"/>
@@ -20848,7 +20984,7 @@
           <w:rFonts w:ascii="Arial" w:hAnsi="Arial"/>
           <w:sz w:val="22"/>
         </w:rPr>
-        <w:t>The firmware can also be updated from the web settings page, without using the button. On the System page, press Update Firmware. The settings form is replaced by a status message while the clock checks the firmware server. If the firmware is already current, the message says so (with the version number) and the page returns to the home screen automatically. If a newer version is available, the message changes to “updating to v&lt;new version&gt;…” before the download starts (on the original Zev-7 and the original Metronome the checking message stays up instead) and stays on screen while the clock downloads, installs, and reboots; once the clock is back up, the page returns to the home screen on its own. If the update fails, the clock reboots unchanged and the page also returns home — check the tubes for the error code below. The tubes show the same update status described below regardless of whether the update is started from the button or the web page.</w:t>
+        <w:t>The firmware can also be updated from the web settings page, without using the button. On the System page, press Update Firmware. The settings form is replaced by a status message while the clock checks the firmware server. If the firmware is already current, the message says so (with the version number) and the page returns to the home screen automatically. If a newer version is available, the message changes to “updating to v&lt;new version&gt;…” before the download starts and stays on screen while the clock downloads, installs, and reboots; once the clock is back up, the page returns to the home screen on its own. If the update fails, the clock reboots unchanged and the page also returns home — check the tubes for the error code below. The tubes show the same update status described below regardless of whether the update is started from the button or the web page.</w:t>
       </w:r>
     </w:p>
     <w:p>
@@ -21701,7 +21837,7 @@
           <w:rFonts w:ascii="Arial" w:hAnsi="Arial"/>
           <w:sz w:val="22"/>
         </w:rPr>
-        <w:t>One update needs action afterwards: Zev-7S, Zev-7 Mini, Zev-7-18 and Zev-7RZ firmware 3.4, Zev-7NS and Zev-7ND firmware 3.4, and Metronome-S firmware 1.3 renamed several rule keywords (Section 8), and the Metronome-S firmware also rearranged its weather settings. Rules and weather settings saved by earlier firmware are not carried over. After updating one of these clocks from an earlier version, perform a factory reset (Section 17), then re-enter the settings and rules. The original Zev-7 and the original Metronome are not affected.</w:t>
+        <w:t>One update needs action afterwards: Zev-7S, Zev-7 Mini, Zev-7-18 and Zev-7RZ firmware 3.4, Zev-7NS and Zev-7ND firmware 3.4, and Metronome-S firmware 1.3 renamed several rule keywords (Section 8), and the Metronome-S firmware also rearranged its weather settings. Rules and weather settings saved by earlier firmware are not carried over. After updating one of these clocks from an earlier version, perform a factory reset (Section 17), then re-enter the settings and rules.</w:t>
       </w:r>
     </w:p>
     <w:p>
@@ -21813,7 +21949,6 @@
           <w:type w:val="nextPage"/>
           <w:pgSz w:w="12240" w:h="15840"/>
           <w:pgMar w:left="1417" w:right="1417" w:gutter="0" w:header="720" w:top="1134" w:footer="720" w:bottom="1134"/>
-          <w:pgNumType w:start="1" w:fmt="decimal"/>
           <w:formProt w:val="false"/>
           <w:textDirection w:val="lrTb"/>
           <w:docGrid w:type="default" w:linePitch="360" w:charSpace="0"/>
@@ -21982,7 +22117,6 @@
           <w:type w:val="nextPage"/>
           <w:pgSz w:w="12240" w:h="15840"/>
           <w:pgMar w:left="1417" w:right="1417" w:gutter="0" w:header="720" w:top="1134" w:footer="720" w:bottom="1134"/>
-          <w:pgNumType w:start="1" w:fmt="decimal"/>
           <w:formProt w:val="false"/>
           <w:textDirection w:val="lrTb"/>
           <w:docGrid w:type="default" w:linePitch="360" w:charSpace="0"/>
@@ -21993,7 +22127,7 @@
           <w:rFonts w:ascii="Arial" w:hAnsi="Arial"/>
           <w:sz w:val="22"/>
         </w:rPr>
-        <w:t>All WiFi credentials, display preferences, and sensor settings are erased. On the Zev-7S, Zev-7 Mini, Zev-7-18, Zev-7RZ, Zev-7NS, Zev-7ND and Metronome-S the rules are erased as well; the original Zev-7 and the original Metronome keep their rules. The model code (which identifies the model) and any Tube Healing selections are preserved.</w:t>
+        <w:t>All WiFi credentials, display preferences, and sensor settings are erased. The rules are erased as well. The model code (which identifies the model) and any Tube Healing selections are preserved.</w:t>
       </w:r>
     </w:p>
     <w:p>
@@ -22465,7 +22599,6 @@
           <w:type w:val="nextPage"/>
           <w:pgSz w:w="12240" w:h="15840"/>
           <w:pgMar w:left="1417" w:right="1417" w:gutter="0" w:header="720" w:top="1134" w:footer="720" w:bottom="1134"/>
-          <w:pgNumType w:start="1" w:fmt="decimal"/>
           <w:formProt w:val="false"/>
           <w:textDirection w:val="lrTb"/>
           <w:docGrid w:type="default" w:linePitch="360" w:charSpace="0"/>
@@ -22740,7 +22873,7 @@
                 <w:szCs w:val="22"/>
                 <w:lang w:val="en-US" w:eastAsia="en-US" w:bidi="ar-SA"/>
               </w:rPr>
-              <w:t>NX1 scrolls digit "1" while WiFi is connecting and digit "2" while NTP is syncing. If neither completes within 2 minutes, the clock automatically reboots and tries again.</w:t>
+              <w:t>NX1 scrolls digit "1" while WiFi is connecting and digit "2" while NTP is syncing. If neither completes within 3 minutes, the clock automatically reboots and tries again.</w:t>
             </w:r>
           </w:p>
         </w:tc>
@@ -24006,7 +24139,6 @@
           <w:type w:val="nextPage"/>
           <w:pgSz w:w="12240" w:h="15840"/>
           <w:pgMar w:left="1417" w:right="1417" w:gutter="0" w:header="720" w:top="1134" w:footer="720" w:bottom="1134"/>
-          <w:pgNumType w:start="1" w:fmt="decimal"/>
           <w:formProt w:val="false"/>
           <w:textDirection w:val="lrTb"/>
           <w:docGrid w:type="default" w:linePitch="360" w:charSpace="0"/>
@@ -24141,7 +24273,6 @@
       <w:type w:val="nextPage"/>
       <w:pgSz w:w="12240" w:h="15840"/>
       <w:pgMar w:left="1417" w:right="1417" w:gutter="0" w:header="720" w:top="1134" w:footer="720" w:bottom="1134"/>
-      <w:pgNumType w:start="1" w:fmt="decimal"/>
       <w:formProt w:val="false"/>
       <w:textDirection w:val="lrTb"/>
       <w:docGrid w:type="default" w:linePitch="360" w:charSpace="0"/>
@@ -24196,7 +24327,7 @@
         <w:color w:val="555555"/>
         <w:sz w:val="20"/>
       </w:rPr>
-      <w:t>Revision 3.0 — September 2026</w:t>
+      <w:t>Version 3.1 — Oct 2026</w:t>
     </w:r>
     <w:r>
       <w:rPr>
@@ -24211,23 +24342,39 @@
         <w:color w:val="555555"/>
         <w:sz w:val="20"/>
       </w:rPr>
-      <w:t>1-</w:t>
+      <w:t xml:space="preserve">Page </w:t>
     </w:r>
     <w:r>
-      <w:rPr/>
+      <w:rPr>
+        <w:rFonts w:ascii="Arial" w:hAnsi="Arial"/>
+        <w:color w:val="555555"/>
+        <w:sz w:val="20"/>
+      </w:rPr>
+      <w:fldChar w:fldCharType="begin"/>
+      <w:instrText xml:space="preserve"> PAGE </w:instrText>
+      <w:fldChar w:fldCharType="separate"/>
+      <w:t>1</w:t>
+      <w:fldChar w:fldCharType="end"/>
     </w:r>
     <w:r>
-      <w:rPr/>
+      <w:rPr>
+        <w:rFonts w:ascii="Arial" w:hAnsi="Arial"/>
+        <w:color w:val="555555"/>
+        <w:sz w:val="20"/>
+      </w:rPr>
+      <w:t xml:space="preserve"> of </w:t>
     </w:r>
     <w:r>
-      <w:rPr/>
-    </w:r>
-    <w:r>
-      <w:rPr/>
-      <w:t>1</w:t>
-    </w:r>
-    <w:r>
-      <w:rPr/>
+      <w:rPr>
+        <w:rFonts w:ascii="Arial" w:hAnsi="Arial"/>
+        <w:color w:val="555555"/>
+        <w:sz w:val="20"/>
+      </w:rPr>
+      <w:fldChar w:fldCharType="begin"/>
+      <w:instrText xml:space="preserve"> NUMPAGES </w:instrText>
+      <w:fldChar w:fldCharType="separate"/>
+      <w:t>44</w:t>
+      <w:fldChar w:fldCharType="end"/>
     </w:r>
   </w:p>
 </w:ftr>
@@ -24324,7 +24471,7 @@
         <w:color w:val="555555"/>
         <w:sz w:val="20"/>
       </w:rPr>
-      <w:t>Revision 3.0 — September 2026</w:t>
+      <w:t>Version 3.1 — Oct 2026</w:t>
     </w:r>
     <w:r>
       <w:rPr>
@@ -24339,23 +24486,39 @@
         <w:color w:val="555555"/>
         <w:sz w:val="20"/>
       </w:rPr>
-      <w:t>2-</w:t>
+      <w:t xml:space="preserve">Page </w:t>
     </w:r>
     <w:r>
-      <w:rPr/>
+      <w:rPr>
+        <w:rFonts w:ascii="Arial" w:hAnsi="Arial"/>
+        <w:color w:val="555555"/>
+        <w:sz w:val="20"/>
+      </w:rPr>
+      <w:fldChar w:fldCharType="begin"/>
+      <w:instrText xml:space="preserve"> PAGE </w:instrText>
+      <w:fldChar w:fldCharType="separate"/>
+      <w:t>1</w:t>
+      <w:fldChar w:fldCharType="end"/>
     </w:r>
     <w:r>
-      <w:rPr/>
+      <w:rPr>
+        <w:rFonts w:ascii="Arial" w:hAnsi="Arial"/>
+        <w:color w:val="555555"/>
+        <w:sz w:val="20"/>
+      </w:rPr>
+      <w:t xml:space="preserve"> of </w:t>
     </w:r>
     <w:r>
-      <w:rPr/>
-    </w:r>
-    <w:r>
-      <w:rPr/>
-      <w:t>1</w:t>
-    </w:r>
-    <w:r>
-      <w:rPr/>
+      <w:rPr>
+        <w:rFonts w:ascii="Arial" w:hAnsi="Arial"/>
+        <w:color w:val="555555"/>
+        <w:sz w:val="20"/>
+      </w:rPr>
+      <w:fldChar w:fldCharType="begin"/>
+      <w:instrText xml:space="preserve"> NUMPAGES </w:instrText>
+      <w:fldChar w:fldCharType="separate"/>
+      <w:t>44</w:t>
+      <w:fldChar w:fldCharType="end"/>
     </w:r>
   </w:p>
 </w:ftr>
@@ -24452,7 +24615,7 @@
         <w:color w:val="555555"/>
         <w:sz w:val="20"/>
       </w:rPr>
-      <w:t>Revision 3.0 — September 2026</w:t>
+      <w:t>Version 3.1 — Oct 2026</w:t>
     </w:r>
     <w:r>
       <w:rPr>
@@ -24467,23 +24630,39 @@
         <w:color w:val="555555"/>
         <w:sz w:val="20"/>
       </w:rPr>
-      <w:t>3-</w:t>
+      <w:t xml:space="preserve">Page </w:t>
     </w:r>
     <w:r>
-      <w:rPr/>
+      <w:rPr>
+        <w:rFonts w:ascii="Arial" w:hAnsi="Arial"/>
+        <w:color w:val="555555"/>
+        <w:sz w:val="20"/>
+      </w:rPr>
+      <w:fldChar w:fldCharType="begin"/>
+      <w:instrText xml:space="preserve"> PAGE </w:instrText>
+      <w:fldChar w:fldCharType="separate"/>
+      <w:t>1</w:t>
+      <w:fldChar w:fldCharType="end"/>
     </w:r>
     <w:r>
-      <w:rPr/>
+      <w:rPr>
+        <w:rFonts w:ascii="Arial" w:hAnsi="Arial"/>
+        <w:color w:val="555555"/>
+        <w:sz w:val="20"/>
+      </w:rPr>
+      <w:t xml:space="preserve"> of </w:t>
     </w:r>
     <w:r>
-      <w:rPr/>
-    </w:r>
-    <w:r>
-      <w:rPr/>
-      <w:t>1</w:t>
-    </w:r>
-    <w:r>
-      <w:rPr/>
+      <w:rPr>
+        <w:rFonts w:ascii="Arial" w:hAnsi="Arial"/>
+        <w:color w:val="555555"/>
+        <w:sz w:val="20"/>
+      </w:rPr>
+      <w:fldChar w:fldCharType="begin"/>
+      <w:instrText xml:space="preserve"> NUMPAGES </w:instrText>
+      <w:fldChar w:fldCharType="separate"/>
+      <w:t>44</w:t>
+      <w:fldChar w:fldCharType="end"/>
     </w:r>
   </w:p>
 </w:ftr>
@@ -24599,7 +24778,7 @@
         <w:color w:val="555555"/>
         <w:sz w:val="20"/>
       </w:rPr>
-      <w:t>Revision 3.0 — September 2026</w:t>
+      <w:t>Version 3.1 — Oct 2026</w:t>
     </w:r>
     <w:r>
       <w:rPr>
@@ -24614,23 +24793,39 @@
         <w:color w:val="555555"/>
         <w:sz w:val="20"/>
       </w:rPr>
-      <w:t>4-</w:t>
+      <w:t xml:space="preserve">Page </w:t>
     </w:r>
     <w:r>
-      <w:rPr/>
+      <w:rPr>
+        <w:rFonts w:ascii="Arial" w:hAnsi="Arial"/>
+        <w:color w:val="555555"/>
+        <w:sz w:val="20"/>
+      </w:rPr>
+      <w:fldChar w:fldCharType="begin"/>
+      <w:instrText xml:space="preserve"> PAGE </w:instrText>
+      <w:fldChar w:fldCharType="separate"/>
+      <w:t>1</w:t>
+      <w:fldChar w:fldCharType="end"/>
     </w:r>
     <w:r>
-      <w:rPr/>
+      <w:rPr>
+        <w:rFonts w:ascii="Arial" w:hAnsi="Arial"/>
+        <w:color w:val="555555"/>
+        <w:sz w:val="20"/>
+      </w:rPr>
+      <w:t xml:space="preserve"> of </w:t>
     </w:r>
     <w:r>
-      <w:rPr/>
-    </w:r>
-    <w:r>
-      <w:rPr/>
-      <w:t>1</w:t>
-    </w:r>
-    <w:r>
-      <w:rPr/>
+      <w:rPr>
+        <w:rFonts w:ascii="Arial" w:hAnsi="Arial"/>
+        <w:color w:val="555555"/>
+        <w:sz w:val="20"/>
+      </w:rPr>
+      <w:fldChar w:fldCharType="begin"/>
+      <w:instrText xml:space="preserve"> NUMPAGES </w:instrText>
+      <w:fldChar w:fldCharType="separate"/>
+      <w:t>44</w:t>
+      <w:fldChar w:fldCharType="end"/>
     </w:r>
   </w:p>
 </w:ftr>
@@ -24727,7 +24922,7 @@
         <w:color w:val="555555"/>
         <w:sz w:val="20"/>
       </w:rPr>
-      <w:t>Revision 3.0 — September 2026</w:t>
+      <w:t>Version 3.1 — Oct 2026</w:t>
     </w:r>
     <w:r>
       <w:rPr>
@@ -24742,23 +24937,39 @@
         <w:color w:val="555555"/>
         <w:sz w:val="20"/>
       </w:rPr>
-      <w:t>5-</w:t>
+      <w:t xml:space="preserve">Page </w:t>
     </w:r>
     <w:r>
-      <w:rPr/>
+      <w:rPr>
+        <w:rFonts w:ascii="Arial" w:hAnsi="Arial"/>
+        <w:color w:val="555555"/>
+        <w:sz w:val="20"/>
+      </w:rPr>
+      <w:fldChar w:fldCharType="begin"/>
+      <w:instrText xml:space="preserve"> PAGE </w:instrText>
+      <w:fldChar w:fldCharType="separate"/>
+      <w:t>1</w:t>
+      <w:fldChar w:fldCharType="end"/>
     </w:r>
     <w:r>
-      <w:rPr/>
+      <w:rPr>
+        <w:rFonts w:ascii="Arial" w:hAnsi="Arial"/>
+        <w:color w:val="555555"/>
+        <w:sz w:val="20"/>
+      </w:rPr>
+      <w:t xml:space="preserve"> of </w:t>
     </w:r>
     <w:r>
-      <w:rPr/>
-    </w:r>
-    <w:r>
-      <w:rPr/>
-      <w:t>1</w:t>
-    </w:r>
-    <w:r>
-      <w:rPr/>
+      <w:rPr>
+        <w:rFonts w:ascii="Arial" w:hAnsi="Arial"/>
+        <w:color w:val="555555"/>
+        <w:sz w:val="20"/>
+      </w:rPr>
+      <w:fldChar w:fldCharType="begin"/>
+      <w:instrText xml:space="preserve"> NUMPAGES </w:instrText>
+      <w:fldChar w:fldCharType="separate"/>
+      <w:t>44</w:t>
+      <w:fldChar w:fldCharType="end"/>
     </w:r>
   </w:p>
 </w:ftr>
@@ -24855,7 +25066,7 @@
         <w:color w:val="555555"/>
         <w:sz w:val="20"/>
       </w:rPr>
-      <w:t>Revision 3.0 — September 2026</w:t>
+      <w:t>Version 3.1 — Oct 2026</w:t>
     </w:r>
     <w:r>
       <w:rPr>
@@ -24870,23 +25081,39 @@
         <w:color w:val="555555"/>
         <w:sz w:val="20"/>
       </w:rPr>
-      <w:t>6-</w:t>
+      <w:t xml:space="preserve">Page </w:t>
     </w:r>
     <w:r>
-      <w:rPr/>
+      <w:rPr>
+        <w:rFonts w:ascii="Arial" w:hAnsi="Arial"/>
+        <w:color w:val="555555"/>
+        <w:sz w:val="20"/>
+      </w:rPr>
+      <w:fldChar w:fldCharType="begin"/>
+      <w:instrText xml:space="preserve"> PAGE </w:instrText>
+      <w:fldChar w:fldCharType="separate"/>
+      <w:t>1</w:t>
+      <w:fldChar w:fldCharType="end"/>
     </w:r>
     <w:r>
-      <w:rPr/>
+      <w:rPr>
+        <w:rFonts w:ascii="Arial" w:hAnsi="Arial"/>
+        <w:color w:val="555555"/>
+        <w:sz w:val="20"/>
+      </w:rPr>
+      <w:t xml:space="preserve"> of </w:t>
     </w:r>
     <w:r>
-      <w:rPr/>
-    </w:r>
-    <w:r>
-      <w:rPr/>
-      <w:t>4</w:t>
-    </w:r>
-    <w:r>
-      <w:rPr/>
+      <w:rPr>
+        <w:rFonts w:ascii="Arial" w:hAnsi="Arial"/>
+        <w:color w:val="555555"/>
+        <w:sz w:val="20"/>
+      </w:rPr>
+      <w:fldChar w:fldCharType="begin"/>
+      <w:instrText xml:space="preserve"> NUMPAGES </w:instrText>
+      <w:fldChar w:fldCharType="separate"/>
+      <w:t>44</w:t>
+      <w:fldChar w:fldCharType="end"/>
     </w:r>
   </w:p>
 </w:ftr>
@@ -24983,7 +25210,7 @@
         <w:color w:val="555555"/>
         <w:sz w:val="20"/>
       </w:rPr>
-      <w:t>Revision 3.0 — September 2026</w:t>
+      <w:t>Version 3.1 — Oct 2026</w:t>
     </w:r>
     <w:r>
       <w:rPr>
@@ -24998,23 +25225,39 @@
         <w:color w:val="555555"/>
         <w:sz w:val="20"/>
       </w:rPr>
-      <w:t>7-</w:t>
+      <w:t xml:space="preserve">Page </w:t>
     </w:r>
     <w:r>
-      <w:rPr/>
+      <w:rPr>
+        <w:rFonts w:ascii="Arial" w:hAnsi="Arial"/>
+        <w:color w:val="555555"/>
+        <w:sz w:val="20"/>
+      </w:rPr>
+      <w:fldChar w:fldCharType="begin"/>
+      <w:instrText xml:space="preserve"> PAGE </w:instrText>
+      <w:fldChar w:fldCharType="separate"/>
+      <w:t>1</w:t>
+      <w:fldChar w:fldCharType="end"/>
     </w:r>
     <w:r>
-      <w:rPr/>
+      <w:rPr>
+        <w:rFonts w:ascii="Arial" w:hAnsi="Arial"/>
+        <w:color w:val="555555"/>
+        <w:sz w:val="20"/>
+      </w:rPr>
+      <w:t xml:space="preserve"> of </w:t>
     </w:r>
     <w:r>
-      <w:rPr/>
-    </w:r>
-    <w:r>
-      <w:rPr/>
-      <w:t>2</w:t>
-    </w:r>
-    <w:r>
-      <w:rPr/>
+      <w:rPr>
+        <w:rFonts w:ascii="Arial" w:hAnsi="Arial"/>
+        <w:color w:val="555555"/>
+        <w:sz w:val="20"/>
+      </w:rPr>
+      <w:fldChar w:fldCharType="begin"/>
+      <w:instrText xml:space="preserve"> NUMPAGES </w:instrText>
+      <w:fldChar w:fldCharType="separate"/>
+      <w:t>44</w:t>
+      <w:fldChar w:fldCharType="end"/>
     </w:r>
   </w:p>
 </w:ftr>
@@ -25262,7 +25505,7 @@
         <w:color w:val="555555"/>
         <w:sz w:val="20"/>
       </w:rPr>
-      <w:t>Revision 3.0 — September 2026</w:t>
+      <w:t>Version 3.1 — Oct 2026</w:t>
     </w:r>
     <w:r>
       <w:rPr>
@@ -25277,23 +25520,39 @@
         <w:color w:val="555555"/>
         <w:sz w:val="20"/>
       </w:rPr>
-      <w:t>9-</w:t>
+      <w:t xml:space="preserve">Page </w:t>
     </w:r>
     <w:r>
-      <w:rPr/>
+      <w:rPr>
+        <w:rFonts w:ascii="Arial" w:hAnsi="Arial"/>
+        <w:color w:val="555555"/>
+        <w:sz w:val="20"/>
+      </w:rPr>
+      <w:fldChar w:fldCharType="begin"/>
+      <w:instrText xml:space="preserve"> PAGE </w:instrText>
+      <w:fldChar w:fldCharType="separate"/>
+      <w:t>1</w:t>
+      <w:fldChar w:fldCharType="end"/>
     </w:r>
     <w:r>
-      <w:rPr/>
+      <w:rPr>
+        <w:rFonts w:ascii="Arial" w:hAnsi="Arial"/>
+        <w:color w:val="555555"/>
+        <w:sz w:val="20"/>
+      </w:rPr>
+      <w:t xml:space="preserve"> of </w:t>
     </w:r>
     <w:r>
-      <w:rPr/>
-    </w:r>
-    <w:r>
-      <w:rPr/>
-      <w:t>1</w:t>
-    </w:r>
-    <w:r>
-      <w:rPr/>
+      <w:rPr>
+        <w:rFonts w:ascii="Arial" w:hAnsi="Arial"/>
+        <w:color w:val="555555"/>
+        <w:sz w:val="20"/>
+      </w:rPr>
+      <w:fldChar w:fldCharType="begin"/>
+      <w:instrText xml:space="preserve"> NUMPAGES </w:instrText>
+      <w:fldChar w:fldCharType="separate"/>
+      <w:t>44</w:t>
+      <w:fldChar w:fldCharType="end"/>
     </w:r>
   </w:p>
 </w:ftr>
@@ -25390,7 +25649,7 @@
         <w:color w:val="555555"/>
         <w:sz w:val="20"/>
       </w:rPr>
-      <w:t>Revision 3.0 — September 2026</w:t>
+      <w:t>Version 3.1 — Oct 2026</w:t>
     </w:r>
     <w:r>
       <w:rPr>
@@ -25405,23 +25664,39 @@
         <w:color w:val="555555"/>
         <w:sz w:val="20"/>
       </w:rPr>
-      <w:t>10-</w:t>
+      <w:t xml:space="preserve">Page </w:t>
     </w:r>
     <w:r>
-      <w:rPr/>
+      <w:rPr>
+        <w:rFonts w:ascii="Arial" w:hAnsi="Arial"/>
+        <w:color w:val="555555"/>
+        <w:sz w:val="20"/>
+      </w:rPr>
+      <w:fldChar w:fldCharType="begin"/>
+      <w:instrText xml:space="preserve"> PAGE </w:instrText>
+      <w:fldChar w:fldCharType="separate"/>
+      <w:t>1</w:t>
+      <w:fldChar w:fldCharType="end"/>
     </w:r>
     <w:r>
-      <w:rPr/>
+      <w:rPr>
+        <w:rFonts w:ascii="Arial" w:hAnsi="Arial"/>
+        <w:color w:val="555555"/>
+        <w:sz w:val="20"/>
+      </w:rPr>
+      <w:t xml:space="preserve"> of </w:t>
     </w:r>
     <w:r>
-      <w:rPr/>
-    </w:r>
-    <w:r>
-      <w:rPr/>
-      <w:t>1</w:t>
-    </w:r>
-    <w:r>
-      <w:rPr/>
+      <w:rPr>
+        <w:rFonts w:ascii="Arial" w:hAnsi="Arial"/>
+        <w:color w:val="555555"/>
+        <w:sz w:val="20"/>
+      </w:rPr>
+      <w:fldChar w:fldCharType="begin"/>
+      <w:instrText xml:space="preserve"> NUMPAGES </w:instrText>
+      <w:fldChar w:fldCharType="separate"/>
+      <w:t>44</w:t>
+      <w:fldChar w:fldCharType="end"/>
     </w:r>
   </w:p>
 </w:ftr>
@@ -25532,7 +25807,7 @@
         <w:color w:val="555555"/>
         <w:sz w:val="20"/>
       </w:rPr>
-      <w:t>Revision 3.0 — September 2026</w:t>
+      <w:t>Version 3.1 — Oct 2026</w:t>
     </w:r>
     <w:r>
       <w:rPr>
@@ -25547,23 +25822,39 @@
         <w:color w:val="555555"/>
         <w:sz w:val="20"/>
       </w:rPr>
-      <w:t>11-</w:t>
+      <w:t xml:space="preserve">Page </w:t>
     </w:r>
     <w:r>
-      <w:rPr/>
+      <w:rPr>
+        <w:rFonts w:ascii="Arial" w:hAnsi="Arial"/>
+        <w:color w:val="555555"/>
+        <w:sz w:val="20"/>
+      </w:rPr>
+      <w:fldChar w:fldCharType="begin"/>
+      <w:instrText xml:space="preserve"> PAGE </w:instrText>
+      <w:fldChar w:fldCharType="separate"/>
+      <w:t>1</w:t>
+      <w:fldChar w:fldCharType="end"/>
     </w:r>
     <w:r>
-      <w:rPr/>
+      <w:rPr>
+        <w:rFonts w:ascii="Arial" w:hAnsi="Arial"/>
+        <w:color w:val="555555"/>
+        <w:sz w:val="20"/>
+      </w:rPr>
+      <w:t xml:space="preserve"> of </w:t>
     </w:r>
     <w:r>
-      <w:rPr/>
-    </w:r>
-    <w:r>
-      <w:rPr/>
-      <w:t>1</w:t>
-    </w:r>
-    <w:r>
-      <w:rPr/>
+      <w:rPr>
+        <w:rFonts w:ascii="Arial" w:hAnsi="Arial"/>
+        <w:color w:val="555555"/>
+        <w:sz w:val="20"/>
+      </w:rPr>
+      <w:fldChar w:fldCharType="begin"/>
+      <w:instrText xml:space="preserve"> NUMPAGES </w:instrText>
+      <w:fldChar w:fldCharType="separate"/>
+      <w:t>44</w:t>
+      <w:fldChar w:fldCharType="end"/>
     </w:r>
   </w:p>
 </w:ftr>
@@ -25660,7 +25951,7 @@
         <w:color w:val="555555"/>
         <w:sz w:val="20"/>
       </w:rPr>
-      <w:t>Revision 3.0 — September 2026</w:t>
+      <w:t>Version 3.1 — Oct 2026</w:t>
     </w:r>
     <w:r>
       <w:rPr>
@@ -25675,23 +25966,39 @@
         <w:color w:val="555555"/>
         <w:sz w:val="20"/>
       </w:rPr>
-      <w:t>12-</w:t>
+      <w:t xml:space="preserve">Page </w:t>
     </w:r>
     <w:r>
-      <w:rPr/>
+      <w:rPr>
+        <w:rFonts w:ascii="Arial" w:hAnsi="Arial"/>
+        <w:color w:val="555555"/>
+        <w:sz w:val="20"/>
+      </w:rPr>
+      <w:fldChar w:fldCharType="begin"/>
+      <w:instrText xml:space="preserve"> PAGE </w:instrText>
+      <w:fldChar w:fldCharType="separate"/>
+      <w:t>1</w:t>
+      <w:fldChar w:fldCharType="end"/>
     </w:r>
     <w:r>
-      <w:rPr/>
+      <w:rPr>
+        <w:rFonts w:ascii="Arial" w:hAnsi="Arial"/>
+        <w:color w:val="555555"/>
+        <w:sz w:val="20"/>
+      </w:rPr>
+      <w:t xml:space="preserve"> of </w:t>
     </w:r>
     <w:r>
-      <w:rPr/>
-    </w:r>
-    <w:r>
-      <w:rPr/>
-      <w:t>1</w:t>
-    </w:r>
-    <w:r>
-      <w:rPr/>
+      <w:rPr>
+        <w:rFonts w:ascii="Arial" w:hAnsi="Arial"/>
+        <w:color w:val="555555"/>
+        <w:sz w:val="20"/>
+      </w:rPr>
+      <w:fldChar w:fldCharType="begin"/>
+      <w:instrText xml:space="preserve"> NUMPAGES </w:instrText>
+      <w:fldChar w:fldCharType="separate"/>
+      <w:t>44</w:t>
+      <w:fldChar w:fldCharType="end"/>
     </w:r>
   </w:p>
 </w:ftr>
@@ -25788,7 +26095,7 @@
         <w:color w:val="555555"/>
         <w:sz w:val="20"/>
       </w:rPr>
-      <w:t>Revision 3.0 — September 2026</w:t>
+      <w:t>Version 3.1 — Oct 2026</w:t>
     </w:r>
     <w:r>
       <w:rPr>
@@ -25803,23 +26110,39 @@
         <w:color w:val="555555"/>
         <w:sz w:val="20"/>
       </w:rPr>
-      <w:t>13-</w:t>
+      <w:t xml:space="preserve">Page </w:t>
     </w:r>
     <w:r>
-      <w:rPr/>
+      <w:rPr>
+        <w:rFonts w:ascii="Arial" w:hAnsi="Arial"/>
+        <w:color w:val="555555"/>
+        <w:sz w:val="20"/>
+      </w:rPr>
+      <w:fldChar w:fldCharType="begin"/>
+      <w:instrText xml:space="preserve"> PAGE </w:instrText>
+      <w:fldChar w:fldCharType="separate"/>
+      <w:t>1</w:t>
+      <w:fldChar w:fldCharType="end"/>
     </w:r>
     <w:r>
-      <w:rPr/>
+      <w:rPr>
+        <w:rFonts w:ascii="Arial" w:hAnsi="Arial"/>
+        <w:color w:val="555555"/>
+        <w:sz w:val="20"/>
+      </w:rPr>
+      <w:t xml:space="preserve"> of </w:t>
     </w:r>
     <w:r>
-      <w:rPr/>
-    </w:r>
-    <w:r>
-      <w:rPr/>
-      <w:t>1</w:t>
-    </w:r>
-    <w:r>
-      <w:rPr/>
+      <w:rPr>
+        <w:rFonts w:ascii="Arial" w:hAnsi="Arial"/>
+        <w:color w:val="555555"/>
+        <w:sz w:val="20"/>
+      </w:rPr>
+      <w:fldChar w:fldCharType="begin"/>
+      <w:instrText xml:space="preserve"> NUMPAGES </w:instrText>
+      <w:fldChar w:fldCharType="separate"/>
+      <w:t>44</w:t>
+      <w:fldChar w:fldCharType="end"/>
     </w:r>
   </w:p>
 </w:ftr>
@@ -25916,7 +26239,7 @@
         <w:color w:val="555555"/>
         <w:sz w:val="20"/>
       </w:rPr>
-      <w:t>Revision 3.0 — September 2026</w:t>
+      <w:t>Version 3.1 — Oct 2026</w:t>
     </w:r>
     <w:r>
       <w:rPr>
@@ -25926,20 +26249,44 @@
       <w:tab/>
     </w:r>
     <w:r>
-      <w:rPr/>
+      <w:rPr>
+        <w:rFonts w:ascii="Arial" w:hAnsi="Arial"/>
+        <w:color w:val="555555"/>
+        <w:sz w:val="20"/>
+      </w:rPr>
+      <w:t xml:space="preserve">Page </w:t>
     </w:r>
     <w:r>
-      <w:rPr/>
+      <w:rPr>
+        <w:rFonts w:ascii="Arial" w:hAnsi="Arial"/>
+        <w:color w:val="555555"/>
+        <w:sz w:val="20"/>
+      </w:rPr>
+      <w:fldChar w:fldCharType="begin"/>
+      <w:instrText xml:space="preserve"> PAGE </w:instrText>
+      <w:fldChar w:fldCharType="separate"/>
+      <w:t>1</w:t>
+      <w:fldChar w:fldCharType="end"/>
     </w:r>
     <w:r>
-      <w:rPr/>
+      <w:rPr>
+        <w:rFonts w:ascii="Arial" w:hAnsi="Arial"/>
+        <w:color w:val="555555"/>
+        <w:sz w:val="20"/>
+      </w:rPr>
+      <w:t xml:space="preserve"> of </w:t>
     </w:r>
     <w:r>
-      <w:rPr/>
-      <w:t>i</w:t>
-    </w:r>
-    <w:r>
-      <w:rPr/>
+      <w:rPr>
+        <w:rFonts w:ascii="Arial" w:hAnsi="Arial"/>
+        <w:color w:val="555555"/>
+        <w:sz w:val="20"/>
+      </w:rPr>
+      <w:fldChar w:fldCharType="begin"/>
+      <w:instrText xml:space="preserve"> NUMPAGES </w:instrText>
+      <w:fldChar w:fldCharType="separate"/>
+      <w:t>44</w:t>
+      <w:fldChar w:fldCharType="end"/>
     </w:r>
   </w:p>
 </w:ftr>
@@ -25963,7 +26310,7 @@
         <w:color w:val="555555"/>
         <w:sz w:val="20"/>
       </w:rPr>
-      <w:t>Revision 3.0 — September 2026</w:t>
+      <w:t>Version 3.1 — Oct 2026</w:t>
     </w:r>
     <w:r>
       <w:rPr>
@@ -25978,23 +26325,39 @@
         <w:color w:val="555555"/>
         <w:sz w:val="20"/>
       </w:rPr>
-      <w:t>14-</w:t>
+      <w:t xml:space="preserve">Page </w:t>
     </w:r>
     <w:r>
-      <w:rPr/>
+      <w:rPr>
+        <w:rFonts w:ascii="Arial" w:hAnsi="Arial"/>
+        <w:color w:val="555555"/>
+        <w:sz w:val="20"/>
+      </w:rPr>
+      <w:fldChar w:fldCharType="begin"/>
+      <w:instrText xml:space="preserve"> PAGE </w:instrText>
+      <w:fldChar w:fldCharType="separate"/>
+      <w:t>1</w:t>
+      <w:fldChar w:fldCharType="end"/>
     </w:r>
     <w:r>
-      <w:rPr/>
+      <w:rPr>
+        <w:rFonts w:ascii="Arial" w:hAnsi="Arial"/>
+        <w:color w:val="555555"/>
+        <w:sz w:val="20"/>
+      </w:rPr>
+      <w:t xml:space="preserve"> of </w:t>
     </w:r>
     <w:r>
-      <w:rPr/>
-    </w:r>
-    <w:r>
-      <w:rPr/>
-      <w:t>2</w:t>
-    </w:r>
-    <w:r>
-      <w:rPr/>
+      <w:rPr>
+        <w:rFonts w:ascii="Arial" w:hAnsi="Arial"/>
+        <w:color w:val="555555"/>
+        <w:sz w:val="20"/>
+      </w:rPr>
+      <w:fldChar w:fldCharType="begin"/>
+      <w:instrText xml:space="preserve"> NUMPAGES </w:instrText>
+      <w:fldChar w:fldCharType="separate"/>
+      <w:t>44</w:t>
+      <w:fldChar w:fldCharType="end"/>
     </w:r>
   </w:p>
 </w:ftr>
@@ -26091,7 +26454,7 @@
         <w:color w:val="555555"/>
         <w:sz w:val="20"/>
       </w:rPr>
-      <w:t>Revision 3.0 — September 2026</w:t>
+      <w:t>Version 3.1 — Oct 2026</w:t>
     </w:r>
     <w:r>
       <w:rPr>
@@ -26106,23 +26469,39 @@
         <w:color w:val="555555"/>
         <w:sz w:val="20"/>
       </w:rPr>
-      <w:t>16-</w:t>
+      <w:t xml:space="preserve">Page </w:t>
     </w:r>
     <w:r>
-      <w:rPr/>
+      <w:rPr>
+        <w:rFonts w:ascii="Arial" w:hAnsi="Arial"/>
+        <w:color w:val="555555"/>
+        <w:sz w:val="20"/>
+      </w:rPr>
+      <w:fldChar w:fldCharType="begin"/>
+      <w:instrText xml:space="preserve"> PAGE </w:instrText>
+      <w:fldChar w:fldCharType="separate"/>
+      <w:t>1</w:t>
+      <w:fldChar w:fldCharType="end"/>
     </w:r>
     <w:r>
-      <w:rPr/>
+      <w:rPr>
+        <w:rFonts w:ascii="Arial" w:hAnsi="Arial"/>
+        <w:color w:val="555555"/>
+        <w:sz w:val="20"/>
+      </w:rPr>
+      <w:t xml:space="preserve"> of </w:t>
     </w:r>
     <w:r>
-      <w:rPr/>
-    </w:r>
-    <w:r>
-      <w:rPr/>
-      <w:t>1</w:t>
-    </w:r>
-    <w:r>
-      <w:rPr/>
+      <w:rPr>
+        <w:rFonts w:ascii="Arial" w:hAnsi="Arial"/>
+        <w:color w:val="555555"/>
+        <w:sz w:val="20"/>
+      </w:rPr>
+      <w:fldChar w:fldCharType="begin"/>
+      <w:instrText xml:space="preserve"> NUMPAGES </w:instrText>
+      <w:fldChar w:fldCharType="separate"/>
+      <w:t>44</w:t>
+      <w:fldChar w:fldCharType="end"/>
     </w:r>
   </w:p>
 </w:ftr>
@@ -26219,7 +26598,7 @@
         <w:color w:val="555555"/>
         <w:sz w:val="20"/>
       </w:rPr>
-      <w:t>Revision 3.0 — September 2026</w:t>
+      <w:t>Version 3.1 — Oct 2026</w:t>
     </w:r>
     <w:r>
       <w:rPr>
@@ -26234,23 +26613,39 @@
         <w:color w:val="555555"/>
         <w:sz w:val="20"/>
       </w:rPr>
-      <w:t>17-</w:t>
+      <w:t xml:space="preserve">Page </w:t>
     </w:r>
     <w:r>
-      <w:rPr/>
+      <w:rPr>
+        <w:rFonts w:ascii="Arial" w:hAnsi="Arial"/>
+        <w:color w:val="555555"/>
+        <w:sz w:val="20"/>
+      </w:rPr>
+      <w:fldChar w:fldCharType="begin"/>
+      <w:instrText xml:space="preserve"> PAGE </w:instrText>
+      <w:fldChar w:fldCharType="separate"/>
+      <w:t>1</w:t>
+      <w:fldChar w:fldCharType="end"/>
     </w:r>
     <w:r>
-      <w:rPr/>
+      <w:rPr>
+        <w:rFonts w:ascii="Arial" w:hAnsi="Arial"/>
+        <w:color w:val="555555"/>
+        <w:sz w:val="20"/>
+      </w:rPr>
+      <w:t xml:space="preserve"> of </w:t>
     </w:r>
     <w:r>
-      <w:rPr/>
-    </w:r>
-    <w:r>
-      <w:rPr/>
-      <w:t>1</w:t>
-    </w:r>
-    <w:r>
-      <w:rPr/>
+      <w:rPr>
+        <w:rFonts w:ascii="Arial" w:hAnsi="Arial"/>
+        <w:color w:val="555555"/>
+        <w:sz w:val="20"/>
+      </w:rPr>
+      <w:fldChar w:fldCharType="begin"/>
+      <w:instrText xml:space="preserve"> NUMPAGES </w:instrText>
+      <w:fldChar w:fldCharType="separate"/>
+      <w:t>44</w:t>
+      <w:fldChar w:fldCharType="end"/>
     </w:r>
   </w:p>
 </w:ftr>
@@ -26347,7 +26742,7 @@
         <w:color w:val="555555"/>
         <w:sz w:val="20"/>
       </w:rPr>
-      <w:t>Revision 3.0 — September 2026</w:t>
+      <w:t>Version 3.1 — Oct 2026</w:t>
     </w:r>
     <w:r>
       <w:rPr>
@@ -26362,23 +26757,39 @@
         <w:color w:val="555555"/>
         <w:sz w:val="20"/>
       </w:rPr>
-      <w:t>19-</w:t>
+      <w:t xml:space="preserve">Page </w:t>
     </w:r>
     <w:r>
-      <w:rPr/>
+      <w:rPr>
+        <w:rFonts w:ascii="Arial" w:hAnsi="Arial"/>
+        <w:color w:val="555555"/>
+        <w:sz w:val="20"/>
+      </w:rPr>
+      <w:fldChar w:fldCharType="begin"/>
+      <w:instrText xml:space="preserve"> PAGE </w:instrText>
+      <w:fldChar w:fldCharType="separate"/>
+      <w:t>1</w:t>
+      <w:fldChar w:fldCharType="end"/>
     </w:r>
     <w:r>
-      <w:rPr/>
+      <w:rPr>
+        <w:rFonts w:ascii="Arial" w:hAnsi="Arial"/>
+        <w:color w:val="555555"/>
+        <w:sz w:val="20"/>
+      </w:rPr>
+      <w:t xml:space="preserve"> of </w:t>
     </w:r>
     <w:r>
-      <w:rPr/>
-    </w:r>
-    <w:r>
-      <w:rPr/>
-      <w:t>2</w:t>
-    </w:r>
-    <w:r>
-      <w:rPr/>
+      <w:rPr>
+        <w:rFonts w:ascii="Arial" w:hAnsi="Arial"/>
+        <w:color w:val="555555"/>
+        <w:sz w:val="20"/>
+      </w:rPr>
+      <w:fldChar w:fldCharType="begin"/>
+      <w:instrText xml:space="preserve"> NUMPAGES </w:instrText>
+      <w:fldChar w:fldCharType="separate"/>
+      <w:t>44</w:t>
+      <w:fldChar w:fldCharType="end"/>
     </w:r>
   </w:p>
 </w:ftr>
@@ -26526,7 +26937,54 @@
         <w:color w:val="555555"/>
         <w:sz w:val="20"/>
       </w:rPr>
-      <w:t>Revision 3.0 — September 2026</w:t>
+      <w:t>Version 3.1 — Oct 2026</w:t>
+    </w:r>
+    <w:r>
+      <w:rPr>
+        <w:rFonts w:ascii="Arial" w:hAnsi="Arial"/>
+      </w:rPr>
+      <w:tab/>
+      <w:tab/>
+    </w:r>
+    <w:r>
+      <w:rPr>
+        <w:rFonts w:ascii="Arial" w:hAnsi="Arial"/>
+        <w:color w:val="555555"/>
+        <w:sz w:val="20"/>
+      </w:rPr>
+      <w:t xml:space="preserve">Page </w:t>
+    </w:r>
+    <w:r>
+      <w:rPr>
+        <w:rFonts w:ascii="Arial" w:hAnsi="Arial"/>
+        <w:color w:val="555555"/>
+        <w:sz w:val="20"/>
+      </w:rPr>
+      <w:fldChar w:fldCharType="begin"/>
+      <w:instrText xml:space="preserve"> PAGE </w:instrText>
+      <w:fldChar w:fldCharType="separate"/>
+      <w:t>1</w:t>
+      <w:fldChar w:fldCharType="end"/>
+    </w:r>
+    <w:r>
+      <w:rPr>
+        <w:rFonts w:ascii="Arial" w:hAnsi="Arial"/>
+        <w:color w:val="555555"/>
+        <w:sz w:val="20"/>
+      </w:rPr>
+      <w:t xml:space="preserve"> of </w:t>
+    </w:r>
+    <w:r>
+      <w:rPr>
+        <w:rFonts w:ascii="Arial" w:hAnsi="Arial"/>
+        <w:color w:val="555555"/>
+        <w:sz w:val="20"/>
+      </w:rPr>
+      <w:fldChar w:fldCharType="begin"/>
+      <w:instrText xml:space="preserve"> NUMPAGES </w:instrText>
+      <w:fldChar w:fldCharType="separate"/>
+      <w:t>44</w:t>
+      <w:fldChar w:fldCharType="end"/>
     </w:r>
   </w:p>
 </w:ftr>
@@ -26574,7 +27032,7 @@
         <w:color w:val="555555"/>
         <w:sz w:val="20"/>
       </w:rPr>
-      <w:t>Revision 3.0 — September 2026</w:t>
+      <w:t>Version 3.1 — Oct 2026</w:t>
     </w:r>
     <w:r>
       <w:rPr>
@@ -26589,23 +27047,39 @@
         <w:color w:val="555555"/>
         <w:sz w:val="20"/>
       </w:rPr>
-      <w:t>8-</w:t>
+      <w:t xml:space="preserve">Page </w:t>
     </w:r>
     <w:r>
-      <w:rPr/>
+      <w:rPr>
+        <w:rFonts w:ascii="Arial" w:hAnsi="Arial"/>
+        <w:color w:val="555555"/>
+        <w:sz w:val="20"/>
+      </w:rPr>
+      <w:fldChar w:fldCharType="begin"/>
+      <w:instrText xml:space="preserve"> PAGE </w:instrText>
+      <w:fldChar w:fldCharType="separate"/>
+      <w:t>1</w:t>
+      <w:fldChar w:fldCharType="end"/>
     </w:r>
     <w:r>
-      <w:rPr/>
+      <w:rPr>
+        <w:rFonts w:ascii="Arial" w:hAnsi="Arial"/>
+        <w:color w:val="555555"/>
+        <w:sz w:val="20"/>
+      </w:rPr>
+      <w:t xml:space="preserve"> of </w:t>
     </w:r>
     <w:r>
-      <w:rPr/>
-    </w:r>
-    <w:r>
-      <w:rPr/>
-      <w:t>1</w:t>
-    </w:r>
-    <w:r>
-      <w:rPr/>
+      <w:rPr>
+        <w:rFonts w:ascii="Arial" w:hAnsi="Arial"/>
+        <w:color w:val="555555"/>
+        <w:sz w:val="20"/>
+      </w:rPr>
+      <w:fldChar w:fldCharType="begin"/>
+      <w:instrText xml:space="preserve"> NUMPAGES </w:instrText>
+      <w:fldChar w:fldCharType="separate"/>
+      <w:t>44</w:t>
+      <w:fldChar w:fldCharType="end"/>
     </w:r>
   </w:p>
 </w:ftr>
@@ -26629,7 +27103,7 @@
         <w:color w:val="555555"/>
         <w:sz w:val="20"/>
       </w:rPr>
-      <w:t>Revision 3.0 — September 2026</w:t>
+      <w:t>Version 3.1 — Oct 2026</w:t>
     </w:r>
     <w:r>
       <w:rPr>
@@ -26644,23 +27118,39 @@
         <w:color w:val="555555"/>
         <w:sz w:val="20"/>
       </w:rPr>
-      <w:t>15-</w:t>
+      <w:t xml:space="preserve">Page </w:t>
     </w:r>
     <w:r>
-      <w:rPr/>
+      <w:rPr>
+        <w:rFonts w:ascii="Arial" w:hAnsi="Arial"/>
+        <w:color w:val="555555"/>
+        <w:sz w:val="20"/>
+      </w:rPr>
+      <w:fldChar w:fldCharType="begin"/>
+      <w:instrText xml:space="preserve"> PAGE </w:instrText>
+      <w:fldChar w:fldCharType="separate"/>
+      <w:t>1</w:t>
+      <w:fldChar w:fldCharType="end"/>
     </w:r>
     <w:r>
-      <w:rPr/>
+      <w:rPr>
+        <w:rFonts w:ascii="Arial" w:hAnsi="Arial"/>
+        <w:color w:val="555555"/>
+        <w:sz w:val="20"/>
+      </w:rPr>
+      <w:t xml:space="preserve"> of </w:t>
     </w:r>
     <w:r>
-      <w:rPr/>
-    </w:r>
-    <w:r>
-      <w:rPr/>
-      <w:t>1</w:t>
-    </w:r>
-    <w:r>
-      <w:rPr/>
+      <w:rPr>
+        <w:rFonts w:ascii="Arial" w:hAnsi="Arial"/>
+        <w:color w:val="555555"/>
+        <w:sz w:val="20"/>
+      </w:rPr>
+      <w:fldChar w:fldCharType="begin"/>
+      <w:instrText xml:space="preserve"> NUMPAGES </w:instrText>
+      <w:fldChar w:fldCharType="separate"/>
+      <w:t>44</w:t>
+      <w:fldChar w:fldCharType="end"/>
     </w:r>
   </w:p>
 </w:ftr>
@@ -26684,7 +27174,7 @@
         <w:color w:val="555555"/>
         <w:sz w:val="20"/>
       </w:rPr>
-      <w:t>Revision 3.0 — September 2026</w:t>
+      <w:t>Version 3.1 — Oct 2026</w:t>
     </w:r>
     <w:r>
       <w:rPr>
@@ -26699,23 +27189,39 @@
         <w:color w:val="555555"/>
         <w:sz w:val="20"/>
       </w:rPr>
-      <w:t>18-</w:t>
+      <w:t xml:space="preserve">Page </w:t>
     </w:r>
     <w:r>
-      <w:rPr/>
+      <w:rPr>
+        <w:rFonts w:ascii="Arial" w:hAnsi="Arial"/>
+        <w:color w:val="555555"/>
+        <w:sz w:val="20"/>
+      </w:rPr>
+      <w:fldChar w:fldCharType="begin"/>
+      <w:instrText xml:space="preserve"> PAGE </w:instrText>
+      <w:fldChar w:fldCharType="separate"/>
+      <w:t>1</w:t>
+      <w:fldChar w:fldCharType="end"/>
     </w:r>
     <w:r>
-      <w:rPr/>
+      <w:rPr>
+        <w:rFonts w:ascii="Arial" w:hAnsi="Arial"/>
+        <w:color w:val="555555"/>
+        <w:sz w:val="20"/>
+      </w:rPr>
+      <w:t xml:space="preserve"> of </w:t>
     </w:r>
     <w:r>
-      <w:rPr/>
-    </w:r>
-    <w:r>
-      <w:rPr/>
-      <w:t>2</w:t>
-    </w:r>
-    <w:r>
-      <w:rPr/>
+      <w:rPr>
+        <w:rFonts w:ascii="Arial" w:hAnsi="Arial"/>
+        <w:color w:val="555555"/>
+        <w:sz w:val="20"/>
+      </w:rPr>
+      <w:fldChar w:fldCharType="begin"/>
+      <w:instrText xml:space="preserve"> NUMPAGES </w:instrText>
+      <w:fldChar w:fldCharType="separate"/>
+      <w:t>44</w:t>
+      <w:fldChar w:fldCharType="end"/>
     </w:r>
   </w:p>
 </w:ftr>
@@ -26753,7 +27259,7 @@
         <w:color w:val="555555"/>
         <w:sz w:val="20"/>
       </w:rPr>
-      <w:t>Revision 3.0 — September 2026</w:t>
+      <w:t>Version 3.1 — Oct 2026</w:t>
     </w:r>
     <w:r>
       <w:rPr>
@@ -26768,23 +27274,39 @@
         <w:color w:val="555555"/>
         <w:sz w:val="20"/>
       </w:rPr>
-      <w:t>QS-</w:t>
+      <w:t xml:space="preserve">Page </w:t>
     </w:r>
     <w:r>
-      <w:rPr/>
+      <w:rPr>
+        <w:rFonts w:ascii="Arial" w:hAnsi="Arial"/>
+        <w:color w:val="555555"/>
+        <w:sz w:val="20"/>
+      </w:rPr>
+      <w:fldChar w:fldCharType="begin"/>
+      <w:instrText xml:space="preserve"> PAGE </w:instrText>
+      <w:fldChar w:fldCharType="separate"/>
+      <w:t>1</w:t>
+      <w:fldChar w:fldCharType="end"/>
     </w:r>
     <w:r>
-      <w:rPr/>
+      <w:rPr>
+        <w:rFonts w:ascii="Arial" w:hAnsi="Arial"/>
+        <w:color w:val="555555"/>
+        <w:sz w:val="20"/>
+      </w:rPr>
+      <w:t xml:space="preserve"> of </w:t>
     </w:r>
     <w:r>
-      <w:rPr/>
-    </w:r>
-    <w:r>
-      <w:rPr/>
-      <w:t>2</w:t>
-    </w:r>
-    <w:r>
-      <w:rPr/>
+      <w:rPr>
+        <w:rFonts w:ascii="Arial" w:hAnsi="Arial"/>
+        <w:color w:val="555555"/>
+        <w:sz w:val="20"/>
+      </w:rPr>
+      <w:fldChar w:fldCharType="begin"/>
+      <w:instrText xml:space="preserve"> NUMPAGES </w:instrText>
+      <w:fldChar w:fldCharType="separate"/>
+      <w:t>44</w:t>
+      <w:fldChar w:fldCharType="end"/>
     </w:r>
   </w:p>
 </w:ftr>

</xml_diff>